<commit_message>
Refactor Instructor and Supervisor UI components for improved styling and functionality
- Updated the InstructorDashboard to enhance attendance, hours progress, and performance display with improved styling and color schemes.
- Refactored the InstructorTemplateManagement to sort templates by name before grouping them by category.
- Added a new document type "TIME_FRAMES" to the StudentDocumentsTab and adjusted the document service to include it.
- Removed the "Documents" tab from the SupervisorDashboard for a cleaner UI.
- Enhanced the SupervisorEvaluation component with new state management for success modal and exporting functionality, including error handling for evaluation exports.
</commit_message>
<xml_diff>
--- a/server/src/templates/11 INTERNSHIP EVALUATION FORM_2024.docx
+++ b/server/src/templates/11 INTERNSHIP EVALUATION FORM_2024.docx
@@ -276,16 +276,7 @@
                 <w:sz w:val="16"/>
                 <w:szCs w:val="16"/>
               </w:rPr>
-              <w:t>N</w:t>
-            </w:r>
-            <w:r>
-              <w:rPr>
-                <w:rFonts w:ascii="Arial" w:eastAsia="Arial" w:hAnsi="Arial" w:cs="Arial"/>
-                <w:b/>
-                <w:sz w:val="16"/>
-                <w:szCs w:val="16"/>
-              </w:rPr>
-              <w:t>AME OF STUDENT-INTERN</w:t>
+              <w:t>NAME OF STUDENT-INTERN</w:t>
             </w:r>
           </w:p>
         </w:tc>
@@ -317,7 +308,7 @@
                 <w:sz w:val="16"/>
                 <w:szCs w:val="16"/>
               </w:rPr>
-              <w:t>JOASH IRVIN M. SANTOS</w:t>
+              <w:t>${student_name}</w:t>
             </w:r>
           </w:p>
         </w:tc>
@@ -387,7 +378,7 @@
                 <w:sz w:val="16"/>
                 <w:szCs w:val="16"/>
               </w:rPr>
-              <w:t>DEPARTMENT OF THE INTERIOR AND LOCAL GOVERNMENT - CORDILLERA</w:t>
+              <w:t>${company_name}</w:t>
             </w:r>
           </w:p>
         </w:tc>
@@ -455,7 +446,7 @@
                 <w:sz w:val="16"/>
                 <w:szCs w:val="16"/>
               </w:rPr>
-              <w:t>CORNER NORTH DRIVE, BAGUIO CITY, 2600, BENGUET</w:t>
+              <w:t>${company_address}</w:t>
             </w:r>
           </w:p>
         </w:tc>
@@ -517,6 +508,15 @@
                 <w:szCs w:val="16"/>
               </w:rPr>
             </w:pPr>
+            <w:r>
+              <w:rPr>
+                <w:rFonts w:ascii="Arial" w:eastAsia="Arial" w:hAnsi="Arial" w:cs="Arial"/>
+                <w:b/>
+                <w:sz w:val="16"/>
+                <w:szCs w:val="16"/>
+              </w:rPr>
+              <w:t>${date_started}</w:t>
+            </w:r>
           </w:p>
         </w:tc>
         <w:tc>
@@ -569,6 +569,14 @@
                 <w:szCs w:val="16"/>
               </w:rPr>
             </w:pPr>
+            <w:r>
+              <w:rPr>
+                <w:rFonts w:ascii="Arial" w:eastAsia="Arial" w:hAnsi="Arial" w:cs="Arial"/>
+                <w:sz w:val="16"/>
+                <w:szCs w:val="16"/>
+              </w:rPr>
+              <w:t>${date_ended}</w:t>
+            </w:r>
           </w:p>
         </w:tc>
       </w:tr>
@@ -606,15 +614,7 @@
                 <w:sz w:val="16"/>
                 <w:szCs w:val="16"/>
               </w:rPr>
-              <w:t xml:space="preserve">INSTRUCTIONS: Evaluate Student-Intern fairly and honestly based on his/her performance considering their time in the trade. Rate all 8 competencies below. There are criteria under each competency. Please rate by encircling the appropriate number that best </w:t>
-            </w:r>
-            <w:r>
-              <w:rPr>
-                <w:rFonts w:ascii="Arial" w:eastAsia="Arial" w:hAnsi="Arial" w:cs="Arial"/>
-                <w:sz w:val="16"/>
-                <w:szCs w:val="16"/>
-              </w:rPr>
-              <w:t>describes the extent of the performance of the Student- Intern.</w:t>
+              <w:t>INSTRUCTIONS: Evaluate Student-Intern fairly and honestly based on his/her performance considering their time in the trade. Rate all 8 competencies below. There are criteria under each competency. Please rate by encircling the appropriate number that best describes the extent of the performance of the Student- Intern.</w:t>
             </w:r>
           </w:p>
         </w:tc>
@@ -829,17 +829,20 @@
               <w:jc w:val="center"/>
               <w:rPr>
                 <w:rFonts w:ascii="Arial" w:eastAsia="Arial" w:hAnsi="Arial" w:cs="Arial"/>
-                <w:sz w:val="16"/>
-                <w:szCs w:val="16"/>
-              </w:rPr>
-            </w:pPr>
-            <w:r>
-              <w:rPr>
-                <w:rFonts w:ascii="Arial" w:eastAsia="Arial" w:hAnsi="Arial" w:cs="Arial"/>
-                <w:sz w:val="16"/>
-                <w:szCs w:val="16"/>
-              </w:rPr>
+                <w:highlight w:val="lightGray"/>
+              </w:rPr>
+            </w:pPr>
+            <w:r>
+              <w:t xml:space="preserve">5 </w:t>
+            </w:r>
+            <w:r>
+              <w:t>${ability_to_learn_</w:t>
+            </w:r>
+            <w:r>
               <w:t>5</w:t>
+            </w:r>
+            <w:r>
+              <w:t>}</w:t>
             </w:r>
           </w:p>
         </w:tc>
@@ -863,6 +866,9 @@
                 <w:szCs w:val="16"/>
               </w:rPr>
             </w:pPr>
+            <w:r>
+              <w:t>${ability_to_learn_remarks}</w:t>
+            </w:r>
           </w:p>
         </w:tc>
       </w:tr>
@@ -939,17 +945,19 @@
               <w:jc w:val="center"/>
               <w:rPr>
                 <w:rFonts w:ascii="Arial" w:eastAsia="Arial" w:hAnsi="Arial" w:cs="Arial"/>
-                <w:sz w:val="16"/>
-                <w:szCs w:val="16"/>
-              </w:rPr>
-            </w:pPr>
-            <w:r>
-              <w:rPr>
-                <w:rFonts w:ascii="Arial" w:eastAsia="Arial" w:hAnsi="Arial" w:cs="Arial"/>
-                <w:sz w:val="16"/>
-                <w:szCs w:val="16"/>
-              </w:rPr>
+              </w:rPr>
+            </w:pPr>
+            <w:r>
+              <w:t xml:space="preserve">4 </w:t>
+            </w:r>
+            <w:r>
+              <w:t>${ability_to_learn_</w:t>
+            </w:r>
+            <w:r>
               <w:t>4</w:t>
+            </w:r>
+            <w:r>
+              <w:t>}</w:t>
             </w:r>
           </w:p>
         </w:tc>
@@ -1056,17 +1064,19 @@
               <w:jc w:val="center"/>
               <w:rPr>
                 <w:rFonts w:ascii="Arial" w:eastAsia="Arial" w:hAnsi="Arial" w:cs="Arial"/>
-                <w:sz w:val="16"/>
-                <w:szCs w:val="16"/>
-              </w:rPr>
-            </w:pPr>
-            <w:r>
-              <w:rPr>
-                <w:rFonts w:ascii="Arial" w:eastAsia="Arial" w:hAnsi="Arial" w:cs="Arial"/>
-                <w:sz w:val="16"/>
-                <w:szCs w:val="16"/>
-              </w:rPr>
+              </w:rPr>
+            </w:pPr>
+            <w:r>
+              <w:t xml:space="preserve">3 </w:t>
+            </w:r>
+            <w:r>
+              <w:t>${ability_to_learn_</w:t>
+            </w:r>
+            <w:r>
               <w:t>3</w:t>
+            </w:r>
+            <w:r>
+              <w:t>}</w:t>
             </w:r>
           </w:p>
         </w:tc>
@@ -1173,17 +1183,19 @@
               <w:jc w:val="center"/>
               <w:rPr>
                 <w:rFonts w:ascii="Arial" w:eastAsia="Arial" w:hAnsi="Arial" w:cs="Arial"/>
-                <w:sz w:val="16"/>
-                <w:szCs w:val="16"/>
-              </w:rPr>
-            </w:pPr>
-            <w:r>
-              <w:rPr>
-                <w:rFonts w:ascii="Arial" w:eastAsia="Arial" w:hAnsi="Arial" w:cs="Arial"/>
-                <w:sz w:val="16"/>
-                <w:szCs w:val="16"/>
-              </w:rPr>
+              </w:rPr>
+            </w:pPr>
+            <w:r>
+              <w:t xml:space="preserve">2 </w:t>
+            </w:r>
+            <w:r>
+              <w:t>${ability_to_learn_</w:t>
+            </w:r>
+            <w:r>
               <w:t>2</w:t>
+            </w:r>
+            <w:r>
+              <w:t>}</w:t>
             </w:r>
           </w:p>
         </w:tc>
@@ -1290,17 +1302,19 @@
               <w:jc w:val="center"/>
               <w:rPr>
                 <w:rFonts w:ascii="Arial" w:eastAsia="Arial" w:hAnsi="Arial" w:cs="Arial"/>
-                <w:sz w:val="16"/>
-                <w:szCs w:val="16"/>
-              </w:rPr>
-            </w:pPr>
-            <w:r>
-              <w:rPr>
-                <w:rFonts w:ascii="Arial" w:eastAsia="Arial" w:hAnsi="Arial" w:cs="Arial"/>
-                <w:sz w:val="16"/>
-                <w:szCs w:val="16"/>
-              </w:rPr>
+              </w:rPr>
+            </w:pPr>
+            <w:r>
+              <w:t xml:space="preserve">1 </w:t>
+            </w:r>
+            <w:r>
+              <w:t>${ability_to_learn_</w:t>
+            </w:r>
+            <w:r>
               <w:t>1</w:t>
+            </w:r>
+            <w:r>
+              <w:t>}</w:t>
             </w:r>
           </w:p>
         </w:tc>
@@ -1409,18 +1423,34 @@
               <w:spacing w:after="0" w:line="240" w:lineRule="auto"/>
               <w:jc w:val="center"/>
               <w:rPr>
-                <w:rFonts w:ascii="Arial" w:eastAsia="Arial" w:hAnsi="Arial" w:cs="Arial"/>
-                <w:sz w:val="16"/>
-                <w:szCs w:val="16"/>
-              </w:rPr>
-            </w:pPr>
-            <w:r>
-              <w:rPr>
-                <w:rFonts w:ascii="Arial" w:eastAsia="Arial" w:hAnsi="Arial" w:cs="Arial"/>
-                <w:sz w:val="16"/>
-                <w:szCs w:val="16"/>
-              </w:rPr>
-              <w:t>5</w:t>
+                <w:rFonts w:asciiTheme="minorHAnsi" w:eastAsia="Arial" w:hAnsiTheme="minorHAnsi" w:cstheme="minorHAnsi"/>
+                <w:sz w:val="16"/>
+                <w:szCs w:val="16"/>
+              </w:rPr>
+            </w:pPr>
+            <w:r>
+              <w:rPr>
+                <w:rFonts w:asciiTheme="minorHAnsi" w:hAnsiTheme="minorHAnsi" w:cstheme="minorHAnsi"/>
+              </w:rPr>
+              <w:t xml:space="preserve">5 </w:t>
+            </w:r>
+            <w:r>
+              <w:rPr>
+                <w:rFonts w:asciiTheme="minorHAnsi" w:hAnsiTheme="minorHAnsi" w:cstheme="minorHAnsi"/>
+              </w:rPr>
+              <w:t>${</w:t>
+            </w:r>
+            <w:r>
+              <w:rPr>
+                <w:rFonts w:asciiTheme="minorHAnsi" w:eastAsia="Arial" w:hAnsiTheme="minorHAnsi" w:cstheme="minorHAnsi"/>
+              </w:rPr>
+              <w:t>work_attitude</w:t>
+            </w:r>
+            <w:r>
+              <w:rPr>
+                <w:rFonts w:asciiTheme="minorHAnsi" w:hAnsiTheme="minorHAnsi" w:cstheme="minorHAnsi"/>
+              </w:rPr>
+              <w:t>_5}</w:t>
             </w:r>
           </w:p>
         </w:tc>
@@ -1439,11 +1469,17 @@
               <w:spacing w:after="0" w:line="240" w:lineRule="auto"/>
               <w:jc w:val="center"/>
               <w:rPr>
-                <w:rFonts w:ascii="Arial" w:eastAsia="Arial" w:hAnsi="Arial" w:cs="Arial"/>
-                <w:sz w:val="16"/>
-                <w:szCs w:val="16"/>
-              </w:rPr>
-            </w:pPr>
+                <w:rFonts w:asciiTheme="minorHAnsi" w:eastAsia="Arial" w:hAnsiTheme="minorHAnsi" w:cstheme="minorHAnsi"/>
+                <w:sz w:val="16"/>
+                <w:szCs w:val="16"/>
+              </w:rPr>
+            </w:pPr>
+            <w:r>
+              <w:rPr>
+                <w:rFonts w:asciiTheme="minorHAnsi" w:eastAsia="Arial" w:hAnsiTheme="minorHAnsi" w:cstheme="minorHAnsi"/>
+              </w:rPr>
+              <w:t>${work_attitude_remarks}</w:t>
+            </w:r>
           </w:p>
         </w:tc>
       </w:tr>
@@ -1519,18 +1555,34 @@
               <w:spacing w:after="0" w:line="240" w:lineRule="auto"/>
               <w:jc w:val="center"/>
               <w:rPr>
-                <w:rFonts w:ascii="Arial" w:eastAsia="Arial" w:hAnsi="Arial" w:cs="Arial"/>
-                <w:sz w:val="16"/>
-                <w:szCs w:val="16"/>
-              </w:rPr>
-            </w:pPr>
-            <w:r>
-              <w:rPr>
-                <w:rFonts w:ascii="Arial" w:eastAsia="Arial" w:hAnsi="Arial" w:cs="Arial"/>
-                <w:sz w:val="16"/>
-                <w:szCs w:val="16"/>
-              </w:rPr>
-              <w:t>4</w:t>
+                <w:rFonts w:asciiTheme="minorHAnsi" w:eastAsia="Arial" w:hAnsiTheme="minorHAnsi" w:cstheme="minorHAnsi"/>
+                <w:sz w:val="16"/>
+                <w:szCs w:val="16"/>
+              </w:rPr>
+            </w:pPr>
+            <w:r>
+              <w:rPr>
+                <w:rFonts w:asciiTheme="minorHAnsi" w:hAnsiTheme="minorHAnsi" w:cstheme="minorHAnsi"/>
+              </w:rPr>
+              <w:t xml:space="preserve">4 </w:t>
+            </w:r>
+            <w:r>
+              <w:rPr>
+                <w:rFonts w:asciiTheme="minorHAnsi" w:hAnsiTheme="minorHAnsi" w:cstheme="minorHAnsi"/>
+              </w:rPr>
+              <w:t>${</w:t>
+            </w:r>
+            <w:r>
+              <w:rPr>
+                <w:rFonts w:asciiTheme="minorHAnsi" w:eastAsia="Arial" w:hAnsiTheme="minorHAnsi" w:cstheme="minorHAnsi"/>
+              </w:rPr>
+              <w:t>work_attitude</w:t>
+            </w:r>
+            <w:r>
+              <w:rPr>
+                <w:rFonts w:asciiTheme="minorHAnsi" w:hAnsiTheme="minorHAnsi" w:cstheme="minorHAnsi"/>
+              </w:rPr>
+              <w:t>_4}</w:t>
             </w:r>
           </w:p>
         </w:tc>
@@ -1556,7 +1608,7 @@
               </w:pBdr>
               <w:spacing w:after="0" w:line="276" w:lineRule="auto"/>
               <w:rPr>
-                <w:rFonts w:ascii="Arial" w:eastAsia="Arial" w:hAnsi="Arial" w:cs="Arial"/>
+                <w:rFonts w:asciiTheme="minorHAnsi" w:eastAsia="Arial" w:hAnsiTheme="minorHAnsi" w:cstheme="minorHAnsi"/>
                 <w:sz w:val="16"/>
                 <w:szCs w:val="16"/>
               </w:rPr>
@@ -1636,18 +1688,34 @@
               <w:spacing w:after="0" w:line="240" w:lineRule="auto"/>
               <w:jc w:val="center"/>
               <w:rPr>
-                <w:rFonts w:ascii="Arial" w:eastAsia="Arial" w:hAnsi="Arial" w:cs="Arial"/>
-                <w:sz w:val="16"/>
-                <w:szCs w:val="16"/>
-              </w:rPr>
-            </w:pPr>
-            <w:r>
-              <w:rPr>
-                <w:rFonts w:ascii="Arial" w:eastAsia="Arial" w:hAnsi="Arial" w:cs="Arial"/>
-                <w:sz w:val="16"/>
-                <w:szCs w:val="16"/>
-              </w:rPr>
-              <w:t>3</w:t>
+                <w:rFonts w:asciiTheme="minorHAnsi" w:eastAsia="Arial" w:hAnsiTheme="minorHAnsi" w:cstheme="minorHAnsi"/>
+                <w:sz w:val="16"/>
+                <w:szCs w:val="16"/>
+              </w:rPr>
+            </w:pPr>
+            <w:r>
+              <w:rPr>
+                <w:rFonts w:asciiTheme="minorHAnsi" w:hAnsiTheme="minorHAnsi" w:cstheme="minorHAnsi"/>
+              </w:rPr>
+              <w:t xml:space="preserve">3 </w:t>
+            </w:r>
+            <w:r>
+              <w:rPr>
+                <w:rFonts w:asciiTheme="minorHAnsi" w:hAnsiTheme="minorHAnsi" w:cstheme="minorHAnsi"/>
+              </w:rPr>
+              <w:t>${</w:t>
+            </w:r>
+            <w:r>
+              <w:rPr>
+                <w:rFonts w:asciiTheme="minorHAnsi" w:eastAsia="Arial" w:hAnsiTheme="minorHAnsi" w:cstheme="minorHAnsi"/>
+              </w:rPr>
+              <w:t>work_attitude</w:t>
+            </w:r>
+            <w:r>
+              <w:rPr>
+                <w:rFonts w:asciiTheme="minorHAnsi" w:hAnsiTheme="minorHAnsi" w:cstheme="minorHAnsi"/>
+              </w:rPr>
+              <w:t>_3}</w:t>
             </w:r>
           </w:p>
         </w:tc>
@@ -1673,7 +1741,7 @@
               </w:pBdr>
               <w:spacing w:after="0" w:line="276" w:lineRule="auto"/>
               <w:rPr>
-                <w:rFonts w:ascii="Arial" w:eastAsia="Arial" w:hAnsi="Arial" w:cs="Arial"/>
+                <w:rFonts w:asciiTheme="minorHAnsi" w:eastAsia="Arial" w:hAnsiTheme="minorHAnsi" w:cstheme="minorHAnsi"/>
                 <w:sz w:val="16"/>
                 <w:szCs w:val="16"/>
               </w:rPr>
@@ -1753,18 +1821,34 @@
               <w:spacing w:after="0" w:line="240" w:lineRule="auto"/>
               <w:jc w:val="center"/>
               <w:rPr>
-                <w:rFonts w:ascii="Arial" w:eastAsia="Arial" w:hAnsi="Arial" w:cs="Arial"/>
-                <w:sz w:val="16"/>
-                <w:szCs w:val="16"/>
-              </w:rPr>
-            </w:pPr>
-            <w:r>
-              <w:rPr>
-                <w:rFonts w:ascii="Arial" w:eastAsia="Arial" w:hAnsi="Arial" w:cs="Arial"/>
-                <w:sz w:val="16"/>
-                <w:szCs w:val="16"/>
-              </w:rPr>
-              <w:t>2</w:t>
+                <w:rFonts w:asciiTheme="minorHAnsi" w:eastAsia="Arial" w:hAnsiTheme="minorHAnsi" w:cstheme="minorHAnsi"/>
+                <w:sz w:val="16"/>
+                <w:szCs w:val="16"/>
+              </w:rPr>
+            </w:pPr>
+            <w:r>
+              <w:rPr>
+                <w:rFonts w:asciiTheme="minorHAnsi" w:hAnsiTheme="minorHAnsi" w:cstheme="minorHAnsi"/>
+              </w:rPr>
+              <w:t xml:space="preserve">2 </w:t>
+            </w:r>
+            <w:r>
+              <w:rPr>
+                <w:rFonts w:asciiTheme="minorHAnsi" w:hAnsiTheme="minorHAnsi" w:cstheme="minorHAnsi"/>
+              </w:rPr>
+              <w:t>${</w:t>
+            </w:r>
+            <w:r>
+              <w:rPr>
+                <w:rFonts w:asciiTheme="minorHAnsi" w:eastAsia="Arial" w:hAnsiTheme="minorHAnsi" w:cstheme="minorHAnsi"/>
+              </w:rPr>
+              <w:t>work_attitude</w:t>
+            </w:r>
+            <w:r>
+              <w:rPr>
+                <w:rFonts w:asciiTheme="minorHAnsi" w:hAnsiTheme="minorHAnsi" w:cstheme="minorHAnsi"/>
+              </w:rPr>
+              <w:t>_2}</w:t>
             </w:r>
           </w:p>
         </w:tc>
@@ -1790,7 +1874,7 @@
               </w:pBdr>
               <w:spacing w:after="0" w:line="276" w:lineRule="auto"/>
               <w:rPr>
-                <w:rFonts w:ascii="Arial" w:eastAsia="Arial" w:hAnsi="Arial" w:cs="Arial"/>
+                <w:rFonts w:asciiTheme="minorHAnsi" w:eastAsia="Arial" w:hAnsiTheme="minorHAnsi" w:cstheme="minorHAnsi"/>
                 <w:sz w:val="16"/>
                 <w:szCs w:val="16"/>
               </w:rPr>
@@ -1870,18 +1954,34 @@
               <w:spacing w:after="0" w:line="240" w:lineRule="auto"/>
               <w:jc w:val="center"/>
               <w:rPr>
-                <w:rFonts w:ascii="Arial" w:eastAsia="Arial" w:hAnsi="Arial" w:cs="Arial"/>
-                <w:sz w:val="16"/>
-                <w:szCs w:val="16"/>
-              </w:rPr>
-            </w:pPr>
-            <w:r>
-              <w:rPr>
-                <w:rFonts w:ascii="Arial" w:eastAsia="Arial" w:hAnsi="Arial" w:cs="Arial"/>
-                <w:sz w:val="16"/>
-                <w:szCs w:val="16"/>
-              </w:rPr>
-              <w:t>1</w:t>
+                <w:rFonts w:asciiTheme="minorHAnsi" w:eastAsia="Arial" w:hAnsiTheme="minorHAnsi" w:cstheme="minorHAnsi"/>
+                <w:sz w:val="16"/>
+                <w:szCs w:val="16"/>
+              </w:rPr>
+            </w:pPr>
+            <w:r>
+              <w:rPr>
+                <w:rFonts w:asciiTheme="minorHAnsi" w:hAnsiTheme="minorHAnsi" w:cstheme="minorHAnsi"/>
+              </w:rPr>
+              <w:t xml:space="preserve">1 </w:t>
+            </w:r>
+            <w:r>
+              <w:rPr>
+                <w:rFonts w:asciiTheme="minorHAnsi" w:hAnsiTheme="minorHAnsi" w:cstheme="minorHAnsi"/>
+              </w:rPr>
+              <w:t>${</w:t>
+            </w:r>
+            <w:r>
+              <w:rPr>
+                <w:rFonts w:asciiTheme="minorHAnsi" w:eastAsia="Arial" w:hAnsiTheme="minorHAnsi" w:cstheme="minorHAnsi"/>
+              </w:rPr>
+              <w:t>work_attitude</w:t>
+            </w:r>
+            <w:r>
+              <w:rPr>
+                <w:rFonts w:asciiTheme="minorHAnsi" w:hAnsiTheme="minorHAnsi" w:cstheme="minorHAnsi"/>
+              </w:rPr>
+              <w:t>_1}</w:t>
             </w:r>
           </w:p>
         </w:tc>
@@ -1907,7 +2007,7 @@
               </w:pBdr>
               <w:spacing w:after="0" w:line="276" w:lineRule="auto"/>
               <w:rPr>
-                <w:rFonts w:ascii="Arial" w:eastAsia="Arial" w:hAnsi="Arial" w:cs="Arial"/>
+                <w:rFonts w:asciiTheme="minorHAnsi" w:eastAsia="Arial" w:hAnsiTheme="minorHAnsi" w:cstheme="minorHAnsi"/>
                 <w:sz w:val="16"/>
                 <w:szCs w:val="16"/>
               </w:rPr>
@@ -1990,18 +2090,34 @@
               <w:spacing w:after="0" w:line="240" w:lineRule="auto"/>
               <w:jc w:val="center"/>
               <w:rPr>
-                <w:rFonts w:ascii="Arial" w:eastAsia="Arial" w:hAnsi="Arial" w:cs="Arial"/>
-                <w:sz w:val="16"/>
-                <w:szCs w:val="16"/>
-              </w:rPr>
-            </w:pPr>
-            <w:r>
-              <w:rPr>
-                <w:rFonts w:ascii="Arial" w:eastAsia="Arial" w:hAnsi="Arial" w:cs="Arial"/>
-                <w:sz w:val="16"/>
-                <w:szCs w:val="16"/>
-              </w:rPr>
-              <w:t>5</w:t>
+                <w:rFonts w:asciiTheme="minorHAnsi" w:eastAsia="Arial" w:hAnsiTheme="minorHAnsi" w:cstheme="minorHAnsi"/>
+                <w:sz w:val="16"/>
+                <w:szCs w:val="16"/>
+              </w:rPr>
+            </w:pPr>
+            <w:r>
+              <w:rPr>
+                <w:rFonts w:asciiTheme="minorHAnsi" w:hAnsiTheme="minorHAnsi" w:cstheme="minorHAnsi"/>
+              </w:rPr>
+              <w:t xml:space="preserve">5 </w:t>
+            </w:r>
+            <w:r>
+              <w:rPr>
+                <w:rFonts w:asciiTheme="minorHAnsi" w:hAnsiTheme="minorHAnsi" w:cstheme="minorHAnsi"/>
+              </w:rPr>
+              <w:t>${</w:t>
+            </w:r>
+            <w:r>
+              <w:rPr>
+                <w:rFonts w:asciiTheme="minorHAnsi" w:eastAsia="Arial" w:hAnsiTheme="minorHAnsi" w:cstheme="minorHAnsi"/>
+              </w:rPr>
+              <w:t>conduct</w:t>
+            </w:r>
+            <w:r>
+              <w:rPr>
+                <w:rFonts w:asciiTheme="minorHAnsi" w:hAnsiTheme="minorHAnsi" w:cstheme="minorHAnsi"/>
+              </w:rPr>
+              <w:t>_5}</w:t>
             </w:r>
           </w:p>
         </w:tc>
@@ -2020,11 +2136,17 @@
               <w:spacing w:after="0" w:line="240" w:lineRule="auto"/>
               <w:jc w:val="center"/>
               <w:rPr>
-                <w:rFonts w:ascii="Arial" w:eastAsia="Arial" w:hAnsi="Arial" w:cs="Arial"/>
-                <w:sz w:val="16"/>
-                <w:szCs w:val="16"/>
-              </w:rPr>
-            </w:pPr>
+                <w:rFonts w:asciiTheme="minorHAnsi" w:eastAsia="Arial" w:hAnsiTheme="minorHAnsi" w:cstheme="minorHAnsi"/>
+                <w:sz w:val="16"/>
+                <w:szCs w:val="16"/>
+              </w:rPr>
+            </w:pPr>
+            <w:r>
+              <w:rPr>
+                <w:rFonts w:asciiTheme="minorHAnsi" w:eastAsia="Arial" w:hAnsiTheme="minorHAnsi" w:cstheme="minorHAnsi"/>
+              </w:rPr>
+              <w:t>${conduct_remarks}</w:t>
+            </w:r>
           </w:p>
         </w:tc>
       </w:tr>
@@ -2100,18 +2222,34 @@
               <w:spacing w:after="0" w:line="240" w:lineRule="auto"/>
               <w:jc w:val="center"/>
               <w:rPr>
-                <w:rFonts w:ascii="Arial" w:eastAsia="Arial" w:hAnsi="Arial" w:cs="Arial"/>
-                <w:sz w:val="16"/>
-                <w:szCs w:val="16"/>
-              </w:rPr>
-            </w:pPr>
-            <w:r>
-              <w:rPr>
-                <w:rFonts w:ascii="Arial" w:eastAsia="Arial" w:hAnsi="Arial" w:cs="Arial"/>
-                <w:sz w:val="16"/>
-                <w:szCs w:val="16"/>
-              </w:rPr>
-              <w:t>4</w:t>
+                <w:rFonts w:asciiTheme="minorHAnsi" w:eastAsia="Arial" w:hAnsiTheme="minorHAnsi" w:cstheme="minorHAnsi"/>
+                <w:sz w:val="16"/>
+                <w:szCs w:val="16"/>
+              </w:rPr>
+            </w:pPr>
+            <w:r>
+              <w:rPr>
+                <w:rFonts w:asciiTheme="minorHAnsi" w:hAnsiTheme="minorHAnsi" w:cstheme="minorHAnsi"/>
+              </w:rPr>
+              <w:t xml:space="preserve">4 </w:t>
+            </w:r>
+            <w:r>
+              <w:rPr>
+                <w:rFonts w:asciiTheme="minorHAnsi" w:hAnsiTheme="minorHAnsi" w:cstheme="minorHAnsi"/>
+              </w:rPr>
+              <w:t>${</w:t>
+            </w:r>
+            <w:r>
+              <w:rPr>
+                <w:rFonts w:asciiTheme="minorHAnsi" w:eastAsia="Arial" w:hAnsiTheme="minorHAnsi" w:cstheme="minorHAnsi"/>
+              </w:rPr>
+              <w:t>conduct</w:t>
+            </w:r>
+            <w:r>
+              <w:rPr>
+                <w:rFonts w:asciiTheme="minorHAnsi" w:hAnsiTheme="minorHAnsi" w:cstheme="minorHAnsi"/>
+              </w:rPr>
+              <w:t>_4}</w:t>
             </w:r>
           </w:p>
         </w:tc>
@@ -2137,7 +2275,7 @@
               </w:pBdr>
               <w:spacing w:after="0" w:line="276" w:lineRule="auto"/>
               <w:rPr>
-                <w:rFonts w:ascii="Arial" w:eastAsia="Arial" w:hAnsi="Arial" w:cs="Arial"/>
+                <w:rFonts w:asciiTheme="minorHAnsi" w:eastAsia="Arial" w:hAnsiTheme="minorHAnsi" w:cstheme="minorHAnsi"/>
                 <w:sz w:val="16"/>
                 <w:szCs w:val="16"/>
               </w:rPr>
@@ -2217,18 +2355,34 @@
               <w:spacing w:after="0" w:line="240" w:lineRule="auto"/>
               <w:jc w:val="center"/>
               <w:rPr>
-                <w:rFonts w:ascii="Arial" w:eastAsia="Arial" w:hAnsi="Arial" w:cs="Arial"/>
-                <w:sz w:val="16"/>
-                <w:szCs w:val="16"/>
-              </w:rPr>
-            </w:pPr>
-            <w:r>
-              <w:rPr>
-                <w:rFonts w:ascii="Arial" w:eastAsia="Arial" w:hAnsi="Arial" w:cs="Arial"/>
-                <w:sz w:val="16"/>
-                <w:szCs w:val="16"/>
-              </w:rPr>
-              <w:t>3</w:t>
+                <w:rFonts w:asciiTheme="minorHAnsi" w:eastAsia="Arial" w:hAnsiTheme="minorHAnsi" w:cstheme="minorHAnsi"/>
+                <w:sz w:val="16"/>
+                <w:szCs w:val="16"/>
+              </w:rPr>
+            </w:pPr>
+            <w:r>
+              <w:rPr>
+                <w:rFonts w:asciiTheme="minorHAnsi" w:hAnsiTheme="minorHAnsi" w:cstheme="minorHAnsi"/>
+              </w:rPr>
+              <w:t xml:space="preserve">3 </w:t>
+            </w:r>
+            <w:r>
+              <w:rPr>
+                <w:rFonts w:asciiTheme="minorHAnsi" w:hAnsiTheme="minorHAnsi" w:cstheme="minorHAnsi"/>
+              </w:rPr>
+              <w:t>${</w:t>
+            </w:r>
+            <w:r>
+              <w:rPr>
+                <w:rFonts w:asciiTheme="minorHAnsi" w:eastAsia="Arial" w:hAnsiTheme="minorHAnsi" w:cstheme="minorHAnsi"/>
+              </w:rPr>
+              <w:t>conduct</w:t>
+            </w:r>
+            <w:r>
+              <w:rPr>
+                <w:rFonts w:asciiTheme="minorHAnsi" w:hAnsiTheme="minorHAnsi" w:cstheme="minorHAnsi"/>
+              </w:rPr>
+              <w:t>_3}</w:t>
             </w:r>
           </w:p>
         </w:tc>
@@ -2254,7 +2408,7 @@
               </w:pBdr>
               <w:spacing w:after="0" w:line="276" w:lineRule="auto"/>
               <w:rPr>
-                <w:rFonts w:ascii="Arial" w:eastAsia="Arial" w:hAnsi="Arial" w:cs="Arial"/>
+                <w:rFonts w:asciiTheme="minorHAnsi" w:eastAsia="Arial" w:hAnsiTheme="minorHAnsi" w:cstheme="minorHAnsi"/>
                 <w:sz w:val="16"/>
                 <w:szCs w:val="16"/>
               </w:rPr>
@@ -2334,18 +2488,34 @@
               <w:spacing w:after="0" w:line="240" w:lineRule="auto"/>
               <w:jc w:val="center"/>
               <w:rPr>
-                <w:rFonts w:ascii="Arial" w:eastAsia="Arial" w:hAnsi="Arial" w:cs="Arial"/>
-                <w:sz w:val="16"/>
-                <w:szCs w:val="16"/>
-              </w:rPr>
-            </w:pPr>
-            <w:r>
-              <w:rPr>
-                <w:rFonts w:ascii="Arial" w:eastAsia="Arial" w:hAnsi="Arial" w:cs="Arial"/>
-                <w:sz w:val="16"/>
-                <w:szCs w:val="16"/>
-              </w:rPr>
-              <w:t>2</w:t>
+                <w:rFonts w:asciiTheme="minorHAnsi" w:eastAsia="Arial" w:hAnsiTheme="minorHAnsi" w:cstheme="minorHAnsi"/>
+                <w:sz w:val="16"/>
+                <w:szCs w:val="16"/>
+              </w:rPr>
+            </w:pPr>
+            <w:r>
+              <w:rPr>
+                <w:rFonts w:asciiTheme="minorHAnsi" w:hAnsiTheme="minorHAnsi" w:cstheme="minorHAnsi"/>
+              </w:rPr>
+              <w:t xml:space="preserve">2 </w:t>
+            </w:r>
+            <w:r>
+              <w:rPr>
+                <w:rFonts w:asciiTheme="minorHAnsi" w:hAnsiTheme="minorHAnsi" w:cstheme="minorHAnsi"/>
+              </w:rPr>
+              <w:t>${</w:t>
+            </w:r>
+            <w:r>
+              <w:rPr>
+                <w:rFonts w:asciiTheme="minorHAnsi" w:eastAsia="Arial" w:hAnsiTheme="minorHAnsi" w:cstheme="minorHAnsi"/>
+              </w:rPr>
+              <w:t>conduct</w:t>
+            </w:r>
+            <w:r>
+              <w:rPr>
+                <w:rFonts w:asciiTheme="minorHAnsi" w:hAnsiTheme="minorHAnsi" w:cstheme="minorHAnsi"/>
+              </w:rPr>
+              <w:t>_2}</w:t>
             </w:r>
           </w:p>
         </w:tc>
@@ -2371,7 +2541,7 @@
               </w:pBdr>
               <w:spacing w:after="0" w:line="276" w:lineRule="auto"/>
               <w:rPr>
-                <w:rFonts w:ascii="Arial" w:eastAsia="Arial" w:hAnsi="Arial" w:cs="Arial"/>
+                <w:rFonts w:asciiTheme="minorHAnsi" w:eastAsia="Arial" w:hAnsiTheme="minorHAnsi" w:cstheme="minorHAnsi"/>
                 <w:sz w:val="16"/>
                 <w:szCs w:val="16"/>
               </w:rPr>
@@ -2451,18 +2621,34 @@
               <w:spacing w:after="0" w:line="240" w:lineRule="auto"/>
               <w:jc w:val="center"/>
               <w:rPr>
-                <w:rFonts w:ascii="Arial" w:eastAsia="Arial" w:hAnsi="Arial" w:cs="Arial"/>
-                <w:sz w:val="16"/>
-                <w:szCs w:val="16"/>
-              </w:rPr>
-            </w:pPr>
-            <w:r>
-              <w:rPr>
-                <w:rFonts w:ascii="Arial" w:eastAsia="Arial" w:hAnsi="Arial" w:cs="Arial"/>
-                <w:sz w:val="16"/>
-                <w:szCs w:val="16"/>
-              </w:rPr>
-              <w:t>1</w:t>
+                <w:rFonts w:asciiTheme="minorHAnsi" w:eastAsia="Arial" w:hAnsiTheme="minorHAnsi" w:cstheme="minorHAnsi"/>
+                <w:sz w:val="16"/>
+                <w:szCs w:val="16"/>
+              </w:rPr>
+            </w:pPr>
+            <w:r>
+              <w:rPr>
+                <w:rFonts w:asciiTheme="minorHAnsi" w:hAnsiTheme="minorHAnsi" w:cstheme="minorHAnsi"/>
+              </w:rPr>
+              <w:t xml:space="preserve">1 </w:t>
+            </w:r>
+            <w:r>
+              <w:rPr>
+                <w:rFonts w:asciiTheme="minorHAnsi" w:hAnsiTheme="minorHAnsi" w:cstheme="minorHAnsi"/>
+              </w:rPr>
+              <w:t>${</w:t>
+            </w:r>
+            <w:r>
+              <w:rPr>
+                <w:rFonts w:asciiTheme="minorHAnsi" w:eastAsia="Arial" w:hAnsiTheme="minorHAnsi" w:cstheme="minorHAnsi"/>
+              </w:rPr>
+              <w:t>conduct</w:t>
+            </w:r>
+            <w:r>
+              <w:rPr>
+                <w:rFonts w:asciiTheme="minorHAnsi" w:hAnsiTheme="minorHAnsi" w:cstheme="minorHAnsi"/>
+              </w:rPr>
+              <w:t>_1}</w:t>
             </w:r>
           </w:p>
         </w:tc>
@@ -2488,7 +2674,7 @@
               </w:pBdr>
               <w:spacing w:after="0" w:line="276" w:lineRule="auto"/>
               <w:rPr>
-                <w:rFonts w:ascii="Arial" w:eastAsia="Arial" w:hAnsi="Arial" w:cs="Arial"/>
+                <w:rFonts w:asciiTheme="minorHAnsi" w:eastAsia="Arial" w:hAnsiTheme="minorHAnsi" w:cstheme="minorHAnsi"/>
                 <w:sz w:val="16"/>
                 <w:szCs w:val="16"/>
               </w:rPr>
@@ -2571,18 +2757,36 @@
               <w:spacing w:after="0" w:line="240" w:lineRule="auto"/>
               <w:jc w:val="center"/>
               <w:rPr>
-                <w:rFonts w:ascii="Arial" w:eastAsia="Arial" w:hAnsi="Arial" w:cs="Arial"/>
-                <w:sz w:val="16"/>
-                <w:szCs w:val="16"/>
-              </w:rPr>
-            </w:pPr>
-            <w:r>
-              <w:rPr>
-                <w:rFonts w:ascii="Arial" w:eastAsia="Arial" w:hAnsi="Arial" w:cs="Arial"/>
-                <w:sz w:val="16"/>
-                <w:szCs w:val="16"/>
-              </w:rPr>
-              <w:t>5</w:t>
+                <w:rFonts w:asciiTheme="minorHAnsi" w:eastAsia="Arial" w:hAnsiTheme="minorHAnsi" w:cstheme="minorHAnsi"/>
+                <w:sz w:val="16"/>
+                <w:szCs w:val="16"/>
+              </w:rPr>
+            </w:pPr>
+            <w:r>
+              <w:rPr>
+                <w:rFonts w:asciiTheme="minorHAnsi" w:hAnsiTheme="minorHAnsi" w:cstheme="minorHAnsi"/>
+              </w:rPr>
+              <w:t xml:space="preserve">5 </w:t>
+            </w:r>
+            <w:r>
+              <w:rPr>
+                <w:rFonts w:asciiTheme="minorHAnsi" w:hAnsiTheme="minorHAnsi" w:cstheme="minorHAnsi"/>
+              </w:rPr>
+              <w:t>${</w:t>
+            </w:r>
+            <w:r>
+              <w:rPr>
+                <w:rFonts w:asciiTheme="minorHAnsi" w:eastAsia="Arial" w:hAnsiTheme="minorHAnsi" w:cstheme="minorHAnsi"/>
+                <w:sz w:val="16"/>
+                <w:szCs w:val="16"/>
+              </w:rPr>
+              <w:t>motivation</w:t>
+            </w:r>
+            <w:r>
+              <w:rPr>
+                <w:rFonts w:asciiTheme="minorHAnsi" w:hAnsiTheme="minorHAnsi" w:cstheme="minorHAnsi"/>
+              </w:rPr>
+              <w:t>_5}</w:t>
             </w:r>
           </w:p>
         </w:tc>
@@ -2601,11 +2805,19 @@
               <w:spacing w:after="0" w:line="240" w:lineRule="auto"/>
               <w:jc w:val="center"/>
               <w:rPr>
-                <w:rFonts w:ascii="Arial" w:eastAsia="Arial" w:hAnsi="Arial" w:cs="Arial"/>
-                <w:sz w:val="16"/>
-                <w:szCs w:val="16"/>
-              </w:rPr>
-            </w:pPr>
+                <w:rFonts w:asciiTheme="minorHAnsi" w:eastAsia="Arial" w:hAnsiTheme="minorHAnsi" w:cstheme="minorHAnsi"/>
+                <w:sz w:val="16"/>
+                <w:szCs w:val="16"/>
+              </w:rPr>
+            </w:pPr>
+            <w:r>
+              <w:rPr>
+                <w:rFonts w:asciiTheme="minorHAnsi" w:eastAsia="Arial" w:hAnsiTheme="minorHAnsi" w:cstheme="minorHAnsi"/>
+                <w:sz w:val="16"/>
+                <w:szCs w:val="16"/>
+              </w:rPr>
+              <w:t>${motivation_remarks}</w:t>
+            </w:r>
           </w:p>
         </w:tc>
       </w:tr>
@@ -2681,18 +2893,36 @@
               <w:spacing w:after="0" w:line="240" w:lineRule="auto"/>
               <w:jc w:val="center"/>
               <w:rPr>
-                <w:rFonts w:ascii="Arial" w:eastAsia="Arial" w:hAnsi="Arial" w:cs="Arial"/>
-                <w:sz w:val="16"/>
-                <w:szCs w:val="16"/>
-              </w:rPr>
-            </w:pPr>
-            <w:r>
-              <w:rPr>
-                <w:rFonts w:ascii="Arial" w:eastAsia="Arial" w:hAnsi="Arial" w:cs="Arial"/>
-                <w:sz w:val="16"/>
-                <w:szCs w:val="16"/>
-              </w:rPr>
-              <w:t>4</w:t>
+                <w:rFonts w:asciiTheme="minorHAnsi" w:eastAsia="Arial" w:hAnsiTheme="minorHAnsi" w:cstheme="minorHAnsi"/>
+                <w:sz w:val="16"/>
+                <w:szCs w:val="16"/>
+              </w:rPr>
+            </w:pPr>
+            <w:r>
+              <w:rPr>
+                <w:rFonts w:asciiTheme="minorHAnsi" w:hAnsiTheme="minorHAnsi" w:cstheme="minorHAnsi"/>
+              </w:rPr>
+              <w:t xml:space="preserve">4 </w:t>
+            </w:r>
+            <w:r>
+              <w:rPr>
+                <w:rFonts w:asciiTheme="minorHAnsi" w:hAnsiTheme="minorHAnsi" w:cstheme="minorHAnsi"/>
+              </w:rPr>
+              <w:t>${</w:t>
+            </w:r>
+            <w:r>
+              <w:rPr>
+                <w:rFonts w:asciiTheme="minorHAnsi" w:eastAsia="Arial" w:hAnsiTheme="minorHAnsi" w:cstheme="minorHAnsi"/>
+                <w:sz w:val="16"/>
+                <w:szCs w:val="16"/>
+              </w:rPr>
+              <w:t>motivation</w:t>
+            </w:r>
+            <w:r>
+              <w:rPr>
+                <w:rFonts w:asciiTheme="minorHAnsi" w:hAnsiTheme="minorHAnsi" w:cstheme="minorHAnsi"/>
+              </w:rPr>
+              <w:t>_4}</w:t>
             </w:r>
           </w:p>
         </w:tc>
@@ -2718,7 +2948,7 @@
               </w:pBdr>
               <w:spacing w:after="0" w:line="276" w:lineRule="auto"/>
               <w:rPr>
-                <w:rFonts w:ascii="Arial" w:eastAsia="Arial" w:hAnsi="Arial" w:cs="Arial"/>
+                <w:rFonts w:asciiTheme="minorHAnsi" w:eastAsia="Arial" w:hAnsiTheme="minorHAnsi" w:cstheme="minorHAnsi"/>
                 <w:sz w:val="16"/>
                 <w:szCs w:val="16"/>
               </w:rPr>
@@ -2798,18 +3028,36 @@
               <w:spacing w:after="0" w:line="240" w:lineRule="auto"/>
               <w:jc w:val="center"/>
               <w:rPr>
-                <w:rFonts w:ascii="Arial" w:eastAsia="Arial" w:hAnsi="Arial" w:cs="Arial"/>
-                <w:sz w:val="16"/>
-                <w:szCs w:val="16"/>
-              </w:rPr>
-            </w:pPr>
-            <w:r>
-              <w:rPr>
-                <w:rFonts w:ascii="Arial" w:eastAsia="Arial" w:hAnsi="Arial" w:cs="Arial"/>
-                <w:sz w:val="16"/>
-                <w:szCs w:val="16"/>
-              </w:rPr>
-              <w:t>3</w:t>
+                <w:rFonts w:asciiTheme="minorHAnsi" w:eastAsia="Arial" w:hAnsiTheme="minorHAnsi" w:cstheme="minorHAnsi"/>
+                <w:sz w:val="16"/>
+                <w:szCs w:val="16"/>
+              </w:rPr>
+            </w:pPr>
+            <w:r>
+              <w:rPr>
+                <w:rFonts w:asciiTheme="minorHAnsi" w:hAnsiTheme="minorHAnsi" w:cstheme="minorHAnsi"/>
+              </w:rPr>
+              <w:t xml:space="preserve">3 </w:t>
+            </w:r>
+            <w:r>
+              <w:rPr>
+                <w:rFonts w:asciiTheme="minorHAnsi" w:hAnsiTheme="minorHAnsi" w:cstheme="minorHAnsi"/>
+              </w:rPr>
+              <w:t>${</w:t>
+            </w:r>
+            <w:r>
+              <w:rPr>
+                <w:rFonts w:asciiTheme="minorHAnsi" w:eastAsia="Arial" w:hAnsiTheme="minorHAnsi" w:cstheme="minorHAnsi"/>
+                <w:sz w:val="16"/>
+                <w:szCs w:val="16"/>
+              </w:rPr>
+              <w:t>motivation</w:t>
+            </w:r>
+            <w:r>
+              <w:rPr>
+                <w:rFonts w:asciiTheme="minorHAnsi" w:hAnsiTheme="minorHAnsi" w:cstheme="minorHAnsi"/>
+              </w:rPr>
+              <w:t>_3}</w:t>
             </w:r>
           </w:p>
         </w:tc>
@@ -2835,7 +3083,7 @@
               </w:pBdr>
               <w:spacing w:after="0" w:line="276" w:lineRule="auto"/>
               <w:rPr>
-                <w:rFonts w:ascii="Arial" w:eastAsia="Arial" w:hAnsi="Arial" w:cs="Arial"/>
+                <w:rFonts w:asciiTheme="minorHAnsi" w:eastAsia="Arial" w:hAnsiTheme="minorHAnsi" w:cstheme="minorHAnsi"/>
                 <w:sz w:val="16"/>
                 <w:szCs w:val="16"/>
               </w:rPr>
@@ -2915,18 +3163,36 @@
               <w:spacing w:after="0" w:line="240" w:lineRule="auto"/>
               <w:jc w:val="center"/>
               <w:rPr>
-                <w:rFonts w:ascii="Arial" w:eastAsia="Arial" w:hAnsi="Arial" w:cs="Arial"/>
-                <w:sz w:val="16"/>
-                <w:szCs w:val="16"/>
-              </w:rPr>
-            </w:pPr>
-            <w:r>
-              <w:rPr>
-                <w:rFonts w:ascii="Arial" w:eastAsia="Arial" w:hAnsi="Arial" w:cs="Arial"/>
-                <w:sz w:val="16"/>
-                <w:szCs w:val="16"/>
-              </w:rPr>
-              <w:t>2</w:t>
+                <w:rFonts w:asciiTheme="minorHAnsi" w:eastAsia="Arial" w:hAnsiTheme="minorHAnsi" w:cstheme="minorHAnsi"/>
+                <w:sz w:val="16"/>
+                <w:szCs w:val="16"/>
+              </w:rPr>
+            </w:pPr>
+            <w:r>
+              <w:rPr>
+                <w:rFonts w:asciiTheme="minorHAnsi" w:hAnsiTheme="minorHAnsi" w:cstheme="minorHAnsi"/>
+              </w:rPr>
+              <w:t xml:space="preserve">2 </w:t>
+            </w:r>
+            <w:r>
+              <w:rPr>
+                <w:rFonts w:asciiTheme="minorHAnsi" w:hAnsiTheme="minorHAnsi" w:cstheme="minorHAnsi"/>
+              </w:rPr>
+              <w:t>${</w:t>
+            </w:r>
+            <w:r>
+              <w:rPr>
+                <w:rFonts w:asciiTheme="minorHAnsi" w:eastAsia="Arial" w:hAnsiTheme="minorHAnsi" w:cstheme="minorHAnsi"/>
+                <w:sz w:val="16"/>
+                <w:szCs w:val="16"/>
+              </w:rPr>
+              <w:t>motivation</w:t>
+            </w:r>
+            <w:r>
+              <w:rPr>
+                <w:rFonts w:asciiTheme="minorHAnsi" w:hAnsiTheme="minorHAnsi" w:cstheme="minorHAnsi"/>
+              </w:rPr>
+              <w:t>_2}</w:t>
             </w:r>
           </w:p>
         </w:tc>
@@ -2952,7 +3218,7 @@
               </w:pBdr>
               <w:spacing w:after="0" w:line="276" w:lineRule="auto"/>
               <w:rPr>
-                <w:rFonts w:ascii="Arial" w:eastAsia="Arial" w:hAnsi="Arial" w:cs="Arial"/>
+                <w:rFonts w:asciiTheme="minorHAnsi" w:eastAsia="Arial" w:hAnsiTheme="minorHAnsi" w:cstheme="minorHAnsi"/>
                 <w:sz w:val="16"/>
                 <w:szCs w:val="16"/>
               </w:rPr>
@@ -3032,18 +3298,36 @@
               <w:spacing w:after="0" w:line="240" w:lineRule="auto"/>
               <w:jc w:val="center"/>
               <w:rPr>
-                <w:rFonts w:ascii="Arial" w:eastAsia="Arial" w:hAnsi="Arial" w:cs="Arial"/>
-                <w:sz w:val="16"/>
-                <w:szCs w:val="16"/>
-              </w:rPr>
-            </w:pPr>
-            <w:r>
-              <w:rPr>
-                <w:rFonts w:ascii="Arial" w:eastAsia="Arial" w:hAnsi="Arial" w:cs="Arial"/>
-                <w:sz w:val="16"/>
-                <w:szCs w:val="16"/>
-              </w:rPr>
-              <w:t>1</w:t>
+                <w:rFonts w:asciiTheme="minorHAnsi" w:eastAsia="Arial" w:hAnsiTheme="minorHAnsi" w:cstheme="minorHAnsi"/>
+                <w:sz w:val="16"/>
+                <w:szCs w:val="16"/>
+              </w:rPr>
+            </w:pPr>
+            <w:r>
+              <w:rPr>
+                <w:rFonts w:asciiTheme="minorHAnsi" w:hAnsiTheme="minorHAnsi" w:cstheme="minorHAnsi"/>
+              </w:rPr>
+              <w:t xml:space="preserve">1 </w:t>
+            </w:r>
+            <w:r>
+              <w:rPr>
+                <w:rFonts w:asciiTheme="minorHAnsi" w:hAnsiTheme="minorHAnsi" w:cstheme="minorHAnsi"/>
+              </w:rPr>
+              <w:t>${</w:t>
+            </w:r>
+            <w:r>
+              <w:rPr>
+                <w:rFonts w:asciiTheme="minorHAnsi" w:eastAsia="Arial" w:hAnsiTheme="minorHAnsi" w:cstheme="minorHAnsi"/>
+                <w:sz w:val="16"/>
+                <w:szCs w:val="16"/>
+              </w:rPr>
+              <w:t>motivation</w:t>
+            </w:r>
+            <w:r>
+              <w:rPr>
+                <w:rFonts w:asciiTheme="minorHAnsi" w:hAnsiTheme="minorHAnsi" w:cstheme="minorHAnsi"/>
+              </w:rPr>
+              <w:t>_1}</w:t>
             </w:r>
           </w:p>
         </w:tc>
@@ -3069,7 +3353,7 @@
               </w:pBdr>
               <w:spacing w:after="0" w:line="276" w:lineRule="auto"/>
               <w:rPr>
-                <w:rFonts w:ascii="Arial" w:eastAsia="Arial" w:hAnsi="Arial" w:cs="Arial"/>
+                <w:rFonts w:asciiTheme="minorHAnsi" w:eastAsia="Arial" w:hAnsiTheme="minorHAnsi" w:cstheme="minorHAnsi"/>
                 <w:sz w:val="16"/>
                 <w:szCs w:val="16"/>
               </w:rPr>
@@ -3152,18 +3436,36 @@
               <w:spacing w:after="0" w:line="240" w:lineRule="auto"/>
               <w:jc w:val="center"/>
               <w:rPr>
-                <w:rFonts w:ascii="Arial" w:eastAsia="Arial" w:hAnsi="Arial" w:cs="Arial"/>
-                <w:sz w:val="16"/>
-                <w:szCs w:val="16"/>
-              </w:rPr>
-            </w:pPr>
-            <w:r>
-              <w:rPr>
-                <w:rFonts w:ascii="Arial" w:eastAsia="Arial" w:hAnsi="Arial" w:cs="Arial"/>
-                <w:sz w:val="16"/>
-                <w:szCs w:val="16"/>
-              </w:rPr>
-              <w:t>5</w:t>
+                <w:rFonts w:asciiTheme="minorHAnsi" w:eastAsia="Arial" w:hAnsiTheme="minorHAnsi" w:cstheme="minorHAnsi"/>
+                <w:sz w:val="16"/>
+                <w:szCs w:val="16"/>
+              </w:rPr>
+            </w:pPr>
+            <w:r>
+              <w:rPr>
+                <w:rFonts w:asciiTheme="minorHAnsi" w:hAnsiTheme="minorHAnsi" w:cstheme="minorHAnsi"/>
+              </w:rPr>
+              <w:t xml:space="preserve">5 </w:t>
+            </w:r>
+            <w:r>
+              <w:rPr>
+                <w:rFonts w:asciiTheme="minorHAnsi" w:hAnsiTheme="minorHAnsi" w:cstheme="minorHAnsi"/>
+              </w:rPr>
+              <w:t>${</w:t>
+            </w:r>
+            <w:r>
+              <w:rPr>
+                <w:rFonts w:asciiTheme="minorHAnsi" w:eastAsia="Arial" w:hAnsiTheme="minorHAnsi" w:cstheme="minorHAnsi"/>
+                <w:sz w:val="16"/>
+                <w:szCs w:val="16"/>
+              </w:rPr>
+              <w:t>quality</w:t>
+            </w:r>
+            <w:r>
+              <w:rPr>
+                <w:rFonts w:asciiTheme="minorHAnsi" w:hAnsiTheme="minorHAnsi" w:cstheme="minorHAnsi"/>
+              </w:rPr>
+              <w:t>_5}</w:t>
             </w:r>
           </w:p>
         </w:tc>
@@ -3182,11 +3484,19 @@
               <w:spacing w:after="0" w:line="240" w:lineRule="auto"/>
               <w:jc w:val="center"/>
               <w:rPr>
-                <w:rFonts w:ascii="Arial" w:eastAsia="Arial" w:hAnsi="Arial" w:cs="Arial"/>
-                <w:sz w:val="16"/>
-                <w:szCs w:val="16"/>
-              </w:rPr>
-            </w:pPr>
+                <w:rFonts w:asciiTheme="minorHAnsi" w:eastAsia="Arial" w:hAnsiTheme="minorHAnsi" w:cstheme="minorHAnsi"/>
+                <w:sz w:val="16"/>
+                <w:szCs w:val="16"/>
+              </w:rPr>
+            </w:pPr>
+            <w:r>
+              <w:rPr>
+                <w:rFonts w:asciiTheme="minorHAnsi" w:eastAsia="Arial" w:hAnsiTheme="minorHAnsi" w:cstheme="minorHAnsi"/>
+                <w:sz w:val="16"/>
+                <w:szCs w:val="16"/>
+              </w:rPr>
+              <w:t>${quality_remarks}</w:t>
+            </w:r>
           </w:p>
         </w:tc>
       </w:tr>
@@ -3262,18 +3572,36 @@
               <w:spacing w:after="0" w:line="240" w:lineRule="auto"/>
               <w:jc w:val="center"/>
               <w:rPr>
-                <w:rFonts w:ascii="Arial" w:eastAsia="Arial" w:hAnsi="Arial" w:cs="Arial"/>
-                <w:sz w:val="16"/>
-                <w:szCs w:val="16"/>
-              </w:rPr>
-            </w:pPr>
-            <w:r>
-              <w:rPr>
-                <w:rFonts w:ascii="Arial" w:eastAsia="Arial" w:hAnsi="Arial" w:cs="Arial"/>
-                <w:sz w:val="16"/>
-                <w:szCs w:val="16"/>
-              </w:rPr>
-              <w:t>4</w:t>
+                <w:rFonts w:asciiTheme="minorHAnsi" w:eastAsia="Arial" w:hAnsiTheme="minorHAnsi" w:cstheme="minorHAnsi"/>
+                <w:sz w:val="16"/>
+                <w:szCs w:val="16"/>
+              </w:rPr>
+            </w:pPr>
+            <w:r>
+              <w:rPr>
+                <w:rFonts w:asciiTheme="minorHAnsi" w:hAnsiTheme="minorHAnsi" w:cstheme="minorHAnsi"/>
+              </w:rPr>
+              <w:t xml:space="preserve">4 </w:t>
+            </w:r>
+            <w:r>
+              <w:rPr>
+                <w:rFonts w:asciiTheme="minorHAnsi" w:hAnsiTheme="minorHAnsi" w:cstheme="minorHAnsi"/>
+              </w:rPr>
+              <w:t>${</w:t>
+            </w:r>
+            <w:r>
+              <w:rPr>
+                <w:rFonts w:asciiTheme="minorHAnsi" w:eastAsia="Arial" w:hAnsiTheme="minorHAnsi" w:cstheme="minorHAnsi"/>
+                <w:sz w:val="16"/>
+                <w:szCs w:val="16"/>
+              </w:rPr>
+              <w:t>quality</w:t>
+            </w:r>
+            <w:r>
+              <w:rPr>
+                <w:rFonts w:asciiTheme="minorHAnsi" w:hAnsiTheme="minorHAnsi" w:cstheme="minorHAnsi"/>
+              </w:rPr>
+              <w:t>_4}</w:t>
             </w:r>
           </w:p>
         </w:tc>
@@ -3299,7 +3627,7 @@
               </w:pBdr>
               <w:spacing w:after="0" w:line="276" w:lineRule="auto"/>
               <w:rPr>
-                <w:rFonts w:ascii="Arial" w:eastAsia="Arial" w:hAnsi="Arial" w:cs="Arial"/>
+                <w:rFonts w:asciiTheme="minorHAnsi" w:eastAsia="Arial" w:hAnsiTheme="minorHAnsi" w:cstheme="minorHAnsi"/>
                 <w:sz w:val="16"/>
                 <w:szCs w:val="16"/>
               </w:rPr>
@@ -3379,18 +3707,36 @@
               <w:spacing w:after="0" w:line="240" w:lineRule="auto"/>
               <w:jc w:val="center"/>
               <w:rPr>
-                <w:rFonts w:ascii="Arial" w:eastAsia="Arial" w:hAnsi="Arial" w:cs="Arial"/>
-                <w:sz w:val="16"/>
-                <w:szCs w:val="16"/>
-              </w:rPr>
-            </w:pPr>
-            <w:r>
-              <w:rPr>
-                <w:rFonts w:ascii="Arial" w:eastAsia="Arial" w:hAnsi="Arial" w:cs="Arial"/>
-                <w:sz w:val="16"/>
-                <w:szCs w:val="16"/>
-              </w:rPr>
-              <w:t>3</w:t>
+                <w:rFonts w:asciiTheme="minorHAnsi" w:eastAsia="Arial" w:hAnsiTheme="minorHAnsi" w:cstheme="minorHAnsi"/>
+                <w:sz w:val="16"/>
+                <w:szCs w:val="16"/>
+              </w:rPr>
+            </w:pPr>
+            <w:r>
+              <w:rPr>
+                <w:rFonts w:asciiTheme="minorHAnsi" w:hAnsiTheme="minorHAnsi" w:cstheme="minorHAnsi"/>
+              </w:rPr>
+              <w:t xml:space="preserve">3 </w:t>
+            </w:r>
+            <w:r>
+              <w:rPr>
+                <w:rFonts w:asciiTheme="minorHAnsi" w:hAnsiTheme="minorHAnsi" w:cstheme="minorHAnsi"/>
+              </w:rPr>
+              <w:t>${</w:t>
+            </w:r>
+            <w:r>
+              <w:rPr>
+                <w:rFonts w:asciiTheme="minorHAnsi" w:eastAsia="Arial" w:hAnsiTheme="minorHAnsi" w:cstheme="minorHAnsi"/>
+                <w:sz w:val="16"/>
+                <w:szCs w:val="16"/>
+              </w:rPr>
+              <w:t>quality</w:t>
+            </w:r>
+            <w:r>
+              <w:rPr>
+                <w:rFonts w:asciiTheme="minorHAnsi" w:hAnsiTheme="minorHAnsi" w:cstheme="minorHAnsi"/>
+              </w:rPr>
+              <w:t>_3}</w:t>
             </w:r>
           </w:p>
         </w:tc>
@@ -3416,7 +3762,7 @@
               </w:pBdr>
               <w:spacing w:after="0" w:line="276" w:lineRule="auto"/>
               <w:rPr>
-                <w:rFonts w:ascii="Arial" w:eastAsia="Arial" w:hAnsi="Arial" w:cs="Arial"/>
+                <w:rFonts w:asciiTheme="minorHAnsi" w:eastAsia="Arial" w:hAnsiTheme="minorHAnsi" w:cstheme="minorHAnsi"/>
                 <w:sz w:val="16"/>
                 <w:szCs w:val="16"/>
               </w:rPr>
@@ -3496,18 +3842,36 @@
               <w:spacing w:after="0" w:line="240" w:lineRule="auto"/>
               <w:jc w:val="center"/>
               <w:rPr>
-                <w:rFonts w:ascii="Arial" w:eastAsia="Arial" w:hAnsi="Arial" w:cs="Arial"/>
-                <w:sz w:val="16"/>
-                <w:szCs w:val="16"/>
-              </w:rPr>
-            </w:pPr>
-            <w:r>
-              <w:rPr>
-                <w:rFonts w:ascii="Arial" w:eastAsia="Arial" w:hAnsi="Arial" w:cs="Arial"/>
-                <w:sz w:val="16"/>
-                <w:szCs w:val="16"/>
-              </w:rPr>
-              <w:t>2</w:t>
+                <w:rFonts w:asciiTheme="minorHAnsi" w:eastAsia="Arial" w:hAnsiTheme="minorHAnsi" w:cstheme="minorHAnsi"/>
+                <w:sz w:val="16"/>
+                <w:szCs w:val="16"/>
+              </w:rPr>
+            </w:pPr>
+            <w:r>
+              <w:rPr>
+                <w:rFonts w:asciiTheme="minorHAnsi" w:hAnsiTheme="minorHAnsi" w:cstheme="minorHAnsi"/>
+              </w:rPr>
+              <w:t xml:space="preserve">2 </w:t>
+            </w:r>
+            <w:r>
+              <w:rPr>
+                <w:rFonts w:asciiTheme="minorHAnsi" w:hAnsiTheme="minorHAnsi" w:cstheme="minorHAnsi"/>
+              </w:rPr>
+              <w:t>${</w:t>
+            </w:r>
+            <w:r>
+              <w:rPr>
+                <w:rFonts w:asciiTheme="minorHAnsi" w:eastAsia="Arial" w:hAnsiTheme="minorHAnsi" w:cstheme="minorHAnsi"/>
+                <w:sz w:val="16"/>
+                <w:szCs w:val="16"/>
+              </w:rPr>
+              <w:t>quality</w:t>
+            </w:r>
+            <w:r>
+              <w:rPr>
+                <w:rFonts w:asciiTheme="minorHAnsi" w:hAnsiTheme="minorHAnsi" w:cstheme="minorHAnsi"/>
+              </w:rPr>
+              <w:t>_2}</w:t>
             </w:r>
           </w:p>
         </w:tc>
@@ -3533,7 +3897,7 @@
               </w:pBdr>
               <w:spacing w:after="0" w:line="276" w:lineRule="auto"/>
               <w:rPr>
-                <w:rFonts w:ascii="Arial" w:eastAsia="Arial" w:hAnsi="Arial" w:cs="Arial"/>
+                <w:rFonts w:asciiTheme="minorHAnsi" w:eastAsia="Arial" w:hAnsiTheme="minorHAnsi" w:cstheme="minorHAnsi"/>
                 <w:sz w:val="16"/>
                 <w:szCs w:val="16"/>
               </w:rPr>
@@ -3619,18 +3983,36 @@
               <w:spacing w:after="0" w:line="240" w:lineRule="auto"/>
               <w:jc w:val="center"/>
               <w:rPr>
-                <w:rFonts w:ascii="Arial" w:eastAsia="Arial" w:hAnsi="Arial" w:cs="Arial"/>
-                <w:sz w:val="16"/>
-                <w:szCs w:val="16"/>
-              </w:rPr>
-            </w:pPr>
-            <w:r>
-              <w:rPr>
-                <w:rFonts w:ascii="Arial" w:eastAsia="Arial" w:hAnsi="Arial" w:cs="Arial"/>
-                <w:sz w:val="16"/>
-                <w:szCs w:val="16"/>
-              </w:rPr>
-              <w:t>1</w:t>
+                <w:rFonts w:asciiTheme="minorHAnsi" w:eastAsia="Arial" w:hAnsiTheme="minorHAnsi" w:cstheme="minorHAnsi"/>
+                <w:sz w:val="16"/>
+                <w:szCs w:val="16"/>
+              </w:rPr>
+            </w:pPr>
+            <w:r>
+              <w:rPr>
+                <w:rFonts w:asciiTheme="minorHAnsi" w:hAnsiTheme="minorHAnsi" w:cstheme="minorHAnsi"/>
+              </w:rPr>
+              <w:t xml:space="preserve">1 </w:t>
+            </w:r>
+            <w:r>
+              <w:rPr>
+                <w:rFonts w:asciiTheme="minorHAnsi" w:hAnsiTheme="minorHAnsi" w:cstheme="minorHAnsi"/>
+              </w:rPr>
+              <w:t>${</w:t>
+            </w:r>
+            <w:r>
+              <w:rPr>
+                <w:rFonts w:asciiTheme="minorHAnsi" w:eastAsia="Arial" w:hAnsiTheme="minorHAnsi" w:cstheme="minorHAnsi"/>
+                <w:sz w:val="16"/>
+                <w:szCs w:val="16"/>
+              </w:rPr>
+              <w:t>quality</w:t>
+            </w:r>
+            <w:r>
+              <w:rPr>
+                <w:rFonts w:asciiTheme="minorHAnsi" w:hAnsiTheme="minorHAnsi" w:cstheme="minorHAnsi"/>
+              </w:rPr>
+              <w:t>_1}</w:t>
             </w:r>
           </w:p>
         </w:tc>
@@ -3656,7 +4038,7 @@
               </w:pBdr>
               <w:spacing w:after="0" w:line="276" w:lineRule="auto"/>
               <w:rPr>
-                <w:rFonts w:ascii="Arial" w:eastAsia="Arial" w:hAnsi="Arial" w:cs="Arial"/>
+                <w:rFonts w:asciiTheme="minorHAnsi" w:eastAsia="Arial" w:hAnsiTheme="minorHAnsi" w:cstheme="minorHAnsi"/>
                 <w:sz w:val="16"/>
                 <w:szCs w:val="16"/>
               </w:rPr>
@@ -3748,7 +4130,7 @@
               <w:spacing w:after="0" w:line="240" w:lineRule="auto"/>
               <w:jc w:val="center"/>
               <w:rPr>
-                <w:rFonts w:ascii="Arial" w:eastAsia="Arial" w:hAnsi="Arial" w:cs="Arial"/>
+                <w:rFonts w:asciiTheme="minorHAnsi" w:eastAsia="Arial" w:hAnsiTheme="minorHAnsi" w:cstheme="minorHAnsi"/>
                 <w:b/>
                 <w:sz w:val="16"/>
                 <w:szCs w:val="16"/>
@@ -3756,7 +4138,7 @@
             </w:pPr>
             <w:r>
               <w:rPr>
-                <w:rFonts w:ascii="Arial" w:eastAsia="Arial" w:hAnsi="Arial" w:cs="Arial"/>
+                <w:rFonts w:asciiTheme="minorHAnsi" w:eastAsia="Arial" w:hAnsiTheme="minorHAnsi" w:cstheme="minorHAnsi"/>
                 <w:b/>
                 <w:sz w:val="16"/>
                 <w:szCs w:val="16"/>
@@ -3780,7 +4162,7 @@
               <w:spacing w:after="0" w:line="240" w:lineRule="auto"/>
               <w:jc w:val="center"/>
               <w:rPr>
-                <w:rFonts w:ascii="Arial" w:eastAsia="Arial" w:hAnsi="Arial" w:cs="Arial"/>
+                <w:rFonts w:asciiTheme="minorHAnsi" w:eastAsia="Arial" w:hAnsiTheme="minorHAnsi" w:cstheme="minorHAnsi"/>
                 <w:b/>
                 <w:sz w:val="16"/>
                 <w:szCs w:val="16"/>
@@ -3788,7 +4170,7 @@
             </w:pPr>
             <w:r>
               <w:rPr>
-                <w:rFonts w:ascii="Arial" w:eastAsia="Arial" w:hAnsi="Arial" w:cs="Arial"/>
+                <w:rFonts w:asciiTheme="minorHAnsi" w:eastAsia="Arial" w:hAnsiTheme="minorHAnsi" w:cstheme="minorHAnsi"/>
                 <w:b/>
                 <w:sz w:val="16"/>
                 <w:szCs w:val="16"/>
@@ -3873,18 +4255,36 @@
               <w:spacing w:after="0" w:line="240" w:lineRule="auto"/>
               <w:jc w:val="center"/>
               <w:rPr>
-                <w:rFonts w:ascii="Arial" w:eastAsia="Arial" w:hAnsi="Arial" w:cs="Arial"/>
-                <w:sz w:val="16"/>
-                <w:szCs w:val="16"/>
-              </w:rPr>
-            </w:pPr>
-            <w:r>
-              <w:rPr>
-                <w:rFonts w:ascii="Arial" w:eastAsia="Arial" w:hAnsi="Arial" w:cs="Arial"/>
-                <w:sz w:val="16"/>
-                <w:szCs w:val="16"/>
-              </w:rPr>
-              <w:t>5</w:t>
+                <w:rFonts w:asciiTheme="minorHAnsi" w:eastAsia="Arial" w:hAnsiTheme="minorHAnsi" w:cstheme="minorHAnsi"/>
+                <w:sz w:val="16"/>
+                <w:szCs w:val="16"/>
+              </w:rPr>
+            </w:pPr>
+            <w:r>
+              <w:rPr>
+                <w:rFonts w:asciiTheme="minorHAnsi" w:hAnsiTheme="minorHAnsi" w:cstheme="minorHAnsi"/>
+              </w:rPr>
+              <w:t xml:space="preserve">5 </w:t>
+            </w:r>
+            <w:r>
+              <w:rPr>
+                <w:rFonts w:asciiTheme="minorHAnsi" w:hAnsiTheme="minorHAnsi" w:cstheme="minorHAnsi"/>
+              </w:rPr>
+              <w:t>${</w:t>
+            </w:r>
+            <w:r>
+              <w:rPr>
+                <w:rFonts w:asciiTheme="minorHAnsi" w:eastAsia="Arial" w:hAnsiTheme="minorHAnsi" w:cstheme="minorHAnsi"/>
+                <w:sz w:val="16"/>
+                <w:szCs w:val="16"/>
+              </w:rPr>
+              <w:t>quantity_of_work</w:t>
+            </w:r>
+            <w:r>
+              <w:rPr>
+                <w:rFonts w:asciiTheme="minorHAnsi" w:hAnsiTheme="minorHAnsi" w:cstheme="minorHAnsi"/>
+              </w:rPr>
+              <w:t>_5}</w:t>
             </w:r>
           </w:p>
         </w:tc>
@@ -3903,11 +4303,27 @@
               <w:spacing w:after="0" w:line="240" w:lineRule="auto"/>
               <w:jc w:val="center"/>
               <w:rPr>
-                <w:rFonts w:ascii="Arial" w:eastAsia="Arial" w:hAnsi="Arial" w:cs="Arial"/>
-                <w:sz w:val="16"/>
-                <w:szCs w:val="16"/>
-              </w:rPr>
-            </w:pPr>
+                <w:rFonts w:asciiTheme="minorHAnsi" w:eastAsia="Arial" w:hAnsiTheme="minorHAnsi" w:cstheme="minorHAnsi"/>
+                <w:sz w:val="16"/>
+                <w:szCs w:val="16"/>
+              </w:rPr>
+            </w:pPr>
+            <w:r>
+              <w:rPr>
+                <w:rFonts w:asciiTheme="minorHAnsi" w:eastAsia="Arial" w:hAnsiTheme="minorHAnsi" w:cstheme="minorHAnsi"/>
+                <w:sz w:val="16"/>
+                <w:szCs w:val="16"/>
+              </w:rPr>
+              <w:t>${quantity</w:t>
+            </w:r>
+            <w:r>
+              <w:rPr>
+                <w:rFonts w:asciiTheme="minorHAnsi" w:eastAsia="Arial" w:hAnsiTheme="minorHAnsi" w:cstheme="minorHAnsi"/>
+                <w:sz w:val="16"/>
+                <w:szCs w:val="16"/>
+              </w:rPr>
+              <w:t>_of_work_remarks}</w:t>
+            </w:r>
           </w:p>
         </w:tc>
       </w:tr>
@@ -3983,18 +4399,36 @@
               <w:spacing w:after="0" w:line="240" w:lineRule="auto"/>
               <w:jc w:val="center"/>
               <w:rPr>
-                <w:rFonts w:ascii="Arial" w:eastAsia="Arial" w:hAnsi="Arial" w:cs="Arial"/>
-                <w:sz w:val="16"/>
-                <w:szCs w:val="16"/>
-              </w:rPr>
-            </w:pPr>
-            <w:r>
-              <w:rPr>
-                <w:rFonts w:ascii="Arial" w:eastAsia="Arial" w:hAnsi="Arial" w:cs="Arial"/>
-                <w:sz w:val="16"/>
-                <w:szCs w:val="16"/>
-              </w:rPr>
-              <w:t>4</w:t>
+                <w:rFonts w:asciiTheme="minorHAnsi" w:eastAsia="Arial" w:hAnsiTheme="minorHAnsi" w:cstheme="minorHAnsi"/>
+                <w:sz w:val="16"/>
+                <w:szCs w:val="16"/>
+              </w:rPr>
+            </w:pPr>
+            <w:r>
+              <w:rPr>
+                <w:rFonts w:asciiTheme="minorHAnsi" w:hAnsiTheme="minorHAnsi" w:cstheme="minorHAnsi"/>
+              </w:rPr>
+              <w:t xml:space="preserve">4 </w:t>
+            </w:r>
+            <w:r>
+              <w:rPr>
+                <w:rFonts w:asciiTheme="minorHAnsi" w:hAnsiTheme="minorHAnsi" w:cstheme="minorHAnsi"/>
+              </w:rPr>
+              <w:t>${</w:t>
+            </w:r>
+            <w:r>
+              <w:rPr>
+                <w:rFonts w:asciiTheme="minorHAnsi" w:eastAsia="Arial" w:hAnsiTheme="minorHAnsi" w:cstheme="minorHAnsi"/>
+                <w:sz w:val="16"/>
+                <w:szCs w:val="16"/>
+              </w:rPr>
+              <w:t>quantity_of_work</w:t>
+            </w:r>
+            <w:r>
+              <w:rPr>
+                <w:rFonts w:asciiTheme="minorHAnsi" w:hAnsiTheme="minorHAnsi" w:cstheme="minorHAnsi"/>
+              </w:rPr>
+              <w:t>_4}</w:t>
             </w:r>
           </w:p>
         </w:tc>
@@ -4020,7 +4454,7 @@
               </w:pBdr>
               <w:spacing w:after="0" w:line="276" w:lineRule="auto"/>
               <w:rPr>
-                <w:rFonts w:ascii="Arial" w:eastAsia="Arial" w:hAnsi="Arial" w:cs="Arial"/>
+                <w:rFonts w:asciiTheme="minorHAnsi" w:eastAsia="Arial" w:hAnsiTheme="minorHAnsi" w:cstheme="minorHAnsi"/>
                 <w:sz w:val="16"/>
                 <w:szCs w:val="16"/>
               </w:rPr>
@@ -4100,18 +4534,36 @@
               <w:spacing w:after="0" w:line="240" w:lineRule="auto"/>
               <w:jc w:val="center"/>
               <w:rPr>
-                <w:rFonts w:ascii="Arial" w:eastAsia="Arial" w:hAnsi="Arial" w:cs="Arial"/>
-                <w:sz w:val="16"/>
-                <w:szCs w:val="16"/>
-              </w:rPr>
-            </w:pPr>
-            <w:r>
-              <w:rPr>
-                <w:rFonts w:ascii="Arial" w:eastAsia="Arial" w:hAnsi="Arial" w:cs="Arial"/>
-                <w:sz w:val="16"/>
-                <w:szCs w:val="16"/>
-              </w:rPr>
-              <w:t>3</w:t>
+                <w:rFonts w:asciiTheme="minorHAnsi" w:eastAsia="Arial" w:hAnsiTheme="minorHAnsi" w:cstheme="minorHAnsi"/>
+                <w:sz w:val="16"/>
+                <w:szCs w:val="16"/>
+              </w:rPr>
+            </w:pPr>
+            <w:r>
+              <w:rPr>
+                <w:rFonts w:asciiTheme="minorHAnsi" w:hAnsiTheme="minorHAnsi" w:cstheme="minorHAnsi"/>
+              </w:rPr>
+              <w:t xml:space="preserve">3 </w:t>
+            </w:r>
+            <w:r>
+              <w:rPr>
+                <w:rFonts w:asciiTheme="minorHAnsi" w:hAnsiTheme="minorHAnsi" w:cstheme="minorHAnsi"/>
+              </w:rPr>
+              <w:t>${</w:t>
+            </w:r>
+            <w:r>
+              <w:rPr>
+                <w:rFonts w:asciiTheme="minorHAnsi" w:eastAsia="Arial" w:hAnsiTheme="minorHAnsi" w:cstheme="minorHAnsi"/>
+                <w:sz w:val="16"/>
+                <w:szCs w:val="16"/>
+              </w:rPr>
+              <w:t>quantity_of_work</w:t>
+            </w:r>
+            <w:r>
+              <w:rPr>
+                <w:rFonts w:asciiTheme="minorHAnsi" w:hAnsiTheme="minorHAnsi" w:cstheme="minorHAnsi"/>
+              </w:rPr>
+              <w:t>_3}</w:t>
             </w:r>
           </w:p>
         </w:tc>
@@ -4137,7 +4589,7 @@
               </w:pBdr>
               <w:spacing w:after="0" w:line="276" w:lineRule="auto"/>
               <w:rPr>
-                <w:rFonts w:ascii="Arial" w:eastAsia="Arial" w:hAnsi="Arial" w:cs="Arial"/>
+                <w:rFonts w:asciiTheme="minorHAnsi" w:eastAsia="Arial" w:hAnsiTheme="minorHAnsi" w:cstheme="minorHAnsi"/>
                 <w:sz w:val="16"/>
                 <w:szCs w:val="16"/>
               </w:rPr>
@@ -4217,18 +4669,36 @@
               <w:spacing w:after="0" w:line="240" w:lineRule="auto"/>
               <w:jc w:val="center"/>
               <w:rPr>
-                <w:rFonts w:ascii="Arial" w:eastAsia="Arial" w:hAnsi="Arial" w:cs="Arial"/>
-                <w:sz w:val="16"/>
-                <w:szCs w:val="16"/>
-              </w:rPr>
-            </w:pPr>
-            <w:r>
-              <w:rPr>
-                <w:rFonts w:ascii="Arial" w:eastAsia="Arial" w:hAnsi="Arial" w:cs="Arial"/>
-                <w:sz w:val="16"/>
-                <w:szCs w:val="16"/>
-              </w:rPr>
-              <w:t>2</w:t>
+                <w:rFonts w:asciiTheme="minorHAnsi" w:eastAsia="Arial" w:hAnsiTheme="minorHAnsi" w:cstheme="minorHAnsi"/>
+                <w:sz w:val="16"/>
+                <w:szCs w:val="16"/>
+              </w:rPr>
+            </w:pPr>
+            <w:r>
+              <w:rPr>
+                <w:rFonts w:asciiTheme="minorHAnsi" w:hAnsiTheme="minorHAnsi" w:cstheme="minorHAnsi"/>
+              </w:rPr>
+              <w:t xml:space="preserve">2 </w:t>
+            </w:r>
+            <w:r>
+              <w:rPr>
+                <w:rFonts w:asciiTheme="minorHAnsi" w:hAnsiTheme="minorHAnsi" w:cstheme="minorHAnsi"/>
+              </w:rPr>
+              <w:t>${</w:t>
+            </w:r>
+            <w:r>
+              <w:rPr>
+                <w:rFonts w:asciiTheme="minorHAnsi" w:eastAsia="Arial" w:hAnsiTheme="minorHAnsi" w:cstheme="minorHAnsi"/>
+                <w:sz w:val="16"/>
+                <w:szCs w:val="16"/>
+              </w:rPr>
+              <w:t>quantity_of_work</w:t>
+            </w:r>
+            <w:r>
+              <w:rPr>
+                <w:rFonts w:asciiTheme="minorHAnsi" w:hAnsiTheme="minorHAnsi" w:cstheme="minorHAnsi"/>
+              </w:rPr>
+              <w:t>_2}</w:t>
             </w:r>
           </w:p>
         </w:tc>
@@ -4254,7 +4724,7 @@
               </w:pBdr>
               <w:spacing w:after="0" w:line="276" w:lineRule="auto"/>
               <w:rPr>
-                <w:rFonts w:ascii="Arial" w:eastAsia="Arial" w:hAnsi="Arial" w:cs="Arial"/>
+                <w:rFonts w:asciiTheme="minorHAnsi" w:eastAsia="Arial" w:hAnsiTheme="minorHAnsi" w:cstheme="minorHAnsi"/>
                 <w:sz w:val="16"/>
                 <w:szCs w:val="16"/>
               </w:rPr>
@@ -4334,18 +4804,36 @@
               <w:spacing w:after="0" w:line="240" w:lineRule="auto"/>
               <w:jc w:val="center"/>
               <w:rPr>
-                <w:rFonts w:ascii="Arial" w:eastAsia="Arial" w:hAnsi="Arial" w:cs="Arial"/>
-                <w:sz w:val="16"/>
-                <w:szCs w:val="16"/>
-              </w:rPr>
-            </w:pPr>
-            <w:r>
-              <w:rPr>
-                <w:rFonts w:ascii="Arial" w:eastAsia="Arial" w:hAnsi="Arial" w:cs="Arial"/>
-                <w:sz w:val="16"/>
-                <w:szCs w:val="16"/>
-              </w:rPr>
-              <w:t>1</w:t>
+                <w:rFonts w:asciiTheme="minorHAnsi" w:eastAsia="Arial" w:hAnsiTheme="minorHAnsi" w:cstheme="minorHAnsi"/>
+                <w:sz w:val="16"/>
+                <w:szCs w:val="16"/>
+              </w:rPr>
+            </w:pPr>
+            <w:r>
+              <w:rPr>
+                <w:rFonts w:asciiTheme="minorHAnsi" w:hAnsiTheme="minorHAnsi" w:cstheme="minorHAnsi"/>
+              </w:rPr>
+              <w:t xml:space="preserve">1 </w:t>
+            </w:r>
+            <w:r>
+              <w:rPr>
+                <w:rFonts w:asciiTheme="minorHAnsi" w:hAnsiTheme="minorHAnsi" w:cstheme="minorHAnsi"/>
+              </w:rPr>
+              <w:t>${</w:t>
+            </w:r>
+            <w:r>
+              <w:rPr>
+                <w:rFonts w:asciiTheme="minorHAnsi" w:eastAsia="Arial" w:hAnsiTheme="minorHAnsi" w:cstheme="minorHAnsi"/>
+                <w:sz w:val="16"/>
+                <w:szCs w:val="16"/>
+              </w:rPr>
+              <w:t>quantity_of_work</w:t>
+            </w:r>
+            <w:r>
+              <w:rPr>
+                <w:rFonts w:asciiTheme="minorHAnsi" w:hAnsiTheme="minorHAnsi" w:cstheme="minorHAnsi"/>
+              </w:rPr>
+              <w:t>_1}</w:t>
             </w:r>
           </w:p>
         </w:tc>
@@ -4371,7 +4859,7 @@
               </w:pBdr>
               <w:spacing w:after="0" w:line="276" w:lineRule="auto"/>
               <w:rPr>
-                <w:rFonts w:ascii="Arial" w:eastAsia="Arial" w:hAnsi="Arial" w:cs="Arial"/>
+                <w:rFonts w:asciiTheme="minorHAnsi" w:eastAsia="Arial" w:hAnsiTheme="minorHAnsi" w:cstheme="minorHAnsi"/>
                 <w:sz w:val="16"/>
                 <w:szCs w:val="16"/>
               </w:rPr>
@@ -4454,18 +4942,36 @@
               <w:spacing w:after="0" w:line="240" w:lineRule="auto"/>
               <w:jc w:val="center"/>
               <w:rPr>
-                <w:rFonts w:ascii="Arial" w:eastAsia="Arial" w:hAnsi="Arial" w:cs="Arial"/>
-                <w:sz w:val="16"/>
-                <w:szCs w:val="16"/>
-              </w:rPr>
-            </w:pPr>
-            <w:r>
-              <w:rPr>
-                <w:rFonts w:ascii="Arial" w:eastAsia="Arial" w:hAnsi="Arial" w:cs="Arial"/>
-                <w:sz w:val="16"/>
-                <w:szCs w:val="16"/>
-              </w:rPr>
-              <w:t>5</w:t>
+                <w:rFonts w:asciiTheme="minorHAnsi" w:eastAsia="Arial" w:hAnsiTheme="minorHAnsi" w:cstheme="minorHAnsi"/>
+                <w:sz w:val="16"/>
+                <w:szCs w:val="16"/>
+              </w:rPr>
+            </w:pPr>
+            <w:r>
+              <w:rPr>
+                <w:rFonts w:asciiTheme="minorHAnsi" w:hAnsiTheme="minorHAnsi" w:cstheme="minorHAnsi"/>
+              </w:rPr>
+              <w:t xml:space="preserve">5 </w:t>
+            </w:r>
+            <w:r>
+              <w:rPr>
+                <w:rFonts w:asciiTheme="minorHAnsi" w:hAnsiTheme="minorHAnsi" w:cstheme="minorHAnsi"/>
+              </w:rPr>
+              <w:t>${</w:t>
+            </w:r>
+            <w:r>
+              <w:rPr>
+                <w:rFonts w:asciiTheme="minorHAnsi" w:eastAsia="Arial" w:hAnsiTheme="minorHAnsi" w:cstheme="minorHAnsi"/>
+                <w:sz w:val="16"/>
+                <w:szCs w:val="16"/>
+              </w:rPr>
+              <w:t>safety_practice</w:t>
+            </w:r>
+            <w:r>
+              <w:rPr>
+                <w:rFonts w:asciiTheme="minorHAnsi" w:hAnsiTheme="minorHAnsi" w:cstheme="minorHAnsi"/>
+              </w:rPr>
+              <w:t>_5}</w:t>
             </w:r>
           </w:p>
         </w:tc>
@@ -4484,11 +4990,19 @@
               <w:spacing w:after="0" w:line="240" w:lineRule="auto"/>
               <w:jc w:val="center"/>
               <w:rPr>
-                <w:rFonts w:ascii="Arial" w:eastAsia="Arial" w:hAnsi="Arial" w:cs="Arial"/>
-                <w:sz w:val="16"/>
-                <w:szCs w:val="16"/>
-              </w:rPr>
-            </w:pPr>
+                <w:rFonts w:asciiTheme="minorHAnsi" w:eastAsia="Arial" w:hAnsiTheme="minorHAnsi" w:cstheme="minorHAnsi"/>
+                <w:sz w:val="16"/>
+                <w:szCs w:val="16"/>
+              </w:rPr>
+            </w:pPr>
+            <w:r>
+              <w:rPr>
+                <w:rFonts w:asciiTheme="minorHAnsi" w:eastAsia="Arial" w:hAnsiTheme="minorHAnsi" w:cstheme="minorHAnsi"/>
+                <w:sz w:val="16"/>
+                <w:szCs w:val="16"/>
+              </w:rPr>
+              <w:t>${safety_practice_remarks}</w:t>
+            </w:r>
           </w:p>
         </w:tc>
       </w:tr>
@@ -4564,18 +5078,36 @@
               <w:spacing w:after="0" w:line="240" w:lineRule="auto"/>
               <w:jc w:val="center"/>
               <w:rPr>
-                <w:rFonts w:ascii="Arial" w:eastAsia="Arial" w:hAnsi="Arial" w:cs="Arial"/>
-                <w:sz w:val="16"/>
-                <w:szCs w:val="16"/>
-              </w:rPr>
-            </w:pPr>
-            <w:r>
-              <w:rPr>
-                <w:rFonts w:ascii="Arial" w:eastAsia="Arial" w:hAnsi="Arial" w:cs="Arial"/>
-                <w:sz w:val="16"/>
-                <w:szCs w:val="16"/>
-              </w:rPr>
-              <w:t>4</w:t>
+                <w:rFonts w:asciiTheme="minorHAnsi" w:eastAsia="Arial" w:hAnsiTheme="minorHAnsi" w:cstheme="minorHAnsi"/>
+                <w:sz w:val="16"/>
+                <w:szCs w:val="16"/>
+              </w:rPr>
+            </w:pPr>
+            <w:r>
+              <w:rPr>
+                <w:rFonts w:asciiTheme="minorHAnsi" w:hAnsiTheme="minorHAnsi" w:cstheme="minorHAnsi"/>
+              </w:rPr>
+              <w:t xml:space="preserve">4 </w:t>
+            </w:r>
+            <w:r>
+              <w:rPr>
+                <w:rFonts w:asciiTheme="minorHAnsi" w:hAnsiTheme="minorHAnsi" w:cstheme="minorHAnsi"/>
+              </w:rPr>
+              <w:t>${</w:t>
+            </w:r>
+            <w:r>
+              <w:rPr>
+                <w:rFonts w:asciiTheme="minorHAnsi" w:eastAsia="Arial" w:hAnsiTheme="minorHAnsi" w:cstheme="minorHAnsi"/>
+                <w:sz w:val="16"/>
+                <w:szCs w:val="16"/>
+              </w:rPr>
+              <w:t>safety_practice</w:t>
+            </w:r>
+            <w:r>
+              <w:rPr>
+                <w:rFonts w:asciiTheme="minorHAnsi" w:hAnsiTheme="minorHAnsi" w:cstheme="minorHAnsi"/>
+              </w:rPr>
+              <w:t>_4}</w:t>
             </w:r>
           </w:p>
         </w:tc>
@@ -4601,7 +5133,7 @@
               </w:pBdr>
               <w:spacing w:after="0" w:line="276" w:lineRule="auto"/>
               <w:rPr>
-                <w:rFonts w:ascii="Arial" w:eastAsia="Arial" w:hAnsi="Arial" w:cs="Arial"/>
+                <w:rFonts w:asciiTheme="minorHAnsi" w:eastAsia="Arial" w:hAnsiTheme="minorHAnsi" w:cstheme="minorHAnsi"/>
                 <w:sz w:val="16"/>
                 <w:szCs w:val="16"/>
               </w:rPr>
@@ -4681,18 +5213,36 @@
               <w:spacing w:after="0" w:line="240" w:lineRule="auto"/>
               <w:jc w:val="center"/>
               <w:rPr>
-                <w:rFonts w:ascii="Arial" w:eastAsia="Arial" w:hAnsi="Arial" w:cs="Arial"/>
-                <w:sz w:val="16"/>
-                <w:szCs w:val="16"/>
-              </w:rPr>
-            </w:pPr>
-            <w:r>
-              <w:rPr>
-                <w:rFonts w:ascii="Arial" w:eastAsia="Arial" w:hAnsi="Arial" w:cs="Arial"/>
-                <w:sz w:val="16"/>
-                <w:szCs w:val="16"/>
-              </w:rPr>
-              <w:t>3</w:t>
+                <w:rFonts w:asciiTheme="minorHAnsi" w:eastAsia="Arial" w:hAnsiTheme="minorHAnsi" w:cstheme="minorHAnsi"/>
+                <w:sz w:val="16"/>
+                <w:szCs w:val="16"/>
+              </w:rPr>
+            </w:pPr>
+            <w:r>
+              <w:rPr>
+                <w:rFonts w:asciiTheme="minorHAnsi" w:hAnsiTheme="minorHAnsi" w:cstheme="minorHAnsi"/>
+              </w:rPr>
+              <w:t xml:space="preserve">3 </w:t>
+            </w:r>
+            <w:r>
+              <w:rPr>
+                <w:rFonts w:asciiTheme="minorHAnsi" w:hAnsiTheme="minorHAnsi" w:cstheme="minorHAnsi"/>
+              </w:rPr>
+              <w:t>${</w:t>
+            </w:r>
+            <w:r>
+              <w:rPr>
+                <w:rFonts w:asciiTheme="minorHAnsi" w:eastAsia="Arial" w:hAnsiTheme="minorHAnsi" w:cstheme="minorHAnsi"/>
+                <w:sz w:val="16"/>
+                <w:szCs w:val="16"/>
+              </w:rPr>
+              <w:t>safety_practice</w:t>
+            </w:r>
+            <w:r>
+              <w:rPr>
+                <w:rFonts w:asciiTheme="minorHAnsi" w:hAnsiTheme="minorHAnsi" w:cstheme="minorHAnsi"/>
+              </w:rPr>
+              <w:t>_3}</w:t>
             </w:r>
           </w:p>
         </w:tc>
@@ -4718,7 +5268,7 @@
               </w:pBdr>
               <w:spacing w:after="0" w:line="276" w:lineRule="auto"/>
               <w:rPr>
-                <w:rFonts w:ascii="Arial" w:eastAsia="Arial" w:hAnsi="Arial" w:cs="Arial"/>
+                <w:rFonts w:asciiTheme="minorHAnsi" w:eastAsia="Arial" w:hAnsiTheme="minorHAnsi" w:cstheme="minorHAnsi"/>
                 <w:sz w:val="16"/>
                 <w:szCs w:val="16"/>
               </w:rPr>
@@ -4798,18 +5348,45 @@
               <w:spacing w:after="0" w:line="240" w:lineRule="auto"/>
               <w:jc w:val="center"/>
               <w:rPr>
-                <w:rFonts w:ascii="Arial" w:eastAsia="Arial" w:hAnsi="Arial" w:cs="Arial"/>
-                <w:sz w:val="16"/>
-                <w:szCs w:val="16"/>
-              </w:rPr>
-            </w:pPr>
-            <w:r>
-              <w:rPr>
-                <w:rFonts w:ascii="Arial" w:eastAsia="Arial" w:hAnsi="Arial" w:cs="Arial"/>
-                <w:sz w:val="16"/>
-                <w:szCs w:val="16"/>
-              </w:rPr>
-              <w:t>2</w:t>
+                <w:rFonts w:asciiTheme="minorHAnsi" w:eastAsia="Arial" w:hAnsiTheme="minorHAnsi" w:cstheme="minorHAnsi"/>
+                <w:sz w:val="16"/>
+                <w:szCs w:val="16"/>
+              </w:rPr>
+            </w:pPr>
+            <w:r>
+              <w:rPr>
+                <w:rFonts w:asciiTheme="minorHAnsi" w:hAnsiTheme="minorHAnsi" w:cstheme="minorHAnsi"/>
+              </w:rPr>
+              <w:t xml:space="preserve">2 </w:t>
+            </w:r>
+            <w:r>
+              <w:rPr>
+                <w:rFonts w:asciiTheme="minorHAnsi" w:hAnsiTheme="minorHAnsi" w:cstheme="minorHAnsi"/>
+              </w:rPr>
+              <w:t>${</w:t>
+            </w:r>
+            <w:r>
+              <w:rPr>
+                <w:rFonts w:asciiTheme="minorHAnsi" w:eastAsia="Arial" w:hAnsiTheme="minorHAnsi" w:cstheme="minorHAnsi"/>
+                <w:sz w:val="16"/>
+                <w:szCs w:val="16"/>
+              </w:rPr>
+              <w:t>safety</w:t>
+            </w:r>
+            <w:r>
+              <w:rPr>
+                <w:rFonts w:asciiTheme="minorHAnsi" w:eastAsia="Arial" w:hAnsiTheme="minorHAnsi" w:cstheme="minorHAnsi"/>
+                <w:sz w:val="16"/>
+                <w:szCs w:val="16"/>
+              </w:rPr>
+              <w:lastRenderedPageBreak/>
+              <w:t>_practice</w:t>
+            </w:r>
+            <w:r>
+              <w:rPr>
+                <w:rFonts w:asciiTheme="minorHAnsi" w:hAnsiTheme="minorHAnsi" w:cstheme="minorHAnsi"/>
+              </w:rPr>
+              <w:t>_2}</w:t>
             </w:r>
           </w:p>
         </w:tc>
@@ -4835,7 +5412,7 @@
               </w:pBdr>
               <w:spacing w:after="0" w:line="276" w:lineRule="auto"/>
               <w:rPr>
-                <w:rFonts w:ascii="Arial" w:eastAsia="Arial" w:hAnsi="Arial" w:cs="Arial"/>
+                <w:rFonts w:asciiTheme="minorHAnsi" w:eastAsia="Arial" w:hAnsiTheme="minorHAnsi" w:cstheme="minorHAnsi"/>
                 <w:sz w:val="16"/>
                 <w:szCs w:val="16"/>
               </w:rPr>
@@ -4915,18 +5492,36 @@
               <w:spacing w:after="0" w:line="240" w:lineRule="auto"/>
               <w:jc w:val="center"/>
               <w:rPr>
-                <w:rFonts w:ascii="Arial" w:eastAsia="Arial" w:hAnsi="Arial" w:cs="Arial"/>
-                <w:sz w:val="16"/>
-                <w:szCs w:val="16"/>
-              </w:rPr>
-            </w:pPr>
-            <w:r>
-              <w:rPr>
-                <w:rFonts w:ascii="Arial" w:eastAsia="Arial" w:hAnsi="Arial" w:cs="Arial"/>
-                <w:sz w:val="16"/>
-                <w:szCs w:val="16"/>
-              </w:rPr>
-              <w:t>1</w:t>
+                <w:rFonts w:asciiTheme="minorHAnsi" w:eastAsia="Arial" w:hAnsiTheme="minorHAnsi" w:cstheme="minorHAnsi"/>
+                <w:sz w:val="16"/>
+                <w:szCs w:val="16"/>
+              </w:rPr>
+            </w:pPr>
+            <w:r>
+              <w:rPr>
+                <w:rFonts w:asciiTheme="minorHAnsi" w:hAnsiTheme="minorHAnsi" w:cstheme="minorHAnsi"/>
+              </w:rPr>
+              <w:t xml:space="preserve">1 </w:t>
+            </w:r>
+            <w:r>
+              <w:rPr>
+                <w:rFonts w:asciiTheme="minorHAnsi" w:hAnsiTheme="minorHAnsi" w:cstheme="minorHAnsi"/>
+              </w:rPr>
+              <w:t>${</w:t>
+            </w:r>
+            <w:r>
+              <w:rPr>
+                <w:rFonts w:asciiTheme="minorHAnsi" w:eastAsia="Arial" w:hAnsiTheme="minorHAnsi" w:cstheme="minorHAnsi"/>
+                <w:sz w:val="16"/>
+                <w:szCs w:val="16"/>
+              </w:rPr>
+              <w:t>safety_practice</w:t>
+            </w:r>
+            <w:r>
+              <w:rPr>
+                <w:rFonts w:asciiTheme="minorHAnsi" w:hAnsiTheme="minorHAnsi" w:cstheme="minorHAnsi"/>
+              </w:rPr>
+              <w:t>_1}</w:t>
             </w:r>
           </w:p>
         </w:tc>
@@ -4952,7 +5547,7 @@
               </w:pBdr>
               <w:spacing w:after="0" w:line="276" w:lineRule="auto"/>
               <w:rPr>
-                <w:rFonts w:ascii="Arial" w:eastAsia="Arial" w:hAnsi="Arial" w:cs="Arial"/>
+                <w:rFonts w:asciiTheme="minorHAnsi" w:eastAsia="Arial" w:hAnsiTheme="minorHAnsi" w:cstheme="minorHAnsi"/>
                 <w:sz w:val="16"/>
                 <w:szCs w:val="16"/>
               </w:rPr>
@@ -5035,18 +5630,36 @@
               <w:spacing w:after="0" w:line="240" w:lineRule="auto"/>
               <w:jc w:val="center"/>
               <w:rPr>
-                <w:rFonts w:ascii="Arial" w:eastAsia="Arial" w:hAnsi="Arial" w:cs="Arial"/>
-                <w:sz w:val="16"/>
-                <w:szCs w:val="16"/>
-              </w:rPr>
-            </w:pPr>
-            <w:r>
-              <w:rPr>
-                <w:rFonts w:ascii="Arial" w:eastAsia="Arial" w:hAnsi="Arial" w:cs="Arial"/>
-                <w:sz w:val="16"/>
-                <w:szCs w:val="16"/>
-              </w:rPr>
-              <w:t>5</w:t>
+                <w:rFonts w:asciiTheme="minorHAnsi" w:eastAsia="Arial" w:hAnsiTheme="minorHAnsi" w:cstheme="minorHAnsi"/>
+                <w:sz w:val="16"/>
+                <w:szCs w:val="16"/>
+              </w:rPr>
+            </w:pPr>
+            <w:r>
+              <w:rPr>
+                <w:rFonts w:asciiTheme="minorHAnsi" w:hAnsiTheme="minorHAnsi" w:cstheme="minorHAnsi"/>
+              </w:rPr>
+              <w:t xml:space="preserve">5 </w:t>
+            </w:r>
+            <w:r>
+              <w:rPr>
+                <w:rFonts w:asciiTheme="minorHAnsi" w:hAnsiTheme="minorHAnsi" w:cstheme="minorHAnsi"/>
+              </w:rPr>
+              <w:t>${</w:t>
+            </w:r>
+            <w:r>
+              <w:rPr>
+                <w:rFonts w:asciiTheme="minorHAnsi" w:eastAsia="Arial" w:hAnsiTheme="minorHAnsi" w:cstheme="minorHAnsi"/>
+                <w:sz w:val="16"/>
+                <w:szCs w:val="16"/>
+              </w:rPr>
+              <w:t>apperance</w:t>
+            </w:r>
+            <w:r>
+              <w:rPr>
+                <w:rFonts w:asciiTheme="minorHAnsi" w:hAnsiTheme="minorHAnsi" w:cstheme="minorHAnsi"/>
+              </w:rPr>
+              <w:t>_5}</w:t>
             </w:r>
           </w:p>
         </w:tc>
@@ -5065,11 +5678,19 @@
               <w:spacing w:after="0" w:line="240" w:lineRule="auto"/>
               <w:jc w:val="center"/>
               <w:rPr>
-                <w:rFonts w:ascii="Arial" w:eastAsia="Arial" w:hAnsi="Arial" w:cs="Arial"/>
-                <w:sz w:val="16"/>
-                <w:szCs w:val="16"/>
-              </w:rPr>
-            </w:pPr>
+                <w:rFonts w:asciiTheme="minorHAnsi" w:eastAsia="Arial" w:hAnsiTheme="minorHAnsi" w:cstheme="minorHAnsi"/>
+                <w:sz w:val="16"/>
+                <w:szCs w:val="16"/>
+              </w:rPr>
+            </w:pPr>
+            <w:r>
+              <w:rPr>
+                <w:rFonts w:asciiTheme="minorHAnsi" w:eastAsia="Arial" w:hAnsiTheme="minorHAnsi" w:cstheme="minorHAnsi"/>
+                <w:sz w:val="16"/>
+                <w:szCs w:val="16"/>
+              </w:rPr>
+              <w:t>${apperance_remarks}</w:t>
+            </w:r>
           </w:p>
         </w:tc>
       </w:tr>
@@ -5145,18 +5766,36 @@
               <w:spacing w:after="0" w:line="240" w:lineRule="auto"/>
               <w:jc w:val="center"/>
               <w:rPr>
-                <w:rFonts w:ascii="Arial" w:eastAsia="Arial" w:hAnsi="Arial" w:cs="Arial"/>
-                <w:sz w:val="16"/>
-                <w:szCs w:val="16"/>
-              </w:rPr>
-            </w:pPr>
-            <w:r>
-              <w:rPr>
-                <w:rFonts w:ascii="Arial" w:eastAsia="Arial" w:hAnsi="Arial" w:cs="Arial"/>
-                <w:sz w:val="16"/>
-                <w:szCs w:val="16"/>
-              </w:rPr>
-              <w:t>4</w:t>
+                <w:rFonts w:asciiTheme="minorHAnsi" w:eastAsia="Arial" w:hAnsiTheme="minorHAnsi" w:cstheme="minorHAnsi"/>
+                <w:sz w:val="16"/>
+                <w:szCs w:val="16"/>
+              </w:rPr>
+            </w:pPr>
+            <w:r>
+              <w:rPr>
+                <w:rFonts w:asciiTheme="minorHAnsi" w:hAnsiTheme="minorHAnsi" w:cstheme="minorHAnsi"/>
+              </w:rPr>
+              <w:t xml:space="preserve">4 </w:t>
+            </w:r>
+            <w:r>
+              <w:rPr>
+                <w:rFonts w:asciiTheme="minorHAnsi" w:hAnsiTheme="minorHAnsi" w:cstheme="minorHAnsi"/>
+              </w:rPr>
+              <w:t>${</w:t>
+            </w:r>
+            <w:r>
+              <w:rPr>
+                <w:rFonts w:asciiTheme="minorHAnsi" w:eastAsia="Arial" w:hAnsiTheme="minorHAnsi" w:cstheme="minorHAnsi"/>
+                <w:sz w:val="16"/>
+                <w:szCs w:val="16"/>
+              </w:rPr>
+              <w:t>apperance</w:t>
+            </w:r>
+            <w:r>
+              <w:rPr>
+                <w:rFonts w:asciiTheme="minorHAnsi" w:hAnsiTheme="minorHAnsi" w:cstheme="minorHAnsi"/>
+              </w:rPr>
+              <w:t>_4}</w:t>
             </w:r>
           </w:p>
         </w:tc>
@@ -5262,18 +5901,36 @@
               <w:spacing w:after="0" w:line="240" w:lineRule="auto"/>
               <w:jc w:val="center"/>
               <w:rPr>
-                <w:rFonts w:ascii="Arial" w:eastAsia="Arial" w:hAnsi="Arial" w:cs="Arial"/>
-                <w:sz w:val="16"/>
-                <w:szCs w:val="16"/>
-              </w:rPr>
-            </w:pPr>
-            <w:r>
-              <w:rPr>
-                <w:rFonts w:ascii="Arial" w:eastAsia="Arial" w:hAnsi="Arial" w:cs="Arial"/>
-                <w:sz w:val="16"/>
-                <w:szCs w:val="16"/>
-              </w:rPr>
-              <w:t>3</w:t>
+                <w:rFonts w:asciiTheme="minorHAnsi" w:eastAsia="Arial" w:hAnsiTheme="minorHAnsi" w:cstheme="minorHAnsi"/>
+                <w:sz w:val="16"/>
+                <w:szCs w:val="16"/>
+              </w:rPr>
+            </w:pPr>
+            <w:r>
+              <w:rPr>
+                <w:rFonts w:asciiTheme="minorHAnsi" w:hAnsiTheme="minorHAnsi" w:cstheme="minorHAnsi"/>
+              </w:rPr>
+              <w:t xml:space="preserve">3 </w:t>
+            </w:r>
+            <w:r>
+              <w:rPr>
+                <w:rFonts w:asciiTheme="minorHAnsi" w:hAnsiTheme="minorHAnsi" w:cstheme="minorHAnsi"/>
+              </w:rPr>
+              <w:t>${</w:t>
+            </w:r>
+            <w:r>
+              <w:rPr>
+                <w:rFonts w:asciiTheme="minorHAnsi" w:eastAsia="Arial" w:hAnsiTheme="minorHAnsi" w:cstheme="minorHAnsi"/>
+                <w:sz w:val="16"/>
+                <w:szCs w:val="16"/>
+              </w:rPr>
+              <w:t>apperance</w:t>
+            </w:r>
+            <w:r>
+              <w:rPr>
+                <w:rFonts w:asciiTheme="minorHAnsi" w:hAnsiTheme="minorHAnsi" w:cstheme="minorHAnsi"/>
+              </w:rPr>
+              <w:t>_3}</w:t>
             </w:r>
           </w:p>
         </w:tc>
@@ -5379,18 +6036,36 @@
               <w:spacing w:after="0" w:line="240" w:lineRule="auto"/>
               <w:jc w:val="center"/>
               <w:rPr>
-                <w:rFonts w:ascii="Arial" w:eastAsia="Arial" w:hAnsi="Arial" w:cs="Arial"/>
-                <w:sz w:val="16"/>
-                <w:szCs w:val="16"/>
-              </w:rPr>
-            </w:pPr>
-            <w:r>
-              <w:rPr>
-                <w:rFonts w:ascii="Arial" w:eastAsia="Arial" w:hAnsi="Arial" w:cs="Arial"/>
-                <w:sz w:val="16"/>
-                <w:szCs w:val="16"/>
-              </w:rPr>
-              <w:t>2</w:t>
+                <w:rFonts w:asciiTheme="minorHAnsi" w:eastAsia="Arial" w:hAnsiTheme="minorHAnsi" w:cstheme="minorHAnsi"/>
+                <w:sz w:val="16"/>
+                <w:szCs w:val="16"/>
+              </w:rPr>
+            </w:pPr>
+            <w:r>
+              <w:rPr>
+                <w:rFonts w:asciiTheme="minorHAnsi" w:hAnsiTheme="minorHAnsi" w:cstheme="minorHAnsi"/>
+              </w:rPr>
+              <w:t xml:space="preserve">2 </w:t>
+            </w:r>
+            <w:r>
+              <w:rPr>
+                <w:rFonts w:asciiTheme="minorHAnsi" w:hAnsiTheme="minorHAnsi" w:cstheme="minorHAnsi"/>
+              </w:rPr>
+              <w:t>${</w:t>
+            </w:r>
+            <w:r>
+              <w:rPr>
+                <w:rFonts w:asciiTheme="minorHAnsi" w:eastAsia="Arial" w:hAnsiTheme="minorHAnsi" w:cstheme="minorHAnsi"/>
+                <w:sz w:val="16"/>
+                <w:szCs w:val="16"/>
+              </w:rPr>
+              <w:t>apperance</w:t>
+            </w:r>
+            <w:r>
+              <w:rPr>
+                <w:rFonts w:asciiTheme="minorHAnsi" w:hAnsiTheme="minorHAnsi" w:cstheme="minorHAnsi"/>
+              </w:rPr>
+              <w:t>_2}</w:t>
             </w:r>
           </w:p>
         </w:tc>
@@ -5502,18 +6177,36 @@
               <w:spacing w:after="0" w:line="240" w:lineRule="auto"/>
               <w:jc w:val="center"/>
               <w:rPr>
-                <w:rFonts w:ascii="Arial" w:eastAsia="Arial" w:hAnsi="Arial" w:cs="Arial"/>
-                <w:sz w:val="16"/>
-                <w:szCs w:val="16"/>
-              </w:rPr>
-            </w:pPr>
-            <w:r>
-              <w:rPr>
-                <w:rFonts w:ascii="Arial" w:eastAsia="Arial" w:hAnsi="Arial" w:cs="Arial"/>
-                <w:sz w:val="16"/>
-                <w:szCs w:val="16"/>
-              </w:rPr>
-              <w:t>1</w:t>
+                <w:rFonts w:asciiTheme="minorHAnsi" w:eastAsia="Arial" w:hAnsiTheme="minorHAnsi" w:cstheme="minorHAnsi"/>
+                <w:sz w:val="16"/>
+                <w:szCs w:val="16"/>
+              </w:rPr>
+            </w:pPr>
+            <w:r>
+              <w:rPr>
+                <w:rFonts w:asciiTheme="minorHAnsi" w:hAnsiTheme="minorHAnsi" w:cstheme="minorHAnsi"/>
+              </w:rPr>
+              <w:t xml:space="preserve">1 </w:t>
+            </w:r>
+            <w:r>
+              <w:rPr>
+                <w:rFonts w:asciiTheme="minorHAnsi" w:hAnsiTheme="minorHAnsi" w:cstheme="minorHAnsi"/>
+              </w:rPr>
+              <w:t>${</w:t>
+            </w:r>
+            <w:r>
+              <w:rPr>
+                <w:rFonts w:asciiTheme="minorHAnsi" w:eastAsia="Arial" w:hAnsiTheme="minorHAnsi" w:cstheme="minorHAnsi"/>
+                <w:sz w:val="16"/>
+                <w:szCs w:val="16"/>
+              </w:rPr>
+              <w:t>apperance</w:t>
+            </w:r>
+            <w:r>
+              <w:rPr>
+                <w:rFonts w:asciiTheme="minorHAnsi" w:hAnsiTheme="minorHAnsi" w:cstheme="minorHAnsi"/>
+              </w:rPr>
+              <w:t>_1}</w:t>
             </w:r>
           </w:p>
         </w:tc>
@@ -5625,6 +6318,14 @@
                 <w:szCs w:val="16"/>
               </w:rPr>
             </w:pPr>
+            <w:r>
+              <w:rPr>
+                <w:rFonts w:ascii="Arial" w:eastAsia="Arial" w:hAnsi="Arial" w:cs="Arial"/>
+                <w:sz w:val="16"/>
+                <w:szCs w:val="16"/>
+              </w:rPr>
+              <w:t>${ojt_grade}</w:t>
+            </w:r>
           </w:p>
         </w:tc>
       </w:tr>
@@ -6134,15 +6835,15 @@
               <mc:AlternateContent>
                 <mc:Choice Requires="wps">
                   <w:drawing>
-                    <wp:anchor distT="0" distB="0" distL="114300" distR="114300" simplePos="0" relativeHeight="251658240" behindDoc="0" locked="0" layoutInCell="1" hidden="0" allowOverlap="1" wp14:anchorId="46B83C63" wp14:editId="2E774D9A">
+                    <wp:anchor distT="0" distB="0" distL="114300" distR="114300" simplePos="0" relativeHeight="251658240" behindDoc="0" locked="0" layoutInCell="1" hidden="0" allowOverlap="1" wp14:anchorId="46B83C63" wp14:editId="7FDEB2A1">
                       <wp:simplePos x="0" y="0"/>
                       <wp:positionH relativeFrom="column">
-                        <wp:posOffset>616585</wp:posOffset>
+                        <wp:posOffset>600075</wp:posOffset>
                       </wp:positionH>
                       <wp:positionV relativeFrom="paragraph">
-                        <wp:posOffset>-408305</wp:posOffset>
+                        <wp:posOffset>-406400</wp:posOffset>
                       </wp:positionV>
-                      <wp:extent cx="2945765" cy="401320"/>
+                      <wp:extent cx="2945765" cy="483870"/>
                       <wp:effectExtent l="0" t="0" r="0" b="0"/>
                       <wp:wrapTopAndBottom distT="0" distB="0"/>
                       <wp:docPr id="24" name="Rectangle 24"/>
@@ -6154,7 +6855,7 @@
                             <wps:spPr>
                               <a:xfrm>
                                 <a:off x="0" y="0"/>
-                                <a:ext cx="2945765" cy="401320"/>
+                                <a:ext cx="2945765" cy="483870"/>
                               </a:xfrm>
                               <a:prstGeom prst="rect">
                                 <a:avLst/>
@@ -6172,6 +6873,9 @@
                                     <w:ind w:right="-126"/>
                                     <w:jc w:val="center"/>
                                     <w:textDirection w:val="btLr"/>
+                                    <w:rPr>
+                                      <w:u w:val="single"/>
+                                    </w:rPr>
                                   </w:pPr>
                                   <w:r>
                                     <w:rPr>
@@ -6180,7 +6884,27 @@
                                       <w:color w:val="000000"/>
                                       <w:sz w:val="16"/>
                                     </w:rPr>
-                                    <w:t>___________________________________</w:t>
+                                    <w:t>______________</w:t>
+                                  </w:r>
+                                  <w:r>
+                                    <w:rPr>
+                                      <w:rFonts w:ascii="Arial" w:eastAsia="Arial" w:hAnsi="Arial" w:cs="Arial"/>
+                                      <w:i/>
+                                      <w:color w:val="000000"/>
+                                      <w:sz w:val="16"/>
+                                      <w:u w:val="single"/>
+                                    </w:rPr>
+                                    <w:t xml:space="preserve">          </w:t>
+                                  </w:r>
+                                  <w:r>
+                                    <w:rPr>
+                                      <w:rFonts w:ascii="Arial" w:eastAsia="Arial" w:hAnsi="Arial" w:cs="Arial"/>
+                                      <w:i/>
+                                      <w:color w:val="000000"/>
+                                      <w:sz w:val="16"/>
+                                      <w:u w:val="single"/>
+                                    </w:rPr>
+                                    <w:t>_________________</w:t>
                                   </w:r>
                                 </w:p>
                                 <w:p>
@@ -6219,7 +6943,7 @@
                 </mc:Choice>
                 <mc:Fallback>
                   <w:pict>
-                    <v:rect w14:anchorId="46B83C63" id="Rectangle 24" o:spid="_x0000_s1026" style="position:absolute;left:0;text-align:left;margin-left:48.55pt;margin-top:-32.15pt;width:231.95pt;height:31.6pt;z-index:251658240;visibility:visible;mso-wrap-style:square;mso-width-percent:0;mso-height-percent:0;mso-wrap-distance-left:9pt;mso-wrap-distance-top:0;mso-wrap-distance-right:9pt;mso-wrap-distance-bottom:0;mso-position-horizontal:absolute;mso-position-horizontal-relative:text;mso-position-vertical:absolute;mso-position-vertical-relative:text;mso-width-percent:0;mso-height-percent:0;mso-width-relative:margin;mso-height-relative:margin;v-text-anchor:top" o:gfxdata="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" filled="f" stroked="f">
+                    <v:rect w14:anchorId="46B83C63" id="Rectangle 24" o:spid="_x0000_s1026" style="position:absolute;left:0;text-align:left;margin-left:47.25pt;margin-top:-32pt;width:231.95pt;height:38.1pt;z-index:251658240;visibility:visible;mso-wrap-style:square;mso-width-percent:0;mso-height-percent:0;mso-wrap-distance-left:9pt;mso-wrap-distance-top:0;mso-wrap-distance-right:9pt;mso-wrap-distance-bottom:0;mso-position-horizontal:absolute;mso-position-horizontal-relative:text;mso-position-vertical:absolute;mso-position-vertical-relative:text;mso-width-percent:0;mso-height-percent:0;mso-width-relative:margin;mso-height-relative:margin;v-text-anchor:top" o:gfxdata="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" filled="f" stroked="f">
                       <v:textbox inset="2.53958mm,1.2694mm,2.53958mm,1.2694mm">
                         <w:txbxContent>
                           <w:p>
@@ -6228,6 +6952,9 @@
                               <w:ind w:right="-126"/>
                               <w:jc w:val="center"/>
                               <w:textDirection w:val="btLr"/>
+                              <w:rPr>
+                                <w:u w:val="single"/>
+                              </w:rPr>
                             </w:pPr>
                             <w:r>
                               <w:rPr>
@@ -6236,7 +6963,27 @@
                                 <w:color w:val="000000"/>
                                 <w:sz w:val="16"/>
                               </w:rPr>
-                              <w:t>___________________________________</w:t>
+                              <w:t>______________</w:t>
+                            </w:r>
+                            <w:r>
+                              <w:rPr>
+                                <w:rFonts w:ascii="Arial" w:eastAsia="Arial" w:hAnsi="Arial" w:cs="Arial"/>
+                                <w:i/>
+                                <w:color w:val="000000"/>
+                                <w:sz w:val="16"/>
+                                <w:u w:val="single"/>
+                              </w:rPr>
+                              <w:t xml:space="preserve">          </w:t>
+                            </w:r>
+                            <w:r>
+                              <w:rPr>
+                                <w:rFonts w:ascii="Arial" w:eastAsia="Arial" w:hAnsi="Arial" w:cs="Arial"/>
+                                <w:i/>
+                                <w:color w:val="000000"/>
+                                <w:sz w:val="16"/>
+                                <w:u w:val="single"/>
+                              </w:rPr>
+                              <w:t>_________________</w:t>
                             </w:r>
                           </w:p>
                           <w:p>
@@ -6328,16 +7075,16 @@
               <mc:AlternateContent>
                 <mc:Choice Requires="wps">
                   <w:drawing>
-                    <wp:anchor distT="0" distB="0" distL="114300" distR="114300" simplePos="0" relativeHeight="251659264" behindDoc="0" locked="0" layoutInCell="1" hidden="0" allowOverlap="1" wp14:anchorId="60918F36" wp14:editId="50CFCD0A">
+                    <wp:anchor distT="0" distB="0" distL="114300" distR="114300" simplePos="0" relativeHeight="251659264" behindDoc="0" locked="0" layoutInCell="1" hidden="0" allowOverlap="1" wp14:anchorId="60918F36" wp14:editId="5AEABFA8">
                       <wp:simplePos x="0" y="0"/>
                       <wp:positionH relativeFrom="column">
-                        <wp:posOffset>610235</wp:posOffset>
+                        <wp:posOffset>615950</wp:posOffset>
                       </wp:positionH>
                       <wp:positionV relativeFrom="paragraph">
-                        <wp:posOffset>-398780</wp:posOffset>
+                        <wp:posOffset>-405130</wp:posOffset>
                       </wp:positionV>
-                      <wp:extent cx="2184400" cy="399415"/>
-                      <wp:effectExtent l="0" t="0" r="0" b="635"/>
+                      <wp:extent cx="2184400" cy="404495"/>
+                      <wp:effectExtent l="0" t="0" r="0" b="0"/>
                       <wp:wrapTopAndBottom distT="0" distB="0"/>
                       <wp:docPr id="22" name="Rectangle 22"/>
                       <wp:cNvGraphicFramePr/>
@@ -6348,7 +7095,7 @@
                             <wps:spPr>
                               <a:xfrm>
                                 <a:off x="0" y="0"/>
-                                <a:ext cx="2184400" cy="399415"/>
+                                <a:ext cx="2184400" cy="404495"/>
                               </a:xfrm>
                               <a:prstGeom prst="rect">
                                 <a:avLst/>
@@ -6374,7 +7121,26 @@
                                       <w:color w:val="000000"/>
                                       <w:sz w:val="16"/>
                                     </w:rPr>
-                                    <w:t>___________________________________</w:t>
+                                    <w:t>_____________</w:t>
+                                  </w:r>
+                                  <w:r>
+                                    <w:rPr>
+                                      <w:rFonts w:ascii="Arial" w:eastAsia="Arial" w:hAnsi="Arial" w:cs="Arial"/>
+                                      <w:i/>
+                                      <w:color w:val="000000"/>
+                                      <w:sz w:val="16"/>
+                                      <w:u w:val="single"/>
+                                    </w:rPr>
+                                    <w:t>${student_name}</w:t>
+                                  </w:r>
+                                  <w:r>
+                                    <w:rPr>
+                                      <w:rFonts w:ascii="Arial" w:eastAsia="Arial" w:hAnsi="Arial" w:cs="Arial"/>
+                                      <w:i/>
+                                      <w:color w:val="000000"/>
+                                      <w:sz w:val="16"/>
+                                    </w:rPr>
+                                    <w:t>_________</w:t>
                                   </w:r>
                                 </w:p>
                                 <w:p>
@@ -6413,7 +7179,7 @@
                 </mc:Choice>
                 <mc:Fallback>
                   <w:pict>
-                    <v:rect w14:anchorId="60918F36" id="Rectangle 22" o:spid="_x0000_s1027" style="position:absolute;left:0;text-align:left;margin-left:48.05pt;margin-top:-31.4pt;width:172pt;height:31.45pt;z-index:251659264;visibility:visible;mso-wrap-style:square;mso-width-percent:0;mso-height-percent:0;mso-wrap-distance-left:9pt;mso-wrap-distance-top:0;mso-wrap-distance-right:9pt;mso-wrap-distance-bottom:0;mso-position-horizontal:absolute;mso-position-horizontal-relative:text;mso-position-vertical:absolute;mso-position-vertical-relative:text;mso-width-percent:0;mso-height-percent:0;mso-width-relative:margin;mso-height-relative:margin;v-text-anchor:top" o:gfxdata="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" filled="f" stroked="f">
+                    <v:rect w14:anchorId="60918F36" id="Rectangle 22" o:spid="_x0000_s1027" style="position:absolute;left:0;text-align:left;margin-left:48.5pt;margin-top:-31.9pt;width:172pt;height:31.85pt;z-index:251659264;visibility:visible;mso-wrap-style:square;mso-width-percent:0;mso-height-percent:0;mso-wrap-distance-left:9pt;mso-wrap-distance-top:0;mso-wrap-distance-right:9pt;mso-wrap-distance-bottom:0;mso-position-horizontal:absolute;mso-position-horizontal-relative:text;mso-position-vertical:absolute;mso-position-vertical-relative:text;mso-width-percent:0;mso-height-percent:0;mso-width-relative:margin;mso-height-relative:margin;v-text-anchor:top" o:gfxdata="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" filled="f" stroked="f">
                       <v:textbox inset="2.53958mm,1.2694mm,2.53958mm,1.2694mm">
                         <w:txbxContent>
                           <w:p>
@@ -6430,7 +7196,26 @@
                                 <w:color w:val="000000"/>
                                 <w:sz w:val="16"/>
                               </w:rPr>
-                              <w:t>___________________________________</w:t>
+                              <w:t>_____________</w:t>
+                            </w:r>
+                            <w:r>
+                              <w:rPr>
+                                <w:rFonts w:ascii="Arial" w:eastAsia="Arial" w:hAnsi="Arial" w:cs="Arial"/>
+                                <w:i/>
+                                <w:color w:val="000000"/>
+                                <w:sz w:val="16"/>
+                                <w:u w:val="single"/>
+                              </w:rPr>
+                              <w:t>${student_name}</w:t>
+                            </w:r>
+                            <w:r>
+                              <w:rPr>
+                                <w:rFonts w:ascii="Arial" w:eastAsia="Arial" w:hAnsi="Arial" w:cs="Arial"/>
+                                <w:i/>
+                                <w:color w:val="000000"/>
+                                <w:sz w:val="16"/>
+                              </w:rPr>
+                              <w:t>_________</w:t>
                             </w:r>
                           </w:p>
                           <w:p>
@@ -6494,7 +7279,7 @@
       </w:tr>
       <w:tr>
         <w:trPr>
-          <w:trHeight w:val="1488"/>
+          <w:trHeight w:val="2039"/>
           <w:jc w:val="center"/>
         </w:trPr>
         <w:tc>
@@ -6526,17 +7311,17 @@
                 <w:noProof/>
               </w:rPr>
               <mc:AlternateContent>
-                <mc:Choice Requires="wpg">
+                <mc:Choice Requires="wps">
                   <w:drawing>
-                    <wp:anchor distT="0" distB="0" distL="114300" distR="114300" simplePos="0" relativeHeight="251660288" behindDoc="0" locked="0" layoutInCell="1" hidden="0" allowOverlap="1" wp14:anchorId="09F7102D" wp14:editId="6634445E">
+                    <wp:anchor distT="0" distB="0" distL="114300" distR="114300" simplePos="0" relativeHeight="251660288" behindDoc="0" locked="0" layoutInCell="1" hidden="0" allowOverlap="1" wp14:anchorId="09F7102D" wp14:editId="127EA057">
                       <wp:simplePos x="0" y="0"/>
                       <wp:positionH relativeFrom="column">
-                        <wp:posOffset>2349500</wp:posOffset>
+                        <wp:posOffset>2350135</wp:posOffset>
                       </wp:positionH>
                       <wp:positionV relativeFrom="paragraph">
-                        <wp:posOffset>0</wp:posOffset>
+                        <wp:posOffset>-744220</wp:posOffset>
                       </wp:positionV>
-                      <wp:extent cx="2193925" cy="741045"/>
+                      <wp:extent cx="2193925" cy="895350"/>
                       <wp:effectExtent l="0" t="0" r="0" b="0"/>
                       <wp:wrapTopAndBottom distT="0" distB="0"/>
                       <wp:docPr id="23" name="Rectangle 23"/>
@@ -6547,8 +7332,8 @@
                             <wps:cNvSpPr/>
                             <wps:spPr>
                               <a:xfrm>
-                                <a:off x="4253800" y="3414240"/>
-                                <a:ext cx="2184400" cy="731520"/>
+                                <a:off x="0" y="0"/>
+                                <a:ext cx="2193925" cy="895350"/>
                               </a:xfrm>
                               <a:prstGeom prst="rect">
                                 <a:avLst/>
@@ -6590,14 +7375,9 @@
                                     <w:ind w:right="-126"/>
                                     <w:jc w:val="center"/>
                                     <w:textDirection w:val="btLr"/>
-                                  </w:pPr>
-                                </w:p>
-                                <w:p>
-                                  <w:pPr>
-                                    <w:spacing w:after="0" w:line="240" w:lineRule="auto"/>
-                                    <w:ind w:right="-126"/>
-                                    <w:jc w:val="center"/>
-                                    <w:textDirection w:val="btLr"/>
+                                    <w:rPr>
+                                      <w:u w:val="single"/>
+                                    </w:rPr>
                                   </w:pPr>
                                   <w:r>
                                     <w:rPr>
@@ -6606,7 +7386,37 @@
                                       <w:color w:val="000000"/>
                                       <w:sz w:val="16"/>
                                     </w:rPr>
-                                    <w:t>___________________________________</w:t>
+                                    <w:t>________</w:t>
+                                  </w:r>
+                                  <w:r>
+                                    <w:rPr>
+                                      <w:rFonts w:ascii="Arial" w:eastAsia="Arial" w:hAnsi="Arial" w:cs="Arial"/>
+                                      <w:i/>
+                                      <w:color w:val="000000"/>
+                                      <w:sz w:val="16"/>
+                                      <w:u w:val="single"/>
+                                    </w:rPr>
+                                    <w:t>${supervisor</w:t>
+                                  </w:r>
+                                  <w:r>
+                                    <w:rPr>
+                                      <w:rFonts w:ascii="Arial" w:eastAsia="Arial" w:hAnsi="Arial" w:cs="Arial"/>
+                                      <w:i/>
+                                      <w:color w:val="000000"/>
+                                      <w:sz w:val="16"/>
+                                      <w:u w:val="single"/>
+                                    </w:rPr>
+                                    <w:t>_</w:t>
+                                  </w:r>
+                                  <w:r>
+                                    <w:rPr>
+                                      <w:rFonts w:ascii="Arial" w:eastAsia="Arial" w:hAnsi="Arial" w:cs="Arial"/>
+                                      <w:i/>
+                                      <w:color w:val="000000"/>
+                                      <w:sz w:val="16"/>
+                                      <w:u w:val="single"/>
+                                    </w:rPr>
+                                    <w:t>name}_______</w:t>
                                   </w:r>
                                 </w:p>
                                 <w:p>
@@ -6634,50 +7444,116 @@
                           </wps:wsp>
                         </a:graphicData>
                       </a:graphic>
+                      <wp14:sizeRelH relativeFrom="margin">
+                        <wp14:pctWidth>0</wp14:pctWidth>
+                      </wp14:sizeRelH>
+                      <wp14:sizeRelV relativeFrom="margin">
+                        <wp14:pctHeight>0</wp14:pctHeight>
+                      </wp14:sizeRelV>
                     </wp:anchor>
                   </w:drawing>
                 </mc:Choice>
-                <mc:Fallback xmlns:cr="http://schemas.microsoft.com/office/comments/2020/reactions" xmlns="http://schemas.microsoft.com/office/tasks/2019/documenttasks" xmlns:dgm="http://schemas.openxmlformats.org/drawingml/2006/diagram" xmlns:lc="http://schemas.openxmlformats.org/drawingml/2006/lockedCanvas" xmlns:c="http://schemas.openxmlformats.org/drawingml/2006/chart" xmlns:pic="http://schemas.openxmlformats.org/drawingml/2006/picture" xmlns:a="http://schemas.openxmlformats.org/drawingml/2006/main" xmlns:sl="http://schemas.openxmlformats.org/schemaLibrary/2006/main">
-                  <w:drawing>
-                    <wp:anchor allowOverlap="1" behindDoc="0" distB="0" distT="0" distL="114300" distR="114300" hidden="0" layoutInCell="1" locked="0" relativeHeight="0" simplePos="0">
-                      <wp:simplePos x="0" y="0"/>
-                      <wp:positionH relativeFrom="column">
-                        <wp:posOffset>2349500</wp:posOffset>
-                      </wp:positionH>
-                      <wp:positionV relativeFrom="paragraph">
-                        <wp:posOffset>0</wp:posOffset>
-                      </wp:positionV>
-                      <wp:extent cx="2193925" cy="741045"/>
-                      <wp:effectExtent b="0" l="0" r="0" t="0"/>
-                      <wp:wrapTopAndBottom distB="0" distT="0"/>
-                      <wp:docPr id="23" name="image3.png"/>
-                      <a:graphic>
-                        <a:graphicData uri="http://schemas.openxmlformats.org/drawingml/2006/picture">
-                          <pic:pic>
-                            <pic:nvPicPr>
-                              <pic:cNvPr id="0" name="image3.png"/>
-                              <pic:cNvPicPr preferRelativeResize="0"/>
-                            </pic:nvPicPr>
-                            <pic:blipFill>
-                              <a:blip r:embed="rId8"/>
-                              <a:srcRect/>
-                              <a:stretch>
-                                <a:fillRect/>
-                              </a:stretch>
-                            </pic:blipFill>
-                            <pic:spPr>
-                              <a:xfrm>
-                                <a:off x="0" y="0"/>
-                                <a:ext cx="2193925" cy="741045"/>
-                              </a:xfrm>
-                              <a:prstGeom prst="rect"/>
-                              <a:ln/>
-                            </pic:spPr>
-                          </pic:pic>
-                        </a:graphicData>
-                      </a:graphic>
-                    </wp:anchor>
-                  </w:drawing>
+                <mc:Fallback>
+                  <w:pict>
+                    <v:rect w14:anchorId="09F7102D" id="Rectangle 23" o:spid="_x0000_s1028" style="position:absolute;left:0;text-align:left;margin-left:185.05pt;margin-top:-58.6pt;width:172.75pt;height:70.5pt;z-index:251660288;visibility:visible;mso-wrap-style:square;mso-width-percent:0;mso-height-percent:0;mso-wrap-distance-left:9pt;mso-wrap-distance-top:0;mso-wrap-distance-right:9pt;mso-wrap-distance-bottom:0;mso-position-horizontal:absolute;mso-position-horizontal-relative:text;mso-position-vertical:absolute;mso-position-vertical-relative:text;mso-width-percent:0;mso-height-percent:0;mso-width-relative:margin;mso-height-relative:margin;v-text-anchor:top" o:gfxdata="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" filled="f" stroked="f">
+                      <v:textbox inset="2.53958mm,1.2694mm,2.53958mm,1.2694mm">
+                        <w:txbxContent>
+                          <w:p>
+                            <w:pPr>
+                              <w:spacing w:after="0" w:line="240" w:lineRule="auto"/>
+                              <w:ind w:right="-126"/>
+                              <w:textDirection w:val="btLr"/>
+                            </w:pPr>
+                            <w:r>
+                              <w:rPr>
+                                <w:rFonts w:ascii="Arial" w:eastAsia="Arial" w:hAnsi="Arial" w:cs="Arial"/>
+                                <w:b/>
+                                <w:color w:val="000000"/>
+                                <w:sz w:val="16"/>
+                              </w:rPr>
+                              <w:t>APPROVED:</w:t>
+                            </w:r>
+                          </w:p>
+                          <w:p>
+                            <w:pPr>
+                              <w:spacing w:after="0" w:line="240" w:lineRule="auto"/>
+                              <w:ind w:right="-126"/>
+                              <w:jc w:val="center"/>
+                              <w:textDirection w:val="btLr"/>
+                            </w:pPr>
+                          </w:p>
+                          <w:p>
+                            <w:pPr>
+                              <w:spacing w:after="0" w:line="240" w:lineRule="auto"/>
+                              <w:ind w:right="-126"/>
+                              <w:jc w:val="center"/>
+                              <w:textDirection w:val="btLr"/>
+                              <w:rPr>
+                                <w:u w:val="single"/>
+                              </w:rPr>
+                            </w:pPr>
+                            <w:r>
+                              <w:rPr>
+                                <w:rFonts w:ascii="Arial" w:eastAsia="Arial" w:hAnsi="Arial" w:cs="Arial"/>
+                                <w:i/>
+                                <w:color w:val="000000"/>
+                                <w:sz w:val="16"/>
+                              </w:rPr>
+                              <w:t>________</w:t>
+                            </w:r>
+                            <w:r>
+                              <w:rPr>
+                                <w:rFonts w:ascii="Arial" w:eastAsia="Arial" w:hAnsi="Arial" w:cs="Arial"/>
+                                <w:i/>
+                                <w:color w:val="000000"/>
+                                <w:sz w:val="16"/>
+                                <w:u w:val="single"/>
+                              </w:rPr>
+                              <w:t>${supervisor</w:t>
+                            </w:r>
+                            <w:r>
+                              <w:rPr>
+                                <w:rFonts w:ascii="Arial" w:eastAsia="Arial" w:hAnsi="Arial" w:cs="Arial"/>
+                                <w:i/>
+                                <w:color w:val="000000"/>
+                                <w:sz w:val="16"/>
+                                <w:u w:val="single"/>
+                              </w:rPr>
+                              <w:t>_</w:t>
+                            </w:r>
+                            <w:r>
+                              <w:rPr>
+                                <w:rFonts w:ascii="Arial" w:eastAsia="Arial" w:hAnsi="Arial" w:cs="Arial"/>
+                                <w:i/>
+                                <w:color w:val="000000"/>
+                                <w:sz w:val="16"/>
+                                <w:u w:val="single"/>
+                              </w:rPr>
+                              <w:t>name}_______</w:t>
+                            </w:r>
+                          </w:p>
+                          <w:p>
+                            <w:pPr>
+                              <w:spacing w:after="0" w:line="240" w:lineRule="auto"/>
+                              <w:ind w:right="-126"/>
+                              <w:jc w:val="center"/>
+                              <w:textDirection w:val="btLr"/>
+                            </w:pPr>
+                            <w:r>
+                              <w:rPr>
+                                <w:rFonts w:ascii="Arial" w:eastAsia="Arial" w:hAnsi="Arial" w:cs="Arial"/>
+                                <w:i/>
+                                <w:color w:val="000000"/>
+                                <w:sz w:val="16"/>
+                              </w:rPr>
+                              <w:t>Training Supervisor</w:t>
+                            </w:r>
+                          </w:p>
+                        </w:txbxContent>
+                      </v:textbox>
+                      <w10:wrap type="topAndBottom"/>
+                    </v:rect>
+                  </w:pict>
                 </mc:Fallback>
               </mc:AlternateContent>
             </w:r>
@@ -6687,7 +7563,7 @@
     </w:tbl>
     <w:p/>
     <w:sectPr>
-      <w:headerReference w:type="default" r:id="rId9"/>
+      <w:headerReference w:type="default" r:id="rId8"/>
       <w:pgSz w:w="12240" w:h="15840"/>
       <w:pgMar w:top="720" w:right="720" w:bottom="720" w:left="720" w:header="432" w:footer="432" w:gutter="0"/>
       <w:pgNumType w:start="1"/>
@@ -7255,6 +8131,7 @@
   <w:style w:type="paragraph" w:default="1" w:styleId="Normal">
     <w:name w:val="Normal"/>
     <w:qFormat/>
+    <w:rsid w:val="00491851"/>
   </w:style>
   <w:style w:type="paragraph" w:styleId="Heading1">
     <w:name w:val="heading 1"/>

</xml_diff>

<commit_message>
Enhance student management and document handling features
- Implemented document preview functionality in CoordinatorStudentManagement, allowing users to view PDFs and images directly within the interface.
- Added logic to fetch pending company applications for students, improving visibility into application statuses.
- Enhanced notification handling in DashboardCoordinator and DashboardInstructor to navigate to student messages based on notifications.
- Updated various components to improve UI consistency and user experience, including adjustments to button styles and layout in multiple areas.
</commit_message>
<xml_diff>
--- a/server/src/templates/11 INTERNSHIP EVALUATION FORM_2024.docx
+++ b/server/src/templates/11 INTERNSHIP EVALUATION FORM_2024.docx
@@ -33,6 +33,10 @@
           <w:insideV w:val="single" w:sz="4" w:space="0" w:color="000000"/>
         </w:tblBorders>
         <w:tblLayout w:type="fixed"/>
+        <w:tblCellMar>
+          <w:top w:w="85" w:type="dxa"/>
+          <w:bottom w:w="85" w:type="dxa"/>
+        </w:tblCellMar>
         <w:tblLook w:val="0400" w:firstRow="0" w:lastRow="0" w:firstColumn="0" w:lastColumn="0" w:noHBand="0" w:noVBand="1"/>
       </w:tblPr>
       <w:tblGrid>
@@ -803,15 +807,15 @@
               <w:spacing w:after="0" w:line="240" w:lineRule="auto"/>
               <w:rPr>
                 <w:rFonts w:ascii="Arial" w:eastAsia="Arial" w:hAnsi="Arial" w:cs="Arial"/>
-                <w:sz w:val="16"/>
-                <w:szCs w:val="16"/>
-              </w:rPr>
-            </w:pPr>
-            <w:r>
-              <w:rPr>
-                <w:rFonts w:ascii="Arial" w:eastAsia="Arial" w:hAnsi="Arial" w:cs="Arial"/>
-                <w:sz w:val="16"/>
-                <w:szCs w:val="16"/>
+                <w:sz w:val="20"/>
+                <w:szCs w:val="20"/>
+              </w:rPr>
+            </w:pPr>
+            <w:r>
+              <w:rPr>
+                <w:rFonts w:ascii="Arial" w:eastAsia="Arial" w:hAnsi="Arial" w:cs="Arial"/>
+                <w:sz w:val="20"/>
+                <w:szCs w:val="20"/>
               </w:rPr>
               <w:t>Grasps new ideas quickly, can readily apply knowledge to new situations, flexible problem solver</w:t>
             </w:r>
@@ -829,20 +833,18 @@
               <w:jc w:val="center"/>
               <w:rPr>
                 <w:rFonts w:ascii="Arial" w:eastAsia="Arial" w:hAnsi="Arial" w:cs="Arial"/>
+                <w:sz w:val="20"/>
+                <w:szCs w:val="20"/>
                 <w:highlight w:val="lightGray"/>
               </w:rPr>
             </w:pPr>
             <w:r>
-              <w:t xml:space="preserve">5 </w:t>
-            </w:r>
-            <w:r>
-              <w:t>${ability_to_learn_</w:t>
-            </w:r>
-            <w:r>
-              <w:t>5</w:t>
-            </w:r>
-            <w:r>
-              <w:t>}</w:t>
+              <w:rPr>
+                <w:rFonts w:ascii="Arial" w:hAnsi="Arial" w:cs="Arial"/>
+                <w:sz w:val="20"/>
+                <w:szCs w:val="20"/>
+              </w:rPr>
+              <w:t>5 [ ${ability_to_learn_5} ]</w:t>
             </w:r>
           </w:p>
         </w:tc>
@@ -867,6 +869,11 @@
               </w:rPr>
             </w:pPr>
             <w:r>
+              <w:rPr>
+                <w:rFonts w:ascii="Arial" w:hAnsi="Arial" w:cs="Arial"/>
+                <w:sz w:val="16"/>
+                <w:szCs w:val="16"/>
+              </w:rPr>
               <w:t>${ability_to_learn_remarks}</w:t>
             </w:r>
           </w:p>
@@ -919,15 +926,15 @@
               <w:spacing w:after="0" w:line="240" w:lineRule="auto"/>
               <w:rPr>
                 <w:rFonts w:ascii="Arial" w:eastAsia="Arial" w:hAnsi="Arial" w:cs="Arial"/>
-                <w:sz w:val="16"/>
-                <w:szCs w:val="16"/>
-              </w:rPr>
-            </w:pPr>
-            <w:r>
-              <w:rPr>
-                <w:rFonts w:ascii="Arial" w:eastAsia="Arial" w:hAnsi="Arial" w:cs="Arial"/>
-                <w:sz w:val="16"/>
-                <w:szCs w:val="16"/>
+                <w:sz w:val="20"/>
+                <w:szCs w:val="20"/>
+              </w:rPr>
+            </w:pPr>
+            <w:r>
+              <w:rPr>
+                <w:rFonts w:ascii="Arial" w:eastAsia="Arial" w:hAnsi="Arial" w:cs="Arial"/>
+                <w:sz w:val="20"/>
+                <w:szCs w:val="20"/>
               </w:rPr>
               <w:t>Learns quickly, applies past experiences</w:t>
             </w:r>
@@ -945,19 +952,17 @@
               <w:jc w:val="center"/>
               <w:rPr>
                 <w:rFonts w:ascii="Arial" w:eastAsia="Arial" w:hAnsi="Arial" w:cs="Arial"/>
-              </w:rPr>
-            </w:pPr>
-            <w:r>
-              <w:t xml:space="preserve">4 </w:t>
-            </w:r>
-            <w:r>
-              <w:t>${ability_to_learn_</w:t>
-            </w:r>
-            <w:r>
-              <w:t>4</w:t>
-            </w:r>
-            <w:r>
-              <w:t>}</w:t>
+                <w:sz w:val="20"/>
+                <w:szCs w:val="20"/>
+              </w:rPr>
+            </w:pPr>
+            <w:r>
+              <w:rPr>
+                <w:rFonts w:ascii="Arial" w:hAnsi="Arial" w:cs="Arial"/>
+                <w:sz w:val="20"/>
+                <w:szCs w:val="20"/>
+              </w:rPr>
+              <w:t>4 [ ${ability_to_learn_4} ]</w:t>
             </w:r>
           </w:p>
         </w:tc>
@@ -1038,15 +1043,15 @@
               <w:spacing w:after="0" w:line="240" w:lineRule="auto"/>
               <w:rPr>
                 <w:rFonts w:ascii="Arial" w:eastAsia="Arial" w:hAnsi="Arial" w:cs="Arial"/>
-                <w:sz w:val="16"/>
-                <w:szCs w:val="16"/>
-              </w:rPr>
-            </w:pPr>
-            <w:r>
-              <w:rPr>
-                <w:rFonts w:ascii="Arial" w:eastAsia="Arial" w:hAnsi="Arial" w:cs="Arial"/>
-                <w:sz w:val="16"/>
-                <w:szCs w:val="16"/>
+                <w:sz w:val="20"/>
+                <w:szCs w:val="20"/>
+              </w:rPr>
+            </w:pPr>
+            <w:r>
+              <w:rPr>
+                <w:rFonts w:ascii="Arial" w:eastAsia="Arial" w:hAnsi="Arial" w:cs="Arial"/>
+                <w:sz w:val="20"/>
+                <w:szCs w:val="20"/>
               </w:rPr>
               <w:t>Usually understands instructions; usually has good judgment and reasoning</w:t>
             </w:r>
@@ -1064,19 +1069,17 @@
               <w:jc w:val="center"/>
               <w:rPr>
                 <w:rFonts w:ascii="Arial" w:eastAsia="Arial" w:hAnsi="Arial" w:cs="Arial"/>
-              </w:rPr>
-            </w:pPr>
-            <w:r>
-              <w:t xml:space="preserve">3 </w:t>
-            </w:r>
-            <w:r>
-              <w:t>${ability_to_learn_</w:t>
-            </w:r>
-            <w:r>
-              <w:t>3</w:t>
-            </w:r>
-            <w:r>
-              <w:t>}</w:t>
+                <w:sz w:val="20"/>
+                <w:szCs w:val="20"/>
+              </w:rPr>
+            </w:pPr>
+            <w:r>
+              <w:rPr>
+                <w:rFonts w:ascii="Arial" w:hAnsi="Arial" w:cs="Arial"/>
+                <w:sz w:val="20"/>
+                <w:szCs w:val="20"/>
+              </w:rPr>
+              <w:t>3 [ ${ability_to_learn_3} ]</w:t>
             </w:r>
           </w:p>
         </w:tc>
@@ -1157,15 +1160,15 @@
               <w:spacing w:after="0" w:line="240" w:lineRule="auto"/>
               <w:rPr>
                 <w:rFonts w:ascii="Arial" w:eastAsia="Arial" w:hAnsi="Arial" w:cs="Arial"/>
-                <w:sz w:val="16"/>
-                <w:szCs w:val="16"/>
-              </w:rPr>
-            </w:pPr>
-            <w:r>
-              <w:rPr>
-                <w:rFonts w:ascii="Arial" w:eastAsia="Arial" w:hAnsi="Arial" w:cs="Arial"/>
-                <w:sz w:val="16"/>
-                <w:szCs w:val="16"/>
+                <w:sz w:val="20"/>
+                <w:szCs w:val="20"/>
+              </w:rPr>
+            </w:pPr>
+            <w:r>
+              <w:rPr>
+                <w:rFonts w:ascii="Arial" w:eastAsia="Arial" w:hAnsi="Arial" w:cs="Arial"/>
+                <w:sz w:val="20"/>
+                <w:szCs w:val="20"/>
               </w:rPr>
               <w:t>Slow to grasp concepts, sometimes does not remember important facts and procedures</w:t>
             </w:r>
@@ -1183,19 +1186,17 @@
               <w:jc w:val="center"/>
               <w:rPr>
                 <w:rFonts w:ascii="Arial" w:eastAsia="Arial" w:hAnsi="Arial" w:cs="Arial"/>
-              </w:rPr>
-            </w:pPr>
-            <w:r>
-              <w:t xml:space="preserve">2 </w:t>
-            </w:r>
-            <w:r>
-              <w:t>${ability_to_learn_</w:t>
-            </w:r>
-            <w:r>
-              <w:t>2</w:t>
-            </w:r>
-            <w:r>
-              <w:t>}</w:t>
+                <w:sz w:val="20"/>
+                <w:szCs w:val="20"/>
+              </w:rPr>
+            </w:pPr>
+            <w:r>
+              <w:rPr>
+                <w:rFonts w:ascii="Arial" w:hAnsi="Arial" w:cs="Arial"/>
+                <w:sz w:val="20"/>
+                <w:szCs w:val="20"/>
+              </w:rPr>
+              <w:t>2 [ ${ability_to_learn_2} ]</w:t>
             </w:r>
           </w:p>
         </w:tc>
@@ -1276,15 +1277,15 @@
               <w:spacing w:after="0" w:line="240" w:lineRule="auto"/>
               <w:rPr>
                 <w:rFonts w:ascii="Arial" w:eastAsia="Arial" w:hAnsi="Arial" w:cs="Arial"/>
-                <w:sz w:val="16"/>
-                <w:szCs w:val="16"/>
-              </w:rPr>
-            </w:pPr>
-            <w:r>
-              <w:rPr>
-                <w:rFonts w:ascii="Arial" w:eastAsia="Arial" w:hAnsi="Arial" w:cs="Arial"/>
-                <w:sz w:val="16"/>
-                <w:szCs w:val="16"/>
+                <w:sz w:val="20"/>
+                <w:szCs w:val="20"/>
+              </w:rPr>
+            </w:pPr>
+            <w:r>
+              <w:rPr>
+                <w:rFonts w:ascii="Arial" w:eastAsia="Arial" w:hAnsi="Arial" w:cs="Arial"/>
+                <w:sz w:val="20"/>
+                <w:szCs w:val="20"/>
               </w:rPr>
               <w:t>Does not easily understand; needs repeated instructions on the same tasks.</w:t>
             </w:r>
@@ -1302,19 +1303,17 @@
               <w:jc w:val="center"/>
               <w:rPr>
                 <w:rFonts w:ascii="Arial" w:eastAsia="Arial" w:hAnsi="Arial" w:cs="Arial"/>
-              </w:rPr>
-            </w:pPr>
-            <w:r>
-              <w:t xml:space="preserve">1 </w:t>
-            </w:r>
-            <w:r>
-              <w:t>${ability_to_learn_</w:t>
-            </w:r>
-            <w:r>
-              <w:t>1</w:t>
-            </w:r>
-            <w:r>
-              <w:t>}</w:t>
+                <w:sz w:val="20"/>
+                <w:szCs w:val="20"/>
+              </w:rPr>
+            </w:pPr>
+            <w:r>
+              <w:rPr>
+                <w:rFonts w:ascii="Arial" w:hAnsi="Arial" w:cs="Arial"/>
+                <w:sz w:val="20"/>
+                <w:szCs w:val="20"/>
+              </w:rPr>
+              <w:t>1 [ ${ability_to_learn_1} ]</w:t>
             </w:r>
           </w:p>
         </w:tc>
@@ -1398,15 +1397,15 @@
               <w:spacing w:after="0" w:line="240" w:lineRule="auto"/>
               <w:rPr>
                 <w:rFonts w:ascii="Arial" w:eastAsia="Arial" w:hAnsi="Arial" w:cs="Arial"/>
-                <w:sz w:val="16"/>
-                <w:szCs w:val="16"/>
-              </w:rPr>
-            </w:pPr>
-            <w:r>
-              <w:rPr>
-                <w:rFonts w:ascii="Arial" w:eastAsia="Arial" w:hAnsi="Arial" w:cs="Arial"/>
-                <w:sz w:val="16"/>
-                <w:szCs w:val="16"/>
+                <w:sz w:val="20"/>
+                <w:szCs w:val="20"/>
+              </w:rPr>
+            </w:pPr>
+            <w:r>
+              <w:rPr>
+                <w:rFonts w:ascii="Arial" w:eastAsia="Arial" w:hAnsi="Arial" w:cs="Arial"/>
+                <w:sz w:val="20"/>
+                <w:szCs w:val="20"/>
               </w:rPr>
               <w:t>Possesses a positive perspective; always upbeat and ready to work; a pleasure to work with; always reports to work ahead of time without any absences and tardiness</w:t>
             </w:r>
@@ -1423,34 +1422,18 @@
               <w:spacing w:after="0" w:line="240" w:lineRule="auto"/>
               <w:jc w:val="center"/>
               <w:rPr>
-                <w:rFonts w:asciiTheme="minorHAnsi" w:eastAsia="Arial" w:hAnsiTheme="minorHAnsi" w:cstheme="minorHAnsi"/>
-                <w:sz w:val="16"/>
-                <w:szCs w:val="16"/>
-              </w:rPr>
-            </w:pPr>
-            <w:r>
-              <w:rPr>
-                <w:rFonts w:asciiTheme="minorHAnsi" w:hAnsiTheme="minorHAnsi" w:cstheme="minorHAnsi"/>
-              </w:rPr>
-              <w:t xml:space="preserve">5 </w:t>
-            </w:r>
-            <w:r>
-              <w:rPr>
-                <w:rFonts w:asciiTheme="minorHAnsi" w:hAnsiTheme="minorHAnsi" w:cstheme="minorHAnsi"/>
-              </w:rPr>
-              <w:t>${</w:t>
-            </w:r>
-            <w:r>
-              <w:rPr>
-                <w:rFonts w:asciiTheme="minorHAnsi" w:eastAsia="Arial" w:hAnsiTheme="minorHAnsi" w:cstheme="minorHAnsi"/>
-              </w:rPr>
-              <w:t>work_attitude</w:t>
-            </w:r>
-            <w:r>
-              <w:rPr>
-                <w:rFonts w:asciiTheme="minorHAnsi" w:hAnsiTheme="minorHAnsi" w:cstheme="minorHAnsi"/>
-              </w:rPr>
-              <w:t>_5}</w:t>
+                <w:rFonts w:ascii="Arial" w:eastAsia="Arial" w:hAnsi="Arial" w:cs="Arial"/>
+                <w:sz w:val="20"/>
+                <w:szCs w:val="20"/>
+              </w:rPr>
+            </w:pPr>
+            <w:r>
+              <w:rPr>
+                <w:rFonts w:ascii="Arial" w:hAnsi="Arial" w:cs="Arial"/>
+                <w:sz w:val="20"/>
+                <w:szCs w:val="20"/>
+              </w:rPr>
+              <w:t>5 [ ${work_attitude_5} ]</w:t>
             </w:r>
           </w:p>
         </w:tc>
@@ -1469,14 +1452,16 @@
               <w:spacing w:after="0" w:line="240" w:lineRule="auto"/>
               <w:jc w:val="center"/>
               <w:rPr>
-                <w:rFonts w:asciiTheme="minorHAnsi" w:eastAsia="Arial" w:hAnsiTheme="minorHAnsi" w:cstheme="minorHAnsi"/>
-                <w:sz w:val="16"/>
-                <w:szCs w:val="16"/>
-              </w:rPr>
-            </w:pPr>
-            <w:r>
-              <w:rPr>
-                <w:rFonts w:asciiTheme="minorHAnsi" w:eastAsia="Arial" w:hAnsiTheme="minorHAnsi" w:cstheme="minorHAnsi"/>
+                <w:rFonts w:ascii="Arial" w:eastAsia="Arial" w:hAnsi="Arial" w:cs="Arial"/>
+                <w:sz w:val="16"/>
+                <w:szCs w:val="16"/>
+              </w:rPr>
+            </w:pPr>
+            <w:r>
+              <w:rPr>
+                <w:rFonts w:ascii="Arial" w:eastAsia="Arial" w:hAnsi="Arial" w:cs="Arial"/>
+                <w:sz w:val="16"/>
+                <w:szCs w:val="16"/>
               </w:rPr>
               <w:t>${work_attitude_remarks}</w:t>
             </w:r>
@@ -1530,15 +1515,15 @@
               <w:spacing w:after="0" w:line="240" w:lineRule="auto"/>
               <w:rPr>
                 <w:rFonts w:ascii="Arial" w:eastAsia="Arial" w:hAnsi="Arial" w:cs="Arial"/>
-                <w:sz w:val="16"/>
-                <w:szCs w:val="16"/>
-              </w:rPr>
-            </w:pPr>
-            <w:r>
-              <w:rPr>
-                <w:rFonts w:ascii="Arial" w:eastAsia="Arial" w:hAnsi="Arial" w:cs="Arial"/>
-                <w:sz w:val="16"/>
-                <w:szCs w:val="16"/>
+                <w:sz w:val="20"/>
+                <w:szCs w:val="20"/>
+              </w:rPr>
+            </w:pPr>
+            <w:r>
+              <w:rPr>
+                <w:rFonts w:ascii="Arial" w:eastAsia="Arial" w:hAnsi="Arial" w:cs="Arial"/>
+                <w:sz w:val="20"/>
+                <w:szCs w:val="20"/>
               </w:rPr>
               <w:t>Accepts all work assignments; rarely complains; communicates well with superiors and coworkers; observes regularity and punctuality in attendance</w:t>
             </w:r>
@@ -1555,34 +1540,18 @@
               <w:spacing w:after="0" w:line="240" w:lineRule="auto"/>
               <w:jc w:val="center"/>
               <w:rPr>
-                <w:rFonts w:asciiTheme="minorHAnsi" w:eastAsia="Arial" w:hAnsiTheme="minorHAnsi" w:cstheme="minorHAnsi"/>
-                <w:sz w:val="16"/>
-                <w:szCs w:val="16"/>
-              </w:rPr>
-            </w:pPr>
-            <w:r>
-              <w:rPr>
-                <w:rFonts w:asciiTheme="minorHAnsi" w:hAnsiTheme="minorHAnsi" w:cstheme="minorHAnsi"/>
-              </w:rPr>
-              <w:t xml:space="preserve">4 </w:t>
-            </w:r>
-            <w:r>
-              <w:rPr>
-                <w:rFonts w:asciiTheme="minorHAnsi" w:hAnsiTheme="minorHAnsi" w:cstheme="minorHAnsi"/>
-              </w:rPr>
-              <w:t>${</w:t>
-            </w:r>
-            <w:r>
-              <w:rPr>
-                <w:rFonts w:asciiTheme="minorHAnsi" w:eastAsia="Arial" w:hAnsiTheme="minorHAnsi" w:cstheme="minorHAnsi"/>
-              </w:rPr>
-              <w:t>work_attitude</w:t>
-            </w:r>
-            <w:r>
-              <w:rPr>
-                <w:rFonts w:asciiTheme="minorHAnsi" w:hAnsiTheme="minorHAnsi" w:cstheme="minorHAnsi"/>
-              </w:rPr>
-              <w:t>_4}</w:t>
+                <w:rFonts w:ascii="Arial" w:eastAsia="Arial" w:hAnsi="Arial" w:cs="Arial"/>
+                <w:sz w:val="20"/>
+                <w:szCs w:val="20"/>
+              </w:rPr>
+            </w:pPr>
+            <w:r>
+              <w:rPr>
+                <w:rFonts w:ascii="Arial" w:hAnsi="Arial" w:cs="Arial"/>
+                <w:sz w:val="20"/>
+                <w:szCs w:val="20"/>
+              </w:rPr>
+              <w:t>4 [ ${work_attitude_4} ]</w:t>
             </w:r>
           </w:p>
         </w:tc>
@@ -1608,7 +1577,7 @@
               </w:pBdr>
               <w:spacing w:after="0" w:line="276" w:lineRule="auto"/>
               <w:rPr>
-                <w:rFonts w:asciiTheme="minorHAnsi" w:eastAsia="Arial" w:hAnsiTheme="minorHAnsi" w:cstheme="minorHAnsi"/>
+                <w:rFonts w:ascii="Arial" w:eastAsia="Arial" w:hAnsi="Arial" w:cs="Arial"/>
                 <w:sz w:val="16"/>
                 <w:szCs w:val="16"/>
               </w:rPr>
@@ -1663,15 +1632,15 @@
               <w:spacing w:after="0" w:line="240" w:lineRule="auto"/>
               <w:rPr>
                 <w:rFonts w:ascii="Arial" w:eastAsia="Arial" w:hAnsi="Arial" w:cs="Arial"/>
-                <w:sz w:val="16"/>
-                <w:szCs w:val="16"/>
-              </w:rPr>
-            </w:pPr>
-            <w:r>
-              <w:rPr>
-                <w:rFonts w:ascii="Arial" w:eastAsia="Arial" w:hAnsi="Arial" w:cs="Arial"/>
-                <w:sz w:val="16"/>
-                <w:szCs w:val="16"/>
+                <w:sz w:val="20"/>
+                <w:szCs w:val="20"/>
+              </w:rPr>
+            </w:pPr>
+            <w:r>
+              <w:rPr>
+                <w:rFonts w:ascii="Arial" w:eastAsia="Arial" w:hAnsi="Arial" w:cs="Arial"/>
+                <w:sz w:val="20"/>
+                <w:szCs w:val="20"/>
               </w:rPr>
               <w:t>Takes setback in strides; pleasant and cooperative in most situations; reports to work on time with minimal absences or tardiness.</w:t>
             </w:r>
@@ -1688,34 +1657,18 @@
               <w:spacing w:after="0" w:line="240" w:lineRule="auto"/>
               <w:jc w:val="center"/>
               <w:rPr>
-                <w:rFonts w:asciiTheme="minorHAnsi" w:eastAsia="Arial" w:hAnsiTheme="minorHAnsi" w:cstheme="minorHAnsi"/>
-                <w:sz w:val="16"/>
-                <w:szCs w:val="16"/>
-              </w:rPr>
-            </w:pPr>
-            <w:r>
-              <w:rPr>
-                <w:rFonts w:asciiTheme="minorHAnsi" w:hAnsiTheme="minorHAnsi" w:cstheme="minorHAnsi"/>
-              </w:rPr>
-              <w:t xml:space="preserve">3 </w:t>
-            </w:r>
-            <w:r>
-              <w:rPr>
-                <w:rFonts w:asciiTheme="minorHAnsi" w:hAnsiTheme="minorHAnsi" w:cstheme="minorHAnsi"/>
-              </w:rPr>
-              <w:t>${</w:t>
-            </w:r>
-            <w:r>
-              <w:rPr>
-                <w:rFonts w:asciiTheme="minorHAnsi" w:eastAsia="Arial" w:hAnsiTheme="minorHAnsi" w:cstheme="minorHAnsi"/>
-              </w:rPr>
-              <w:t>work_attitude</w:t>
-            </w:r>
-            <w:r>
-              <w:rPr>
-                <w:rFonts w:asciiTheme="minorHAnsi" w:hAnsiTheme="minorHAnsi" w:cstheme="minorHAnsi"/>
-              </w:rPr>
-              <w:t>_3}</w:t>
+                <w:rFonts w:ascii="Arial" w:eastAsia="Arial" w:hAnsi="Arial" w:cs="Arial"/>
+                <w:sz w:val="20"/>
+                <w:szCs w:val="20"/>
+              </w:rPr>
+            </w:pPr>
+            <w:r>
+              <w:rPr>
+                <w:rFonts w:ascii="Arial" w:hAnsi="Arial" w:cs="Arial"/>
+                <w:sz w:val="20"/>
+                <w:szCs w:val="20"/>
+              </w:rPr>
+              <w:t>3 [ ${work_attitude_3} ]</w:t>
             </w:r>
           </w:p>
         </w:tc>
@@ -1741,7 +1694,7 @@
               </w:pBdr>
               <w:spacing w:after="0" w:line="276" w:lineRule="auto"/>
               <w:rPr>
-                <w:rFonts w:asciiTheme="minorHAnsi" w:eastAsia="Arial" w:hAnsiTheme="minorHAnsi" w:cstheme="minorHAnsi"/>
+                <w:rFonts w:ascii="Arial" w:eastAsia="Arial" w:hAnsi="Arial" w:cs="Arial"/>
                 <w:sz w:val="16"/>
                 <w:szCs w:val="16"/>
               </w:rPr>
@@ -1796,15 +1749,15 @@
               <w:spacing w:after="0" w:line="240" w:lineRule="auto"/>
               <w:rPr>
                 <w:rFonts w:ascii="Arial" w:eastAsia="Arial" w:hAnsi="Arial" w:cs="Arial"/>
-                <w:sz w:val="16"/>
-                <w:szCs w:val="16"/>
-              </w:rPr>
-            </w:pPr>
-            <w:r>
-              <w:rPr>
-                <w:rFonts w:ascii="Arial" w:eastAsia="Arial" w:hAnsi="Arial" w:cs="Arial"/>
-                <w:sz w:val="16"/>
-                <w:szCs w:val="16"/>
+                <w:sz w:val="20"/>
+                <w:szCs w:val="20"/>
+              </w:rPr>
+            </w:pPr>
+            <w:r>
+              <w:rPr>
+                <w:rFonts w:ascii="Arial" w:eastAsia="Arial" w:hAnsi="Arial" w:cs="Arial"/>
+                <w:sz w:val="20"/>
+                <w:szCs w:val="20"/>
               </w:rPr>
               <w:t>Complains that many things are unfair, a whiner; reports to work but sometimes tardy and absent.</w:t>
             </w:r>
@@ -1821,34 +1774,18 @@
               <w:spacing w:after="0" w:line="240" w:lineRule="auto"/>
               <w:jc w:val="center"/>
               <w:rPr>
-                <w:rFonts w:asciiTheme="minorHAnsi" w:eastAsia="Arial" w:hAnsiTheme="minorHAnsi" w:cstheme="minorHAnsi"/>
-                <w:sz w:val="16"/>
-                <w:szCs w:val="16"/>
-              </w:rPr>
-            </w:pPr>
-            <w:r>
-              <w:rPr>
-                <w:rFonts w:asciiTheme="minorHAnsi" w:hAnsiTheme="minorHAnsi" w:cstheme="minorHAnsi"/>
-              </w:rPr>
-              <w:t xml:space="preserve">2 </w:t>
-            </w:r>
-            <w:r>
-              <w:rPr>
-                <w:rFonts w:asciiTheme="minorHAnsi" w:hAnsiTheme="minorHAnsi" w:cstheme="minorHAnsi"/>
-              </w:rPr>
-              <w:t>${</w:t>
-            </w:r>
-            <w:r>
-              <w:rPr>
-                <w:rFonts w:asciiTheme="minorHAnsi" w:eastAsia="Arial" w:hAnsiTheme="minorHAnsi" w:cstheme="minorHAnsi"/>
-              </w:rPr>
-              <w:t>work_attitude</w:t>
-            </w:r>
-            <w:r>
-              <w:rPr>
-                <w:rFonts w:asciiTheme="minorHAnsi" w:hAnsiTheme="minorHAnsi" w:cstheme="minorHAnsi"/>
-              </w:rPr>
-              <w:t>_2}</w:t>
+                <w:rFonts w:ascii="Arial" w:eastAsia="Arial" w:hAnsi="Arial" w:cs="Arial"/>
+                <w:sz w:val="20"/>
+                <w:szCs w:val="20"/>
+              </w:rPr>
+            </w:pPr>
+            <w:r>
+              <w:rPr>
+                <w:rFonts w:ascii="Arial" w:hAnsi="Arial" w:cs="Arial"/>
+                <w:sz w:val="20"/>
+                <w:szCs w:val="20"/>
+              </w:rPr>
+              <w:t>2 [ ${work_attitude_2} ]</w:t>
             </w:r>
           </w:p>
         </w:tc>
@@ -1874,7 +1811,7 @@
               </w:pBdr>
               <w:spacing w:after="0" w:line="276" w:lineRule="auto"/>
               <w:rPr>
-                <w:rFonts w:asciiTheme="minorHAnsi" w:eastAsia="Arial" w:hAnsiTheme="minorHAnsi" w:cstheme="minorHAnsi"/>
+                <w:rFonts w:ascii="Arial" w:eastAsia="Arial" w:hAnsi="Arial" w:cs="Arial"/>
                 <w:sz w:val="16"/>
                 <w:szCs w:val="16"/>
               </w:rPr>
@@ -1929,15 +1866,15 @@
               <w:spacing w:after="0" w:line="240" w:lineRule="auto"/>
               <w:rPr>
                 <w:rFonts w:ascii="Arial" w:eastAsia="Arial" w:hAnsi="Arial" w:cs="Arial"/>
-                <w:sz w:val="16"/>
-                <w:szCs w:val="16"/>
-              </w:rPr>
-            </w:pPr>
-            <w:r>
-              <w:rPr>
-                <w:rFonts w:ascii="Arial" w:eastAsia="Arial" w:hAnsi="Arial" w:cs="Arial"/>
-                <w:sz w:val="16"/>
-                <w:szCs w:val="16"/>
+                <w:sz w:val="20"/>
+                <w:szCs w:val="20"/>
+              </w:rPr>
+            </w:pPr>
+            <w:r>
+              <w:rPr>
+                <w:rFonts w:ascii="Arial" w:eastAsia="Arial" w:hAnsi="Arial" w:cs="Arial"/>
+                <w:sz w:val="20"/>
+                <w:szCs w:val="20"/>
               </w:rPr>
               <w:t>Continually gripes about work assignments; disturbs others; uncooperative; temperamental; frequent absences or tardiness.</w:t>
             </w:r>
@@ -1954,34 +1891,18 @@
               <w:spacing w:after="0" w:line="240" w:lineRule="auto"/>
               <w:jc w:val="center"/>
               <w:rPr>
-                <w:rFonts w:asciiTheme="minorHAnsi" w:eastAsia="Arial" w:hAnsiTheme="minorHAnsi" w:cstheme="minorHAnsi"/>
-                <w:sz w:val="16"/>
-                <w:szCs w:val="16"/>
-              </w:rPr>
-            </w:pPr>
-            <w:r>
-              <w:rPr>
-                <w:rFonts w:asciiTheme="minorHAnsi" w:hAnsiTheme="minorHAnsi" w:cstheme="minorHAnsi"/>
-              </w:rPr>
-              <w:t xml:space="preserve">1 </w:t>
-            </w:r>
-            <w:r>
-              <w:rPr>
-                <w:rFonts w:asciiTheme="minorHAnsi" w:hAnsiTheme="minorHAnsi" w:cstheme="minorHAnsi"/>
-              </w:rPr>
-              <w:t>${</w:t>
-            </w:r>
-            <w:r>
-              <w:rPr>
-                <w:rFonts w:asciiTheme="minorHAnsi" w:eastAsia="Arial" w:hAnsiTheme="minorHAnsi" w:cstheme="minorHAnsi"/>
-              </w:rPr>
-              <w:t>work_attitude</w:t>
-            </w:r>
-            <w:r>
-              <w:rPr>
-                <w:rFonts w:asciiTheme="minorHAnsi" w:hAnsiTheme="minorHAnsi" w:cstheme="minorHAnsi"/>
-              </w:rPr>
-              <w:t>_1}</w:t>
+                <w:rFonts w:ascii="Arial" w:eastAsia="Arial" w:hAnsi="Arial" w:cs="Arial"/>
+                <w:sz w:val="20"/>
+                <w:szCs w:val="20"/>
+              </w:rPr>
+            </w:pPr>
+            <w:r>
+              <w:rPr>
+                <w:rFonts w:ascii="Arial" w:hAnsi="Arial" w:cs="Arial"/>
+                <w:sz w:val="20"/>
+                <w:szCs w:val="20"/>
+              </w:rPr>
+              <w:t>1 [ ${work_attitude_1} ]</w:t>
             </w:r>
           </w:p>
         </w:tc>
@@ -2007,7 +1928,7 @@
               </w:pBdr>
               <w:spacing w:after="0" w:line="276" w:lineRule="auto"/>
               <w:rPr>
-                <w:rFonts w:asciiTheme="minorHAnsi" w:eastAsia="Arial" w:hAnsiTheme="minorHAnsi" w:cstheme="minorHAnsi"/>
+                <w:rFonts w:ascii="Arial" w:eastAsia="Arial" w:hAnsi="Arial" w:cs="Arial"/>
                 <w:sz w:val="16"/>
                 <w:szCs w:val="16"/>
               </w:rPr>
@@ -2065,15 +1986,15 @@
               <w:spacing w:after="0" w:line="240" w:lineRule="auto"/>
               <w:rPr>
                 <w:rFonts w:ascii="Arial" w:eastAsia="Arial" w:hAnsi="Arial" w:cs="Arial"/>
-                <w:sz w:val="16"/>
-                <w:szCs w:val="16"/>
-              </w:rPr>
-            </w:pPr>
-            <w:r>
-              <w:rPr>
-                <w:rFonts w:ascii="Arial" w:eastAsia="Arial" w:hAnsi="Arial" w:cs="Arial"/>
-                <w:sz w:val="16"/>
-                <w:szCs w:val="16"/>
+                <w:sz w:val="20"/>
+                <w:szCs w:val="20"/>
+              </w:rPr>
+            </w:pPr>
+            <w:r>
+              <w:rPr>
+                <w:rFonts w:ascii="Arial" w:eastAsia="Arial" w:hAnsi="Arial" w:cs="Arial"/>
+                <w:sz w:val="20"/>
+                <w:szCs w:val="20"/>
               </w:rPr>
               <w:t>Always polite; careful not to offend anyone, maintains proper composure; makes special efforts to be helpful.</w:t>
             </w:r>
@@ -2090,34 +2011,18 @@
               <w:spacing w:after="0" w:line="240" w:lineRule="auto"/>
               <w:jc w:val="center"/>
               <w:rPr>
-                <w:rFonts w:asciiTheme="minorHAnsi" w:eastAsia="Arial" w:hAnsiTheme="minorHAnsi" w:cstheme="minorHAnsi"/>
-                <w:sz w:val="16"/>
-                <w:szCs w:val="16"/>
-              </w:rPr>
-            </w:pPr>
-            <w:r>
-              <w:rPr>
-                <w:rFonts w:asciiTheme="minorHAnsi" w:hAnsiTheme="minorHAnsi" w:cstheme="minorHAnsi"/>
-              </w:rPr>
-              <w:t xml:space="preserve">5 </w:t>
-            </w:r>
-            <w:r>
-              <w:rPr>
-                <w:rFonts w:asciiTheme="minorHAnsi" w:hAnsiTheme="minorHAnsi" w:cstheme="minorHAnsi"/>
-              </w:rPr>
-              <w:t>${</w:t>
-            </w:r>
-            <w:r>
-              <w:rPr>
-                <w:rFonts w:asciiTheme="minorHAnsi" w:eastAsia="Arial" w:hAnsiTheme="minorHAnsi" w:cstheme="minorHAnsi"/>
-              </w:rPr>
-              <w:t>conduct</w:t>
-            </w:r>
-            <w:r>
-              <w:rPr>
-                <w:rFonts w:asciiTheme="minorHAnsi" w:hAnsiTheme="minorHAnsi" w:cstheme="minorHAnsi"/>
-              </w:rPr>
-              <w:t>_5}</w:t>
+                <w:rFonts w:ascii="Arial" w:eastAsia="Arial" w:hAnsi="Arial" w:cs="Arial"/>
+                <w:sz w:val="20"/>
+                <w:szCs w:val="20"/>
+              </w:rPr>
+            </w:pPr>
+            <w:r>
+              <w:rPr>
+                <w:rFonts w:ascii="Arial" w:hAnsi="Arial" w:cs="Arial"/>
+                <w:sz w:val="20"/>
+                <w:szCs w:val="20"/>
+              </w:rPr>
+              <w:t>5 [ ${conduct_5} ]</w:t>
             </w:r>
           </w:p>
         </w:tc>
@@ -2136,14 +2041,16 @@
               <w:spacing w:after="0" w:line="240" w:lineRule="auto"/>
               <w:jc w:val="center"/>
               <w:rPr>
-                <w:rFonts w:asciiTheme="minorHAnsi" w:eastAsia="Arial" w:hAnsiTheme="minorHAnsi" w:cstheme="minorHAnsi"/>
-                <w:sz w:val="16"/>
-                <w:szCs w:val="16"/>
-              </w:rPr>
-            </w:pPr>
-            <w:r>
-              <w:rPr>
-                <w:rFonts w:asciiTheme="minorHAnsi" w:eastAsia="Arial" w:hAnsiTheme="minorHAnsi" w:cstheme="minorHAnsi"/>
+                <w:rFonts w:ascii="Arial" w:eastAsia="Arial" w:hAnsi="Arial" w:cs="Arial"/>
+                <w:sz w:val="16"/>
+                <w:szCs w:val="16"/>
+              </w:rPr>
+            </w:pPr>
+            <w:r>
+              <w:rPr>
+                <w:rFonts w:ascii="Arial" w:eastAsia="Arial" w:hAnsi="Arial" w:cs="Arial"/>
+                <w:sz w:val="16"/>
+                <w:szCs w:val="16"/>
               </w:rPr>
               <w:t>${conduct_remarks}</w:t>
             </w:r>
@@ -2197,15 +2104,15 @@
               <w:spacing w:after="0" w:line="240" w:lineRule="auto"/>
               <w:rPr>
                 <w:rFonts w:ascii="Arial" w:eastAsia="Arial" w:hAnsi="Arial" w:cs="Arial"/>
-                <w:sz w:val="16"/>
-                <w:szCs w:val="16"/>
-              </w:rPr>
-            </w:pPr>
-            <w:r>
-              <w:rPr>
-                <w:rFonts w:ascii="Arial" w:eastAsia="Arial" w:hAnsi="Arial" w:cs="Arial"/>
-                <w:sz w:val="16"/>
-                <w:szCs w:val="16"/>
+                <w:sz w:val="20"/>
+                <w:szCs w:val="20"/>
+              </w:rPr>
+            </w:pPr>
+            <w:r>
+              <w:rPr>
+                <w:rFonts w:ascii="Arial" w:eastAsia="Arial" w:hAnsi="Arial" w:cs="Arial"/>
+                <w:sz w:val="20"/>
+                <w:szCs w:val="20"/>
               </w:rPr>
               <w:t>Mostly polite and helpful; recognizes importance of human relationships; rarely losses temper.</w:t>
             </w:r>
@@ -2222,34 +2129,18 @@
               <w:spacing w:after="0" w:line="240" w:lineRule="auto"/>
               <w:jc w:val="center"/>
               <w:rPr>
-                <w:rFonts w:asciiTheme="minorHAnsi" w:eastAsia="Arial" w:hAnsiTheme="minorHAnsi" w:cstheme="minorHAnsi"/>
-                <w:sz w:val="16"/>
-                <w:szCs w:val="16"/>
-              </w:rPr>
-            </w:pPr>
-            <w:r>
-              <w:rPr>
-                <w:rFonts w:asciiTheme="minorHAnsi" w:hAnsiTheme="minorHAnsi" w:cstheme="minorHAnsi"/>
-              </w:rPr>
-              <w:t xml:space="preserve">4 </w:t>
-            </w:r>
-            <w:r>
-              <w:rPr>
-                <w:rFonts w:asciiTheme="minorHAnsi" w:hAnsiTheme="minorHAnsi" w:cstheme="minorHAnsi"/>
-              </w:rPr>
-              <w:t>${</w:t>
-            </w:r>
-            <w:r>
-              <w:rPr>
-                <w:rFonts w:asciiTheme="minorHAnsi" w:eastAsia="Arial" w:hAnsiTheme="minorHAnsi" w:cstheme="minorHAnsi"/>
-              </w:rPr>
-              <w:t>conduct</w:t>
-            </w:r>
-            <w:r>
-              <w:rPr>
-                <w:rFonts w:asciiTheme="minorHAnsi" w:hAnsiTheme="minorHAnsi" w:cstheme="minorHAnsi"/>
-              </w:rPr>
-              <w:t>_4}</w:t>
+                <w:rFonts w:ascii="Arial" w:eastAsia="Arial" w:hAnsi="Arial" w:cs="Arial"/>
+                <w:sz w:val="20"/>
+                <w:szCs w:val="20"/>
+              </w:rPr>
+            </w:pPr>
+            <w:r>
+              <w:rPr>
+                <w:rFonts w:ascii="Arial" w:hAnsi="Arial" w:cs="Arial"/>
+                <w:sz w:val="20"/>
+                <w:szCs w:val="20"/>
+              </w:rPr>
+              <w:t>4 [ ${conduct_4} ]</w:t>
             </w:r>
           </w:p>
         </w:tc>
@@ -2275,7 +2166,7 @@
               </w:pBdr>
               <w:spacing w:after="0" w:line="276" w:lineRule="auto"/>
               <w:rPr>
-                <w:rFonts w:asciiTheme="minorHAnsi" w:eastAsia="Arial" w:hAnsiTheme="minorHAnsi" w:cstheme="minorHAnsi"/>
+                <w:rFonts w:ascii="Arial" w:eastAsia="Arial" w:hAnsi="Arial" w:cs="Arial"/>
                 <w:sz w:val="16"/>
                 <w:szCs w:val="16"/>
               </w:rPr>
@@ -2330,15 +2221,15 @@
               <w:spacing w:after="0" w:line="240" w:lineRule="auto"/>
               <w:rPr>
                 <w:rFonts w:ascii="Arial" w:eastAsia="Arial" w:hAnsi="Arial" w:cs="Arial"/>
-                <w:sz w:val="16"/>
-                <w:szCs w:val="16"/>
-              </w:rPr>
-            </w:pPr>
-            <w:r>
-              <w:rPr>
-                <w:rFonts w:ascii="Arial" w:eastAsia="Arial" w:hAnsi="Arial" w:cs="Arial"/>
-                <w:sz w:val="16"/>
-                <w:szCs w:val="16"/>
+                <w:sz w:val="20"/>
+                <w:szCs w:val="20"/>
+              </w:rPr>
+            </w:pPr>
+            <w:r>
+              <w:rPr>
+                <w:rFonts w:ascii="Arial" w:eastAsia="Arial" w:hAnsi="Arial" w:cs="Arial"/>
+                <w:sz w:val="20"/>
+                <w:szCs w:val="20"/>
               </w:rPr>
               <w:t>Observes common courtesy but doesn't always recognize opportunities and/or need to be polite or helpful.</w:t>
             </w:r>
@@ -2355,34 +2246,18 @@
               <w:spacing w:after="0" w:line="240" w:lineRule="auto"/>
               <w:jc w:val="center"/>
               <w:rPr>
-                <w:rFonts w:asciiTheme="minorHAnsi" w:eastAsia="Arial" w:hAnsiTheme="minorHAnsi" w:cstheme="minorHAnsi"/>
-                <w:sz w:val="16"/>
-                <w:szCs w:val="16"/>
-              </w:rPr>
-            </w:pPr>
-            <w:r>
-              <w:rPr>
-                <w:rFonts w:asciiTheme="minorHAnsi" w:hAnsiTheme="minorHAnsi" w:cstheme="minorHAnsi"/>
-              </w:rPr>
-              <w:t xml:space="preserve">3 </w:t>
-            </w:r>
-            <w:r>
-              <w:rPr>
-                <w:rFonts w:asciiTheme="minorHAnsi" w:hAnsiTheme="minorHAnsi" w:cstheme="minorHAnsi"/>
-              </w:rPr>
-              <w:t>${</w:t>
-            </w:r>
-            <w:r>
-              <w:rPr>
-                <w:rFonts w:asciiTheme="minorHAnsi" w:eastAsia="Arial" w:hAnsiTheme="minorHAnsi" w:cstheme="minorHAnsi"/>
-              </w:rPr>
-              <w:t>conduct</w:t>
-            </w:r>
-            <w:r>
-              <w:rPr>
-                <w:rFonts w:asciiTheme="minorHAnsi" w:hAnsiTheme="minorHAnsi" w:cstheme="minorHAnsi"/>
-              </w:rPr>
-              <w:t>_3}</w:t>
+                <w:rFonts w:ascii="Arial" w:eastAsia="Arial" w:hAnsi="Arial" w:cs="Arial"/>
+                <w:sz w:val="20"/>
+                <w:szCs w:val="20"/>
+              </w:rPr>
+            </w:pPr>
+            <w:r>
+              <w:rPr>
+                <w:rFonts w:ascii="Arial" w:hAnsi="Arial" w:cs="Arial"/>
+                <w:sz w:val="20"/>
+                <w:szCs w:val="20"/>
+              </w:rPr>
+              <w:t>3 [ ${conduct_3} ]</w:t>
             </w:r>
           </w:p>
         </w:tc>
@@ -2408,7 +2283,7 @@
               </w:pBdr>
               <w:spacing w:after="0" w:line="276" w:lineRule="auto"/>
               <w:rPr>
-                <w:rFonts w:asciiTheme="minorHAnsi" w:eastAsia="Arial" w:hAnsiTheme="minorHAnsi" w:cstheme="minorHAnsi"/>
+                <w:rFonts w:ascii="Arial" w:eastAsia="Arial" w:hAnsi="Arial" w:cs="Arial"/>
                 <w:sz w:val="16"/>
                 <w:szCs w:val="16"/>
               </w:rPr>
@@ -2463,15 +2338,15 @@
               <w:spacing w:after="0" w:line="240" w:lineRule="auto"/>
               <w:rPr>
                 <w:rFonts w:ascii="Arial" w:eastAsia="Arial" w:hAnsi="Arial" w:cs="Arial"/>
-                <w:sz w:val="16"/>
-                <w:szCs w:val="16"/>
-              </w:rPr>
-            </w:pPr>
-            <w:r>
-              <w:rPr>
-                <w:rFonts w:ascii="Arial" w:eastAsia="Arial" w:hAnsi="Arial" w:cs="Arial"/>
-                <w:sz w:val="16"/>
-                <w:szCs w:val="16"/>
+                <w:sz w:val="20"/>
+                <w:szCs w:val="20"/>
+              </w:rPr>
+            </w:pPr>
+            <w:r>
+              <w:rPr>
+                <w:rFonts w:ascii="Arial" w:eastAsia="Arial" w:hAnsi="Arial" w:cs="Arial"/>
+                <w:sz w:val="20"/>
+                <w:szCs w:val="20"/>
               </w:rPr>
               <w:t>Harasses others; occasionally rude, foul language; not sensitive to others.</w:t>
             </w:r>
@@ -2488,34 +2363,18 @@
               <w:spacing w:after="0" w:line="240" w:lineRule="auto"/>
               <w:jc w:val="center"/>
               <w:rPr>
-                <w:rFonts w:asciiTheme="minorHAnsi" w:eastAsia="Arial" w:hAnsiTheme="minorHAnsi" w:cstheme="minorHAnsi"/>
-                <w:sz w:val="16"/>
-                <w:szCs w:val="16"/>
-              </w:rPr>
-            </w:pPr>
-            <w:r>
-              <w:rPr>
-                <w:rFonts w:asciiTheme="minorHAnsi" w:hAnsiTheme="minorHAnsi" w:cstheme="minorHAnsi"/>
-              </w:rPr>
-              <w:t xml:space="preserve">2 </w:t>
-            </w:r>
-            <w:r>
-              <w:rPr>
-                <w:rFonts w:asciiTheme="minorHAnsi" w:hAnsiTheme="minorHAnsi" w:cstheme="minorHAnsi"/>
-              </w:rPr>
-              <w:t>${</w:t>
-            </w:r>
-            <w:r>
-              <w:rPr>
-                <w:rFonts w:asciiTheme="minorHAnsi" w:eastAsia="Arial" w:hAnsiTheme="minorHAnsi" w:cstheme="minorHAnsi"/>
-              </w:rPr>
-              <w:t>conduct</w:t>
-            </w:r>
-            <w:r>
-              <w:rPr>
-                <w:rFonts w:asciiTheme="minorHAnsi" w:hAnsiTheme="minorHAnsi" w:cstheme="minorHAnsi"/>
-              </w:rPr>
-              <w:t>_2}</w:t>
+                <w:rFonts w:ascii="Arial" w:eastAsia="Arial" w:hAnsi="Arial" w:cs="Arial"/>
+                <w:sz w:val="20"/>
+                <w:szCs w:val="20"/>
+              </w:rPr>
+            </w:pPr>
+            <w:r>
+              <w:rPr>
+                <w:rFonts w:ascii="Arial" w:hAnsi="Arial" w:cs="Arial"/>
+                <w:sz w:val="20"/>
+                <w:szCs w:val="20"/>
+              </w:rPr>
+              <w:t>2 [ ${conduct_2} ]</w:t>
             </w:r>
           </w:p>
         </w:tc>
@@ -2541,7 +2400,7 @@
               </w:pBdr>
               <w:spacing w:after="0" w:line="276" w:lineRule="auto"/>
               <w:rPr>
-                <w:rFonts w:asciiTheme="minorHAnsi" w:eastAsia="Arial" w:hAnsiTheme="minorHAnsi" w:cstheme="minorHAnsi"/>
+                <w:rFonts w:ascii="Arial" w:eastAsia="Arial" w:hAnsi="Arial" w:cs="Arial"/>
                 <w:sz w:val="16"/>
                 <w:szCs w:val="16"/>
               </w:rPr>
@@ -2596,15 +2455,15 @@
               <w:spacing w:after="0" w:line="240" w:lineRule="auto"/>
               <w:rPr>
                 <w:rFonts w:ascii="Arial" w:eastAsia="Arial" w:hAnsi="Arial" w:cs="Arial"/>
-                <w:sz w:val="16"/>
-                <w:szCs w:val="16"/>
-              </w:rPr>
-            </w:pPr>
-            <w:r>
-              <w:rPr>
-                <w:rFonts w:ascii="Arial" w:eastAsia="Arial" w:hAnsi="Arial" w:cs="Arial"/>
-                <w:sz w:val="16"/>
-                <w:szCs w:val="16"/>
+                <w:sz w:val="20"/>
+                <w:szCs w:val="20"/>
+              </w:rPr>
+            </w:pPr>
+            <w:r>
+              <w:rPr>
+                <w:rFonts w:ascii="Arial" w:eastAsia="Arial" w:hAnsi="Arial" w:cs="Arial"/>
+                <w:sz w:val="20"/>
+                <w:szCs w:val="20"/>
               </w:rPr>
               <w:t>Rude; ill mannered; uses obscene language; poor control of emotions; disrespectful to others.</w:t>
             </w:r>
@@ -2621,34 +2480,18 @@
               <w:spacing w:after="0" w:line="240" w:lineRule="auto"/>
               <w:jc w:val="center"/>
               <w:rPr>
-                <w:rFonts w:asciiTheme="minorHAnsi" w:eastAsia="Arial" w:hAnsiTheme="minorHAnsi" w:cstheme="minorHAnsi"/>
-                <w:sz w:val="16"/>
-                <w:szCs w:val="16"/>
-              </w:rPr>
-            </w:pPr>
-            <w:r>
-              <w:rPr>
-                <w:rFonts w:asciiTheme="minorHAnsi" w:hAnsiTheme="minorHAnsi" w:cstheme="minorHAnsi"/>
-              </w:rPr>
-              <w:t xml:space="preserve">1 </w:t>
-            </w:r>
-            <w:r>
-              <w:rPr>
-                <w:rFonts w:asciiTheme="minorHAnsi" w:hAnsiTheme="minorHAnsi" w:cstheme="minorHAnsi"/>
-              </w:rPr>
-              <w:t>${</w:t>
-            </w:r>
-            <w:r>
-              <w:rPr>
-                <w:rFonts w:asciiTheme="minorHAnsi" w:eastAsia="Arial" w:hAnsiTheme="minorHAnsi" w:cstheme="minorHAnsi"/>
-              </w:rPr>
-              <w:t>conduct</w:t>
-            </w:r>
-            <w:r>
-              <w:rPr>
-                <w:rFonts w:asciiTheme="minorHAnsi" w:hAnsiTheme="minorHAnsi" w:cstheme="minorHAnsi"/>
-              </w:rPr>
-              <w:t>_1}</w:t>
+                <w:rFonts w:ascii="Arial" w:eastAsia="Arial" w:hAnsi="Arial" w:cs="Arial"/>
+                <w:sz w:val="20"/>
+                <w:szCs w:val="20"/>
+              </w:rPr>
+            </w:pPr>
+            <w:r>
+              <w:rPr>
+                <w:rFonts w:ascii="Arial" w:hAnsi="Arial" w:cs="Arial"/>
+                <w:sz w:val="20"/>
+                <w:szCs w:val="20"/>
+              </w:rPr>
+              <w:t>1 [ ${conduct_1} ]</w:t>
             </w:r>
           </w:p>
         </w:tc>
@@ -2674,7 +2517,7 @@
               </w:pBdr>
               <w:spacing w:after="0" w:line="276" w:lineRule="auto"/>
               <w:rPr>
-                <w:rFonts w:asciiTheme="minorHAnsi" w:eastAsia="Arial" w:hAnsiTheme="minorHAnsi" w:cstheme="minorHAnsi"/>
+                <w:rFonts w:ascii="Arial" w:eastAsia="Arial" w:hAnsi="Arial" w:cs="Arial"/>
                 <w:sz w:val="16"/>
                 <w:szCs w:val="16"/>
               </w:rPr>
@@ -2732,15 +2575,15 @@
               <w:spacing w:after="0" w:line="240" w:lineRule="auto"/>
               <w:rPr>
                 <w:rFonts w:ascii="Arial" w:eastAsia="Arial" w:hAnsi="Arial" w:cs="Arial"/>
-                <w:sz w:val="16"/>
-                <w:szCs w:val="16"/>
-              </w:rPr>
-            </w:pPr>
-            <w:r>
-              <w:rPr>
-                <w:rFonts w:ascii="Arial" w:eastAsia="Arial" w:hAnsi="Arial" w:cs="Arial"/>
-                <w:sz w:val="16"/>
-                <w:szCs w:val="16"/>
+                <w:sz w:val="20"/>
+                <w:szCs w:val="20"/>
+              </w:rPr>
+            </w:pPr>
+            <w:r>
+              <w:rPr>
+                <w:rFonts w:ascii="Arial" w:eastAsia="Arial" w:hAnsi="Arial" w:cs="Arial"/>
+                <w:sz w:val="20"/>
+                <w:szCs w:val="20"/>
               </w:rPr>
               <w:t>Curiosity goes beyond immediate job procedures; eager to learn more; works hard.</w:t>
             </w:r>
@@ -2757,36 +2600,18 @@
               <w:spacing w:after="0" w:line="240" w:lineRule="auto"/>
               <w:jc w:val="center"/>
               <w:rPr>
-                <w:rFonts w:asciiTheme="minorHAnsi" w:eastAsia="Arial" w:hAnsiTheme="minorHAnsi" w:cstheme="minorHAnsi"/>
-                <w:sz w:val="16"/>
-                <w:szCs w:val="16"/>
-              </w:rPr>
-            </w:pPr>
-            <w:r>
-              <w:rPr>
-                <w:rFonts w:asciiTheme="minorHAnsi" w:hAnsiTheme="minorHAnsi" w:cstheme="minorHAnsi"/>
-              </w:rPr>
-              <w:t xml:space="preserve">5 </w:t>
-            </w:r>
-            <w:r>
-              <w:rPr>
-                <w:rFonts w:asciiTheme="minorHAnsi" w:hAnsiTheme="minorHAnsi" w:cstheme="minorHAnsi"/>
-              </w:rPr>
-              <w:t>${</w:t>
-            </w:r>
-            <w:r>
-              <w:rPr>
-                <w:rFonts w:asciiTheme="minorHAnsi" w:eastAsia="Arial" w:hAnsiTheme="minorHAnsi" w:cstheme="minorHAnsi"/>
-                <w:sz w:val="16"/>
-                <w:szCs w:val="16"/>
-              </w:rPr>
-              <w:t>motivation</w:t>
-            </w:r>
-            <w:r>
-              <w:rPr>
-                <w:rFonts w:asciiTheme="minorHAnsi" w:hAnsiTheme="minorHAnsi" w:cstheme="minorHAnsi"/>
-              </w:rPr>
-              <w:t>_5}</w:t>
+                <w:rFonts w:ascii="Arial" w:eastAsia="Arial" w:hAnsi="Arial" w:cs="Arial"/>
+                <w:sz w:val="20"/>
+                <w:szCs w:val="20"/>
+              </w:rPr>
+            </w:pPr>
+            <w:r>
+              <w:rPr>
+                <w:rFonts w:ascii="Arial" w:hAnsi="Arial" w:cs="Arial"/>
+                <w:sz w:val="20"/>
+                <w:szCs w:val="20"/>
+              </w:rPr>
+              <w:t>5 [ ${motivation_5} ]</w:t>
             </w:r>
           </w:p>
         </w:tc>
@@ -2805,14 +2630,14 @@
               <w:spacing w:after="0" w:line="240" w:lineRule="auto"/>
               <w:jc w:val="center"/>
               <w:rPr>
-                <w:rFonts w:asciiTheme="minorHAnsi" w:eastAsia="Arial" w:hAnsiTheme="minorHAnsi" w:cstheme="minorHAnsi"/>
-                <w:sz w:val="16"/>
-                <w:szCs w:val="16"/>
-              </w:rPr>
-            </w:pPr>
-            <w:r>
-              <w:rPr>
-                <w:rFonts w:asciiTheme="minorHAnsi" w:eastAsia="Arial" w:hAnsiTheme="minorHAnsi" w:cstheme="minorHAnsi"/>
+                <w:rFonts w:ascii="Arial" w:eastAsia="Arial" w:hAnsi="Arial" w:cs="Arial"/>
+                <w:sz w:val="16"/>
+                <w:szCs w:val="16"/>
+              </w:rPr>
+            </w:pPr>
+            <w:r>
+              <w:rPr>
+                <w:rFonts w:ascii="Arial" w:eastAsia="Arial" w:hAnsi="Arial" w:cs="Arial"/>
                 <w:sz w:val="16"/>
                 <w:szCs w:val="16"/>
               </w:rPr>
@@ -2868,15 +2693,15 @@
               <w:spacing w:after="0" w:line="240" w:lineRule="auto"/>
               <w:rPr>
                 <w:rFonts w:ascii="Arial" w:eastAsia="Arial" w:hAnsi="Arial" w:cs="Arial"/>
-                <w:sz w:val="16"/>
-                <w:szCs w:val="16"/>
-              </w:rPr>
-            </w:pPr>
-            <w:r>
-              <w:rPr>
-                <w:rFonts w:ascii="Arial" w:eastAsia="Arial" w:hAnsi="Arial" w:cs="Arial"/>
-                <w:sz w:val="16"/>
-                <w:szCs w:val="16"/>
+                <w:sz w:val="20"/>
+                <w:szCs w:val="20"/>
+              </w:rPr>
+            </w:pPr>
+            <w:r>
+              <w:rPr>
+                <w:rFonts w:ascii="Arial" w:eastAsia="Arial" w:hAnsi="Arial" w:cs="Arial"/>
+                <w:sz w:val="20"/>
+                <w:szCs w:val="20"/>
               </w:rPr>
               <w:t>Good knowledge of most procedures; anticipates next steps; goes beyond expectations and prepares ahead.</w:t>
             </w:r>
@@ -2893,36 +2718,18 @@
               <w:spacing w:after="0" w:line="240" w:lineRule="auto"/>
               <w:jc w:val="center"/>
               <w:rPr>
-                <w:rFonts w:asciiTheme="minorHAnsi" w:eastAsia="Arial" w:hAnsiTheme="minorHAnsi" w:cstheme="minorHAnsi"/>
-                <w:sz w:val="16"/>
-                <w:szCs w:val="16"/>
-              </w:rPr>
-            </w:pPr>
-            <w:r>
-              <w:rPr>
-                <w:rFonts w:asciiTheme="minorHAnsi" w:hAnsiTheme="minorHAnsi" w:cstheme="minorHAnsi"/>
-              </w:rPr>
-              <w:t xml:space="preserve">4 </w:t>
-            </w:r>
-            <w:r>
-              <w:rPr>
-                <w:rFonts w:asciiTheme="minorHAnsi" w:hAnsiTheme="minorHAnsi" w:cstheme="minorHAnsi"/>
-              </w:rPr>
-              <w:t>${</w:t>
-            </w:r>
-            <w:r>
-              <w:rPr>
-                <w:rFonts w:asciiTheme="minorHAnsi" w:eastAsia="Arial" w:hAnsiTheme="minorHAnsi" w:cstheme="minorHAnsi"/>
-                <w:sz w:val="16"/>
-                <w:szCs w:val="16"/>
-              </w:rPr>
-              <w:t>motivation</w:t>
-            </w:r>
-            <w:r>
-              <w:rPr>
-                <w:rFonts w:asciiTheme="minorHAnsi" w:hAnsiTheme="minorHAnsi" w:cstheme="minorHAnsi"/>
-              </w:rPr>
-              <w:t>_4}</w:t>
+                <w:rFonts w:ascii="Arial" w:eastAsia="Arial" w:hAnsi="Arial" w:cs="Arial"/>
+                <w:sz w:val="20"/>
+                <w:szCs w:val="20"/>
+              </w:rPr>
+            </w:pPr>
+            <w:r>
+              <w:rPr>
+                <w:rFonts w:ascii="Arial" w:hAnsi="Arial" w:cs="Arial"/>
+                <w:sz w:val="20"/>
+                <w:szCs w:val="20"/>
+              </w:rPr>
+              <w:t>4 [ ${motivation_4} ]</w:t>
             </w:r>
           </w:p>
         </w:tc>
@@ -2948,7 +2755,7 @@
               </w:pBdr>
               <w:spacing w:after="0" w:line="276" w:lineRule="auto"/>
               <w:rPr>
-                <w:rFonts w:asciiTheme="minorHAnsi" w:eastAsia="Arial" w:hAnsiTheme="minorHAnsi" w:cstheme="minorHAnsi"/>
+                <w:rFonts w:ascii="Arial" w:eastAsia="Arial" w:hAnsi="Arial" w:cs="Arial"/>
                 <w:sz w:val="16"/>
                 <w:szCs w:val="16"/>
               </w:rPr>
@@ -3003,15 +2810,15 @@
               <w:spacing w:after="0" w:line="240" w:lineRule="auto"/>
               <w:rPr>
                 <w:rFonts w:ascii="Arial" w:eastAsia="Arial" w:hAnsi="Arial" w:cs="Arial"/>
-                <w:sz w:val="16"/>
-                <w:szCs w:val="16"/>
-              </w:rPr>
-            </w:pPr>
-            <w:r>
-              <w:rPr>
-                <w:rFonts w:ascii="Arial" w:eastAsia="Arial" w:hAnsi="Arial" w:cs="Arial"/>
-                <w:sz w:val="16"/>
-                <w:szCs w:val="16"/>
+                <w:sz w:val="20"/>
+                <w:szCs w:val="20"/>
+              </w:rPr>
+            </w:pPr>
+            <w:r>
+              <w:rPr>
+                <w:rFonts w:ascii="Arial" w:eastAsia="Arial" w:hAnsi="Arial" w:cs="Arial"/>
+                <w:sz w:val="20"/>
+                <w:szCs w:val="20"/>
               </w:rPr>
               <w:t>Asks questions; has adequate degree of knowledge; does routine tasks without prompting; ready with tools.</w:t>
             </w:r>
@@ -3028,36 +2835,18 @@
               <w:spacing w:after="0" w:line="240" w:lineRule="auto"/>
               <w:jc w:val="center"/>
               <w:rPr>
-                <w:rFonts w:asciiTheme="minorHAnsi" w:eastAsia="Arial" w:hAnsiTheme="minorHAnsi" w:cstheme="minorHAnsi"/>
-                <w:sz w:val="16"/>
-                <w:szCs w:val="16"/>
-              </w:rPr>
-            </w:pPr>
-            <w:r>
-              <w:rPr>
-                <w:rFonts w:asciiTheme="minorHAnsi" w:hAnsiTheme="minorHAnsi" w:cstheme="minorHAnsi"/>
-              </w:rPr>
-              <w:t xml:space="preserve">3 </w:t>
-            </w:r>
-            <w:r>
-              <w:rPr>
-                <w:rFonts w:asciiTheme="minorHAnsi" w:hAnsiTheme="minorHAnsi" w:cstheme="minorHAnsi"/>
-              </w:rPr>
-              <w:t>${</w:t>
-            </w:r>
-            <w:r>
-              <w:rPr>
-                <w:rFonts w:asciiTheme="minorHAnsi" w:eastAsia="Arial" w:hAnsiTheme="minorHAnsi" w:cstheme="minorHAnsi"/>
-                <w:sz w:val="16"/>
-                <w:szCs w:val="16"/>
-              </w:rPr>
-              <w:t>motivation</w:t>
-            </w:r>
-            <w:r>
-              <w:rPr>
-                <w:rFonts w:asciiTheme="minorHAnsi" w:hAnsiTheme="minorHAnsi" w:cstheme="minorHAnsi"/>
-              </w:rPr>
-              <w:t>_3}</w:t>
+                <w:rFonts w:ascii="Arial" w:eastAsia="Arial" w:hAnsi="Arial" w:cs="Arial"/>
+                <w:sz w:val="20"/>
+                <w:szCs w:val="20"/>
+              </w:rPr>
+            </w:pPr>
+            <w:r>
+              <w:rPr>
+                <w:rFonts w:ascii="Arial" w:hAnsi="Arial" w:cs="Arial"/>
+                <w:sz w:val="20"/>
+                <w:szCs w:val="20"/>
+              </w:rPr>
+              <w:t>3 [ ${motivation_3} ]</w:t>
             </w:r>
           </w:p>
         </w:tc>
@@ -3083,7 +2872,7 @@
               </w:pBdr>
               <w:spacing w:after="0" w:line="276" w:lineRule="auto"/>
               <w:rPr>
-                <w:rFonts w:asciiTheme="minorHAnsi" w:eastAsia="Arial" w:hAnsiTheme="minorHAnsi" w:cstheme="minorHAnsi"/>
+                <w:rFonts w:ascii="Arial" w:eastAsia="Arial" w:hAnsi="Arial" w:cs="Arial"/>
                 <w:sz w:val="16"/>
                 <w:szCs w:val="16"/>
               </w:rPr>
@@ -3138,15 +2927,15 @@
               <w:spacing w:after="0" w:line="240" w:lineRule="auto"/>
               <w:rPr>
                 <w:rFonts w:ascii="Arial" w:eastAsia="Arial" w:hAnsi="Arial" w:cs="Arial"/>
-                <w:sz w:val="16"/>
-                <w:szCs w:val="16"/>
-              </w:rPr>
-            </w:pPr>
-            <w:r>
-              <w:rPr>
-                <w:rFonts w:ascii="Arial" w:eastAsia="Arial" w:hAnsi="Arial" w:cs="Arial"/>
-                <w:sz w:val="16"/>
-                <w:szCs w:val="16"/>
+                <w:sz w:val="20"/>
+                <w:szCs w:val="20"/>
+              </w:rPr>
+            </w:pPr>
+            <w:r>
+              <w:rPr>
+                <w:rFonts w:ascii="Arial" w:eastAsia="Arial" w:hAnsi="Arial" w:cs="Arial"/>
+                <w:sz w:val="20"/>
+                <w:szCs w:val="20"/>
               </w:rPr>
               <w:t>Does what is told; sometimes anticipates parts of the job; does no more than what is required; seems uninterested at times.</w:t>
             </w:r>
@@ -3163,36 +2952,18 @@
               <w:spacing w:after="0" w:line="240" w:lineRule="auto"/>
               <w:jc w:val="center"/>
               <w:rPr>
-                <w:rFonts w:asciiTheme="minorHAnsi" w:eastAsia="Arial" w:hAnsiTheme="minorHAnsi" w:cstheme="minorHAnsi"/>
-                <w:sz w:val="16"/>
-                <w:szCs w:val="16"/>
-              </w:rPr>
-            </w:pPr>
-            <w:r>
-              <w:rPr>
-                <w:rFonts w:asciiTheme="minorHAnsi" w:hAnsiTheme="minorHAnsi" w:cstheme="minorHAnsi"/>
-              </w:rPr>
-              <w:t xml:space="preserve">2 </w:t>
-            </w:r>
-            <w:r>
-              <w:rPr>
-                <w:rFonts w:asciiTheme="minorHAnsi" w:hAnsiTheme="minorHAnsi" w:cstheme="minorHAnsi"/>
-              </w:rPr>
-              <w:t>${</w:t>
-            </w:r>
-            <w:r>
-              <w:rPr>
-                <w:rFonts w:asciiTheme="minorHAnsi" w:eastAsia="Arial" w:hAnsiTheme="minorHAnsi" w:cstheme="minorHAnsi"/>
-                <w:sz w:val="16"/>
-                <w:szCs w:val="16"/>
-              </w:rPr>
-              <w:t>motivation</w:t>
-            </w:r>
-            <w:r>
-              <w:rPr>
-                <w:rFonts w:asciiTheme="minorHAnsi" w:hAnsiTheme="minorHAnsi" w:cstheme="minorHAnsi"/>
-              </w:rPr>
-              <w:t>_2}</w:t>
+                <w:rFonts w:ascii="Arial" w:eastAsia="Arial" w:hAnsi="Arial" w:cs="Arial"/>
+                <w:sz w:val="20"/>
+                <w:szCs w:val="20"/>
+              </w:rPr>
+            </w:pPr>
+            <w:r>
+              <w:rPr>
+                <w:rFonts w:ascii="Arial" w:hAnsi="Arial" w:cs="Arial"/>
+                <w:sz w:val="20"/>
+                <w:szCs w:val="20"/>
+              </w:rPr>
+              <w:t>2 [ ${motivation_2} ]</w:t>
             </w:r>
           </w:p>
         </w:tc>
@@ -3218,7 +2989,7 @@
               </w:pBdr>
               <w:spacing w:after="0" w:line="276" w:lineRule="auto"/>
               <w:rPr>
-                <w:rFonts w:asciiTheme="minorHAnsi" w:eastAsia="Arial" w:hAnsiTheme="minorHAnsi" w:cstheme="minorHAnsi"/>
+                <w:rFonts w:ascii="Arial" w:eastAsia="Arial" w:hAnsi="Arial" w:cs="Arial"/>
                 <w:sz w:val="16"/>
                 <w:szCs w:val="16"/>
               </w:rPr>
@@ -3273,15 +3044,15 @@
               <w:spacing w:after="0" w:line="240" w:lineRule="auto"/>
               <w:rPr>
                 <w:rFonts w:ascii="Arial" w:eastAsia="Arial" w:hAnsi="Arial" w:cs="Arial"/>
-                <w:sz w:val="16"/>
-                <w:szCs w:val="16"/>
-              </w:rPr>
-            </w:pPr>
-            <w:r>
-              <w:rPr>
-                <w:rFonts w:ascii="Arial" w:eastAsia="Arial" w:hAnsi="Arial" w:cs="Arial"/>
-                <w:sz w:val="16"/>
-                <w:szCs w:val="16"/>
+                <w:sz w:val="20"/>
+                <w:szCs w:val="20"/>
+              </w:rPr>
+            </w:pPr>
+            <w:r>
+              <w:rPr>
+                <w:rFonts w:ascii="Arial" w:eastAsia="Arial" w:hAnsi="Arial" w:cs="Arial"/>
+                <w:sz w:val="20"/>
+                <w:szCs w:val="20"/>
               </w:rPr>
               <w:t>Never anticipates requirements of any job or procedure; always wants or has to be told what to do; lacks initiatives, needs prodding.</w:t>
             </w:r>
@@ -3298,36 +3069,18 @@
               <w:spacing w:after="0" w:line="240" w:lineRule="auto"/>
               <w:jc w:val="center"/>
               <w:rPr>
-                <w:rFonts w:asciiTheme="minorHAnsi" w:eastAsia="Arial" w:hAnsiTheme="minorHAnsi" w:cstheme="minorHAnsi"/>
-                <w:sz w:val="16"/>
-                <w:szCs w:val="16"/>
-              </w:rPr>
-            </w:pPr>
-            <w:r>
-              <w:rPr>
-                <w:rFonts w:asciiTheme="minorHAnsi" w:hAnsiTheme="minorHAnsi" w:cstheme="minorHAnsi"/>
-              </w:rPr>
-              <w:t xml:space="preserve">1 </w:t>
-            </w:r>
-            <w:r>
-              <w:rPr>
-                <w:rFonts w:asciiTheme="minorHAnsi" w:hAnsiTheme="minorHAnsi" w:cstheme="minorHAnsi"/>
-              </w:rPr>
-              <w:t>${</w:t>
-            </w:r>
-            <w:r>
-              <w:rPr>
-                <w:rFonts w:asciiTheme="minorHAnsi" w:eastAsia="Arial" w:hAnsiTheme="minorHAnsi" w:cstheme="minorHAnsi"/>
-                <w:sz w:val="16"/>
-                <w:szCs w:val="16"/>
-              </w:rPr>
-              <w:t>motivation</w:t>
-            </w:r>
-            <w:r>
-              <w:rPr>
-                <w:rFonts w:asciiTheme="minorHAnsi" w:hAnsiTheme="minorHAnsi" w:cstheme="minorHAnsi"/>
-              </w:rPr>
-              <w:t>_1}</w:t>
+                <w:rFonts w:ascii="Arial" w:eastAsia="Arial" w:hAnsi="Arial" w:cs="Arial"/>
+                <w:sz w:val="20"/>
+                <w:szCs w:val="20"/>
+              </w:rPr>
+            </w:pPr>
+            <w:r>
+              <w:rPr>
+                <w:rFonts w:ascii="Arial" w:hAnsi="Arial" w:cs="Arial"/>
+                <w:sz w:val="20"/>
+                <w:szCs w:val="20"/>
+              </w:rPr>
+              <w:t>1 [ ${motivation_1} ]</w:t>
             </w:r>
           </w:p>
         </w:tc>
@@ -3353,7 +3106,7 @@
               </w:pBdr>
               <w:spacing w:after="0" w:line="276" w:lineRule="auto"/>
               <w:rPr>
-                <w:rFonts w:asciiTheme="minorHAnsi" w:eastAsia="Arial" w:hAnsiTheme="minorHAnsi" w:cstheme="minorHAnsi"/>
+                <w:rFonts w:ascii="Arial" w:eastAsia="Arial" w:hAnsi="Arial" w:cs="Arial"/>
                 <w:sz w:val="16"/>
                 <w:szCs w:val="16"/>
               </w:rPr>
@@ -3411,15 +3164,15 @@
               <w:spacing w:after="0" w:line="240" w:lineRule="auto"/>
               <w:rPr>
                 <w:rFonts w:ascii="Arial" w:eastAsia="Arial" w:hAnsi="Arial" w:cs="Arial"/>
-                <w:sz w:val="16"/>
-                <w:szCs w:val="16"/>
-              </w:rPr>
-            </w:pPr>
-            <w:r>
-              <w:rPr>
-                <w:rFonts w:ascii="Arial" w:eastAsia="Arial" w:hAnsi="Arial" w:cs="Arial"/>
-                <w:sz w:val="16"/>
-                <w:szCs w:val="16"/>
+                <w:sz w:val="20"/>
+                <w:szCs w:val="20"/>
+              </w:rPr>
+            </w:pPr>
+            <w:r>
+              <w:rPr>
+                <w:rFonts w:ascii="Arial" w:eastAsia="Arial" w:hAnsi="Arial" w:cs="Arial"/>
+                <w:sz w:val="20"/>
+                <w:szCs w:val="20"/>
               </w:rPr>
               <w:t>Work is very accurate; work meets or exceeds standards; takes pride in his/her work.</w:t>
             </w:r>
@@ -3436,36 +3189,18 @@
               <w:spacing w:after="0" w:line="240" w:lineRule="auto"/>
               <w:jc w:val="center"/>
               <w:rPr>
-                <w:rFonts w:asciiTheme="minorHAnsi" w:eastAsia="Arial" w:hAnsiTheme="minorHAnsi" w:cstheme="minorHAnsi"/>
-                <w:sz w:val="16"/>
-                <w:szCs w:val="16"/>
-              </w:rPr>
-            </w:pPr>
-            <w:r>
-              <w:rPr>
-                <w:rFonts w:asciiTheme="minorHAnsi" w:hAnsiTheme="minorHAnsi" w:cstheme="minorHAnsi"/>
-              </w:rPr>
-              <w:t xml:space="preserve">5 </w:t>
-            </w:r>
-            <w:r>
-              <w:rPr>
-                <w:rFonts w:asciiTheme="minorHAnsi" w:hAnsiTheme="minorHAnsi" w:cstheme="minorHAnsi"/>
-              </w:rPr>
-              <w:t>${</w:t>
-            </w:r>
-            <w:r>
-              <w:rPr>
-                <w:rFonts w:asciiTheme="minorHAnsi" w:eastAsia="Arial" w:hAnsiTheme="minorHAnsi" w:cstheme="minorHAnsi"/>
-                <w:sz w:val="16"/>
-                <w:szCs w:val="16"/>
-              </w:rPr>
-              <w:t>quality</w:t>
-            </w:r>
-            <w:r>
-              <w:rPr>
-                <w:rFonts w:asciiTheme="minorHAnsi" w:hAnsiTheme="minorHAnsi" w:cstheme="minorHAnsi"/>
-              </w:rPr>
-              <w:t>_5}</w:t>
+                <w:rFonts w:ascii="Arial" w:eastAsia="Arial" w:hAnsi="Arial" w:cs="Arial"/>
+                <w:sz w:val="20"/>
+                <w:szCs w:val="20"/>
+              </w:rPr>
+            </w:pPr>
+            <w:r>
+              <w:rPr>
+                <w:rFonts w:ascii="Arial" w:hAnsi="Arial" w:cs="Arial"/>
+                <w:sz w:val="20"/>
+                <w:szCs w:val="20"/>
+              </w:rPr>
+              <w:t>5 [ ${quantity_of_work_5} ]</w:t>
             </w:r>
           </w:p>
         </w:tc>
@@ -3484,14 +3219,14 @@
               <w:spacing w:after="0" w:line="240" w:lineRule="auto"/>
               <w:jc w:val="center"/>
               <w:rPr>
-                <w:rFonts w:asciiTheme="minorHAnsi" w:eastAsia="Arial" w:hAnsiTheme="minorHAnsi" w:cstheme="minorHAnsi"/>
-                <w:sz w:val="16"/>
-                <w:szCs w:val="16"/>
-              </w:rPr>
-            </w:pPr>
-            <w:r>
-              <w:rPr>
-                <w:rFonts w:asciiTheme="minorHAnsi" w:eastAsia="Arial" w:hAnsiTheme="minorHAnsi" w:cstheme="minorHAnsi"/>
+                <w:rFonts w:ascii="Arial" w:eastAsia="Arial" w:hAnsi="Arial" w:cs="Arial"/>
+                <w:sz w:val="16"/>
+                <w:szCs w:val="16"/>
+              </w:rPr>
+            </w:pPr>
+            <w:r>
+              <w:rPr>
+                <w:rFonts w:ascii="Arial" w:eastAsia="Arial" w:hAnsi="Arial" w:cs="Arial"/>
                 <w:sz w:val="16"/>
                 <w:szCs w:val="16"/>
               </w:rPr>
@@ -3547,15 +3282,15 @@
               <w:spacing w:after="0" w:line="240" w:lineRule="auto"/>
               <w:rPr>
                 <w:rFonts w:ascii="Arial" w:eastAsia="Arial" w:hAnsi="Arial" w:cs="Arial"/>
-                <w:sz w:val="16"/>
-                <w:szCs w:val="16"/>
-              </w:rPr>
-            </w:pPr>
-            <w:r>
-              <w:rPr>
-                <w:rFonts w:ascii="Arial" w:eastAsia="Arial" w:hAnsi="Arial" w:cs="Arial"/>
-                <w:sz w:val="16"/>
-                <w:szCs w:val="16"/>
+                <w:sz w:val="20"/>
+                <w:szCs w:val="20"/>
+              </w:rPr>
+            </w:pPr>
+            <w:r>
+              <w:rPr>
+                <w:rFonts w:ascii="Arial" w:eastAsia="Arial" w:hAnsi="Arial" w:cs="Arial"/>
+                <w:sz w:val="20"/>
+                <w:szCs w:val="20"/>
               </w:rPr>
               <w:t>Does good work; careful; makes very few mistakes; uses good judgment.</w:t>
             </w:r>
@@ -3572,36 +3307,18 @@
               <w:spacing w:after="0" w:line="240" w:lineRule="auto"/>
               <w:jc w:val="center"/>
               <w:rPr>
-                <w:rFonts w:asciiTheme="minorHAnsi" w:eastAsia="Arial" w:hAnsiTheme="minorHAnsi" w:cstheme="minorHAnsi"/>
-                <w:sz w:val="16"/>
-                <w:szCs w:val="16"/>
-              </w:rPr>
-            </w:pPr>
-            <w:r>
-              <w:rPr>
-                <w:rFonts w:asciiTheme="minorHAnsi" w:hAnsiTheme="minorHAnsi" w:cstheme="minorHAnsi"/>
-              </w:rPr>
-              <w:t xml:space="preserve">4 </w:t>
-            </w:r>
-            <w:r>
-              <w:rPr>
-                <w:rFonts w:asciiTheme="minorHAnsi" w:hAnsiTheme="minorHAnsi" w:cstheme="minorHAnsi"/>
-              </w:rPr>
-              <w:t>${</w:t>
-            </w:r>
-            <w:r>
-              <w:rPr>
-                <w:rFonts w:asciiTheme="minorHAnsi" w:eastAsia="Arial" w:hAnsiTheme="minorHAnsi" w:cstheme="minorHAnsi"/>
-                <w:sz w:val="16"/>
-                <w:szCs w:val="16"/>
-              </w:rPr>
-              <w:t>quality</w:t>
-            </w:r>
-            <w:r>
-              <w:rPr>
-                <w:rFonts w:asciiTheme="minorHAnsi" w:hAnsiTheme="minorHAnsi" w:cstheme="minorHAnsi"/>
-              </w:rPr>
-              <w:t>_4}</w:t>
+                <w:rFonts w:ascii="Arial" w:eastAsia="Arial" w:hAnsi="Arial" w:cs="Arial"/>
+                <w:sz w:val="20"/>
+                <w:szCs w:val="20"/>
+              </w:rPr>
+            </w:pPr>
+            <w:r>
+              <w:rPr>
+                <w:rFonts w:ascii="Arial" w:hAnsi="Arial" w:cs="Arial"/>
+                <w:sz w:val="20"/>
+                <w:szCs w:val="20"/>
+              </w:rPr>
+              <w:t>4 [ ${quantity_of_work_4} ]</w:t>
             </w:r>
           </w:p>
         </w:tc>
@@ -3627,7 +3344,7 @@
               </w:pBdr>
               <w:spacing w:after="0" w:line="276" w:lineRule="auto"/>
               <w:rPr>
-                <w:rFonts w:asciiTheme="minorHAnsi" w:eastAsia="Arial" w:hAnsiTheme="minorHAnsi" w:cstheme="minorHAnsi"/>
+                <w:rFonts w:ascii="Arial" w:eastAsia="Arial" w:hAnsi="Arial" w:cs="Arial"/>
                 <w:sz w:val="16"/>
                 <w:szCs w:val="16"/>
               </w:rPr>
@@ -3682,15 +3399,15 @@
               <w:spacing w:after="0" w:line="240" w:lineRule="auto"/>
               <w:rPr>
                 <w:rFonts w:ascii="Arial" w:eastAsia="Arial" w:hAnsi="Arial" w:cs="Arial"/>
-                <w:sz w:val="16"/>
-                <w:szCs w:val="16"/>
-              </w:rPr>
-            </w:pPr>
-            <w:r>
-              <w:rPr>
-                <w:rFonts w:ascii="Arial" w:eastAsia="Arial" w:hAnsi="Arial" w:cs="Arial"/>
-                <w:sz w:val="16"/>
-                <w:szCs w:val="16"/>
+                <w:sz w:val="20"/>
+                <w:szCs w:val="20"/>
+              </w:rPr>
+            </w:pPr>
+            <w:r>
+              <w:rPr>
+                <w:rFonts w:ascii="Arial" w:eastAsia="Arial" w:hAnsi="Arial" w:cs="Arial"/>
+                <w:sz w:val="20"/>
+                <w:szCs w:val="20"/>
               </w:rPr>
               <w:t>Work usually meets standard or expectations; needs some extra supervision.</w:t>
             </w:r>
@@ -3707,36 +3424,34 @@
               <w:spacing w:after="0" w:line="240" w:lineRule="auto"/>
               <w:jc w:val="center"/>
               <w:rPr>
-                <w:rFonts w:asciiTheme="minorHAnsi" w:eastAsia="Arial" w:hAnsiTheme="minorHAnsi" w:cstheme="minorHAnsi"/>
-                <w:sz w:val="16"/>
-                <w:szCs w:val="16"/>
-              </w:rPr>
-            </w:pPr>
-            <w:r>
-              <w:rPr>
-                <w:rFonts w:asciiTheme="minorHAnsi" w:hAnsiTheme="minorHAnsi" w:cstheme="minorHAnsi"/>
-              </w:rPr>
-              <w:t xml:space="preserve">3 </w:t>
-            </w:r>
-            <w:r>
-              <w:rPr>
-                <w:rFonts w:asciiTheme="minorHAnsi" w:hAnsiTheme="minorHAnsi" w:cstheme="minorHAnsi"/>
-              </w:rPr>
-              <w:t>${</w:t>
-            </w:r>
-            <w:r>
-              <w:rPr>
-                <w:rFonts w:asciiTheme="minorHAnsi" w:eastAsia="Arial" w:hAnsiTheme="minorHAnsi" w:cstheme="minorHAnsi"/>
-                <w:sz w:val="16"/>
-                <w:szCs w:val="16"/>
-              </w:rPr>
-              <w:t>quality</w:t>
-            </w:r>
-            <w:r>
-              <w:rPr>
-                <w:rFonts w:asciiTheme="minorHAnsi" w:hAnsiTheme="minorHAnsi" w:cstheme="minorHAnsi"/>
-              </w:rPr>
-              <w:t>_3}</w:t>
+                <w:rFonts w:ascii="Arial" w:eastAsia="Arial" w:hAnsi="Arial" w:cs="Arial"/>
+                <w:sz w:val="20"/>
+                <w:szCs w:val="20"/>
+              </w:rPr>
+            </w:pPr>
+            <w:r>
+              <w:rPr>
+                <w:rFonts w:ascii="Arial" w:hAnsi="Arial" w:cs="Arial"/>
+                <w:sz w:val="20"/>
+                <w:szCs w:val="20"/>
+              </w:rPr>
+              <w:t>3 [ ${quantity</w:t>
+            </w:r>
+            <w:r>
+              <w:rPr>
+                <w:rFonts w:ascii="Arial" w:hAnsi="Arial" w:cs="Arial"/>
+                <w:sz w:val="20"/>
+                <w:szCs w:val="20"/>
+              </w:rPr>
+              <w:t>_</w:t>
+            </w:r>
+            <w:r>
+              <w:rPr>
+                <w:rFonts w:ascii="Arial" w:hAnsi="Arial" w:cs="Arial"/>
+                <w:sz w:val="20"/>
+                <w:szCs w:val="20"/>
+              </w:rPr>
+              <w:t>of_work_3} ]</w:t>
             </w:r>
           </w:p>
         </w:tc>
@@ -3762,7 +3477,7 @@
               </w:pBdr>
               <w:spacing w:after="0" w:line="276" w:lineRule="auto"/>
               <w:rPr>
-                <w:rFonts w:asciiTheme="minorHAnsi" w:eastAsia="Arial" w:hAnsiTheme="minorHAnsi" w:cstheme="minorHAnsi"/>
+                <w:rFonts w:ascii="Arial" w:eastAsia="Arial" w:hAnsi="Arial" w:cs="Arial"/>
                 <w:sz w:val="16"/>
                 <w:szCs w:val="16"/>
               </w:rPr>
@@ -3817,15 +3532,15 @@
               <w:spacing w:after="0" w:line="240" w:lineRule="auto"/>
               <w:rPr>
                 <w:rFonts w:ascii="Arial" w:eastAsia="Arial" w:hAnsi="Arial" w:cs="Arial"/>
-                <w:sz w:val="16"/>
-                <w:szCs w:val="16"/>
-              </w:rPr>
-            </w:pPr>
-            <w:r>
-              <w:rPr>
-                <w:rFonts w:ascii="Arial" w:eastAsia="Arial" w:hAnsi="Arial" w:cs="Arial"/>
-                <w:sz w:val="16"/>
-                <w:szCs w:val="16"/>
+                <w:sz w:val="20"/>
+                <w:szCs w:val="20"/>
+              </w:rPr>
+            </w:pPr>
+            <w:r>
+              <w:rPr>
+                <w:rFonts w:ascii="Arial" w:eastAsia="Arial" w:hAnsi="Arial" w:cs="Arial"/>
+                <w:sz w:val="20"/>
+                <w:szCs w:val="20"/>
               </w:rPr>
               <w:t>Aims just to get by; careless; some job need to be reworked</w:t>
             </w:r>
@@ -3842,36 +3557,18 @@
               <w:spacing w:after="0" w:line="240" w:lineRule="auto"/>
               <w:jc w:val="center"/>
               <w:rPr>
-                <w:rFonts w:asciiTheme="minorHAnsi" w:eastAsia="Arial" w:hAnsiTheme="minorHAnsi" w:cstheme="minorHAnsi"/>
-                <w:sz w:val="16"/>
-                <w:szCs w:val="16"/>
-              </w:rPr>
-            </w:pPr>
-            <w:r>
-              <w:rPr>
-                <w:rFonts w:asciiTheme="minorHAnsi" w:hAnsiTheme="minorHAnsi" w:cstheme="minorHAnsi"/>
-              </w:rPr>
-              <w:t xml:space="preserve">2 </w:t>
-            </w:r>
-            <w:r>
-              <w:rPr>
-                <w:rFonts w:asciiTheme="minorHAnsi" w:hAnsiTheme="minorHAnsi" w:cstheme="minorHAnsi"/>
-              </w:rPr>
-              <w:t>${</w:t>
-            </w:r>
-            <w:r>
-              <w:rPr>
-                <w:rFonts w:asciiTheme="minorHAnsi" w:eastAsia="Arial" w:hAnsiTheme="minorHAnsi" w:cstheme="minorHAnsi"/>
-                <w:sz w:val="16"/>
-                <w:szCs w:val="16"/>
-              </w:rPr>
-              <w:t>quality</w:t>
-            </w:r>
-            <w:r>
-              <w:rPr>
-                <w:rFonts w:asciiTheme="minorHAnsi" w:hAnsiTheme="minorHAnsi" w:cstheme="minorHAnsi"/>
-              </w:rPr>
-              <w:t>_2}</w:t>
+                <w:rFonts w:ascii="Arial" w:eastAsia="Arial" w:hAnsi="Arial" w:cs="Arial"/>
+                <w:sz w:val="20"/>
+                <w:szCs w:val="20"/>
+              </w:rPr>
+            </w:pPr>
+            <w:r>
+              <w:rPr>
+                <w:rFonts w:ascii="Arial" w:hAnsi="Arial" w:cs="Arial"/>
+                <w:sz w:val="20"/>
+                <w:szCs w:val="20"/>
+              </w:rPr>
+              <w:t>2 [ ${quantity_of_work_2} ]</w:t>
             </w:r>
           </w:p>
         </w:tc>
@@ -3897,7 +3594,7 @@
               </w:pBdr>
               <w:spacing w:after="0" w:line="276" w:lineRule="auto"/>
               <w:rPr>
-                <w:rFonts w:asciiTheme="minorHAnsi" w:eastAsia="Arial" w:hAnsiTheme="minorHAnsi" w:cstheme="minorHAnsi"/>
+                <w:rFonts w:ascii="Arial" w:eastAsia="Arial" w:hAnsi="Arial" w:cs="Arial"/>
                 <w:sz w:val="16"/>
                 <w:szCs w:val="16"/>
               </w:rPr>
@@ -3955,15 +3652,15 @@
               <w:spacing w:after="0" w:line="240" w:lineRule="auto"/>
               <w:rPr>
                 <w:rFonts w:ascii="Arial" w:eastAsia="Arial" w:hAnsi="Arial" w:cs="Arial"/>
-                <w:sz w:val="16"/>
-                <w:szCs w:val="16"/>
-              </w:rPr>
-            </w:pPr>
-            <w:r>
-              <w:rPr>
-                <w:rFonts w:ascii="Arial" w:eastAsia="Arial" w:hAnsi="Arial" w:cs="Arial"/>
-                <w:sz w:val="16"/>
-                <w:szCs w:val="16"/>
+                <w:sz w:val="20"/>
+                <w:szCs w:val="20"/>
+              </w:rPr>
+            </w:pPr>
+            <w:r>
+              <w:rPr>
+                <w:rFonts w:ascii="Arial" w:eastAsia="Arial" w:hAnsi="Arial" w:cs="Arial"/>
+                <w:sz w:val="20"/>
+                <w:szCs w:val="20"/>
               </w:rPr>
               <w:t>Makes frequent mistakes; wastes materials; lacks mechanical ability; needs constant supervision.</w:t>
             </w:r>
@@ -3983,36 +3680,18 @@
               <w:spacing w:after="0" w:line="240" w:lineRule="auto"/>
               <w:jc w:val="center"/>
               <w:rPr>
-                <w:rFonts w:asciiTheme="minorHAnsi" w:eastAsia="Arial" w:hAnsiTheme="minorHAnsi" w:cstheme="minorHAnsi"/>
-                <w:sz w:val="16"/>
-                <w:szCs w:val="16"/>
-              </w:rPr>
-            </w:pPr>
-            <w:r>
-              <w:rPr>
-                <w:rFonts w:asciiTheme="minorHAnsi" w:hAnsiTheme="minorHAnsi" w:cstheme="minorHAnsi"/>
-              </w:rPr>
-              <w:t xml:space="preserve">1 </w:t>
-            </w:r>
-            <w:r>
-              <w:rPr>
-                <w:rFonts w:asciiTheme="minorHAnsi" w:hAnsiTheme="minorHAnsi" w:cstheme="minorHAnsi"/>
-              </w:rPr>
-              <w:t>${</w:t>
-            </w:r>
-            <w:r>
-              <w:rPr>
-                <w:rFonts w:asciiTheme="minorHAnsi" w:eastAsia="Arial" w:hAnsiTheme="minorHAnsi" w:cstheme="minorHAnsi"/>
-                <w:sz w:val="16"/>
-                <w:szCs w:val="16"/>
-              </w:rPr>
-              <w:t>quality</w:t>
-            </w:r>
-            <w:r>
-              <w:rPr>
-                <w:rFonts w:asciiTheme="minorHAnsi" w:hAnsiTheme="minorHAnsi" w:cstheme="minorHAnsi"/>
-              </w:rPr>
-              <w:t>_1}</w:t>
+                <w:rFonts w:ascii="Arial" w:eastAsia="Arial" w:hAnsi="Arial" w:cs="Arial"/>
+                <w:sz w:val="20"/>
+                <w:szCs w:val="20"/>
+              </w:rPr>
+            </w:pPr>
+            <w:r>
+              <w:rPr>
+                <w:rFonts w:ascii="Arial" w:hAnsi="Arial" w:cs="Arial"/>
+                <w:sz w:val="20"/>
+                <w:szCs w:val="20"/>
+              </w:rPr>
+              <w:t>1 [ ${quantity_of_work_1} ]</w:t>
             </w:r>
           </w:p>
         </w:tc>
@@ -4038,7 +3717,7 @@
               </w:pBdr>
               <w:spacing w:after="0" w:line="276" w:lineRule="auto"/>
               <w:rPr>
-                <w:rFonts w:asciiTheme="minorHAnsi" w:eastAsia="Arial" w:hAnsiTheme="minorHAnsi" w:cstheme="minorHAnsi"/>
+                <w:rFonts w:ascii="Arial" w:eastAsia="Arial" w:hAnsi="Arial" w:cs="Arial"/>
                 <w:sz w:val="16"/>
                 <w:szCs w:val="16"/>
               </w:rPr>
@@ -4130,18 +3809,18 @@
               <w:spacing w:after="0" w:line="240" w:lineRule="auto"/>
               <w:jc w:val="center"/>
               <w:rPr>
-                <w:rFonts w:asciiTheme="minorHAnsi" w:eastAsia="Arial" w:hAnsiTheme="minorHAnsi" w:cstheme="minorHAnsi"/>
+                <w:rFonts w:ascii="Arial" w:eastAsia="Arial" w:hAnsi="Arial" w:cs="Arial"/>
                 <w:b/>
-                <w:sz w:val="16"/>
-                <w:szCs w:val="16"/>
-              </w:rPr>
-            </w:pPr>
-            <w:r>
-              <w:rPr>
-                <w:rFonts w:asciiTheme="minorHAnsi" w:eastAsia="Arial" w:hAnsiTheme="minorHAnsi" w:cstheme="minorHAnsi"/>
+                <w:sz w:val="20"/>
+                <w:szCs w:val="20"/>
+              </w:rPr>
+            </w:pPr>
+            <w:r>
+              <w:rPr>
+                <w:rFonts w:ascii="Arial" w:eastAsia="Arial" w:hAnsi="Arial" w:cs="Arial"/>
                 <w:b/>
-                <w:sz w:val="16"/>
-                <w:szCs w:val="16"/>
+                <w:sz w:val="20"/>
+                <w:szCs w:val="20"/>
               </w:rPr>
               <w:t>RATING</w:t>
             </w:r>
@@ -4162,7 +3841,7 @@
               <w:spacing w:after="0" w:line="240" w:lineRule="auto"/>
               <w:jc w:val="center"/>
               <w:rPr>
-                <w:rFonts w:asciiTheme="minorHAnsi" w:eastAsia="Arial" w:hAnsiTheme="minorHAnsi" w:cstheme="minorHAnsi"/>
+                <w:rFonts w:ascii="Arial" w:eastAsia="Arial" w:hAnsi="Arial" w:cs="Arial"/>
                 <w:b/>
                 <w:sz w:val="16"/>
                 <w:szCs w:val="16"/>
@@ -4170,7 +3849,7 @@
             </w:pPr>
             <w:r>
               <w:rPr>
-                <w:rFonts w:asciiTheme="minorHAnsi" w:eastAsia="Arial" w:hAnsiTheme="minorHAnsi" w:cstheme="minorHAnsi"/>
+                <w:rFonts w:ascii="Arial" w:eastAsia="Arial" w:hAnsi="Arial" w:cs="Arial"/>
                 <w:b/>
                 <w:sz w:val="16"/>
                 <w:szCs w:val="16"/>
@@ -4230,15 +3909,15 @@
               <w:spacing w:after="0" w:line="240" w:lineRule="auto"/>
               <w:rPr>
                 <w:rFonts w:ascii="Arial" w:eastAsia="Arial" w:hAnsi="Arial" w:cs="Arial"/>
-                <w:sz w:val="16"/>
-                <w:szCs w:val="16"/>
-              </w:rPr>
-            </w:pPr>
-            <w:r>
-              <w:rPr>
-                <w:rFonts w:ascii="Arial" w:eastAsia="Arial" w:hAnsi="Arial" w:cs="Arial"/>
-                <w:sz w:val="16"/>
-                <w:szCs w:val="16"/>
+                <w:sz w:val="20"/>
+                <w:szCs w:val="20"/>
+              </w:rPr>
+            </w:pPr>
+            <w:r>
+              <w:rPr>
+                <w:rFonts w:ascii="Arial" w:eastAsia="Arial" w:hAnsi="Arial" w:cs="Arial"/>
+                <w:sz w:val="20"/>
+                <w:szCs w:val="20"/>
               </w:rPr>
               <w:t>Highly productive; fast and accurate; when finished with assigned tasks finds others task to advance the job.</w:t>
             </w:r>
@@ -4255,36 +3934,18 @@
               <w:spacing w:after="0" w:line="240" w:lineRule="auto"/>
               <w:jc w:val="center"/>
               <w:rPr>
-                <w:rFonts w:asciiTheme="minorHAnsi" w:eastAsia="Arial" w:hAnsiTheme="minorHAnsi" w:cstheme="minorHAnsi"/>
-                <w:sz w:val="16"/>
-                <w:szCs w:val="16"/>
-              </w:rPr>
-            </w:pPr>
-            <w:r>
-              <w:rPr>
-                <w:rFonts w:asciiTheme="minorHAnsi" w:hAnsiTheme="minorHAnsi" w:cstheme="minorHAnsi"/>
-              </w:rPr>
-              <w:t xml:space="preserve">5 </w:t>
-            </w:r>
-            <w:r>
-              <w:rPr>
-                <w:rFonts w:asciiTheme="minorHAnsi" w:hAnsiTheme="minorHAnsi" w:cstheme="minorHAnsi"/>
-              </w:rPr>
-              <w:t>${</w:t>
-            </w:r>
-            <w:r>
-              <w:rPr>
-                <w:rFonts w:asciiTheme="minorHAnsi" w:eastAsia="Arial" w:hAnsiTheme="minorHAnsi" w:cstheme="minorHAnsi"/>
-                <w:sz w:val="16"/>
-                <w:szCs w:val="16"/>
-              </w:rPr>
-              <w:t>quantity_of_work</w:t>
-            </w:r>
-            <w:r>
-              <w:rPr>
-                <w:rFonts w:asciiTheme="minorHAnsi" w:hAnsiTheme="minorHAnsi" w:cstheme="minorHAnsi"/>
-              </w:rPr>
-              <w:t>_5}</w:t>
+                <w:rFonts w:ascii="Arial" w:eastAsia="Arial" w:hAnsi="Arial" w:cs="Arial"/>
+                <w:sz w:val="20"/>
+                <w:szCs w:val="20"/>
+              </w:rPr>
+            </w:pPr>
+            <w:r>
+              <w:rPr>
+                <w:rFonts w:ascii="Arial" w:hAnsi="Arial" w:cs="Arial"/>
+                <w:sz w:val="20"/>
+                <w:szCs w:val="20"/>
+              </w:rPr>
+              <w:t>5 [ ${quantity_of_work_5} ]</w:t>
             </w:r>
           </w:p>
         </w:tc>
@@ -4303,14 +3964,14 @@
               <w:spacing w:after="0" w:line="240" w:lineRule="auto"/>
               <w:jc w:val="center"/>
               <w:rPr>
-                <w:rFonts w:asciiTheme="minorHAnsi" w:eastAsia="Arial" w:hAnsiTheme="minorHAnsi" w:cstheme="minorHAnsi"/>
-                <w:sz w:val="16"/>
-                <w:szCs w:val="16"/>
-              </w:rPr>
-            </w:pPr>
-            <w:r>
-              <w:rPr>
-                <w:rFonts w:asciiTheme="minorHAnsi" w:eastAsia="Arial" w:hAnsiTheme="minorHAnsi" w:cstheme="minorHAnsi"/>
+                <w:rFonts w:ascii="Arial" w:eastAsia="Arial" w:hAnsi="Arial" w:cs="Arial"/>
+                <w:sz w:val="16"/>
+                <w:szCs w:val="16"/>
+              </w:rPr>
+            </w:pPr>
+            <w:r>
+              <w:rPr>
+                <w:rFonts w:ascii="Arial" w:eastAsia="Arial" w:hAnsi="Arial" w:cs="Arial"/>
                 <w:sz w:val="16"/>
                 <w:szCs w:val="16"/>
               </w:rPr>
@@ -4318,7 +3979,7 @@
             </w:r>
             <w:r>
               <w:rPr>
-                <w:rFonts w:asciiTheme="minorHAnsi" w:eastAsia="Arial" w:hAnsiTheme="minorHAnsi" w:cstheme="minorHAnsi"/>
+                <w:rFonts w:ascii="Arial" w:eastAsia="Arial" w:hAnsi="Arial" w:cs="Arial"/>
                 <w:sz w:val="16"/>
                 <w:szCs w:val="16"/>
               </w:rPr>
@@ -4374,15 +4035,15 @@
               <w:spacing w:after="0" w:line="240" w:lineRule="auto"/>
               <w:rPr>
                 <w:rFonts w:ascii="Arial" w:eastAsia="Arial" w:hAnsi="Arial" w:cs="Arial"/>
-                <w:sz w:val="16"/>
-                <w:szCs w:val="16"/>
-              </w:rPr>
-            </w:pPr>
-            <w:r>
-              <w:rPr>
-                <w:rFonts w:ascii="Arial" w:eastAsia="Arial" w:hAnsi="Arial" w:cs="Arial"/>
-                <w:sz w:val="16"/>
-                <w:szCs w:val="16"/>
+                <w:sz w:val="20"/>
+                <w:szCs w:val="20"/>
+              </w:rPr>
+            </w:pPr>
+            <w:r>
+              <w:rPr>
+                <w:rFonts w:ascii="Arial" w:eastAsia="Arial" w:hAnsi="Arial" w:cs="Arial"/>
+                <w:sz w:val="20"/>
+                <w:szCs w:val="20"/>
               </w:rPr>
               <w:t>Plans work well; works efficient; gets expected work on time.</w:t>
             </w:r>
@@ -4399,36 +4060,18 @@
               <w:spacing w:after="0" w:line="240" w:lineRule="auto"/>
               <w:jc w:val="center"/>
               <w:rPr>
-                <w:rFonts w:asciiTheme="minorHAnsi" w:eastAsia="Arial" w:hAnsiTheme="minorHAnsi" w:cstheme="minorHAnsi"/>
-                <w:sz w:val="16"/>
-                <w:szCs w:val="16"/>
-              </w:rPr>
-            </w:pPr>
-            <w:r>
-              <w:rPr>
-                <w:rFonts w:asciiTheme="minorHAnsi" w:hAnsiTheme="minorHAnsi" w:cstheme="minorHAnsi"/>
-              </w:rPr>
-              <w:t xml:space="preserve">4 </w:t>
-            </w:r>
-            <w:r>
-              <w:rPr>
-                <w:rFonts w:asciiTheme="minorHAnsi" w:hAnsiTheme="minorHAnsi" w:cstheme="minorHAnsi"/>
-              </w:rPr>
-              <w:t>${</w:t>
-            </w:r>
-            <w:r>
-              <w:rPr>
-                <w:rFonts w:asciiTheme="minorHAnsi" w:eastAsia="Arial" w:hAnsiTheme="minorHAnsi" w:cstheme="minorHAnsi"/>
-                <w:sz w:val="16"/>
-                <w:szCs w:val="16"/>
-              </w:rPr>
-              <w:t>quantity_of_work</w:t>
-            </w:r>
-            <w:r>
-              <w:rPr>
-                <w:rFonts w:asciiTheme="minorHAnsi" w:hAnsiTheme="minorHAnsi" w:cstheme="minorHAnsi"/>
-              </w:rPr>
-              <w:t>_4}</w:t>
+                <w:rFonts w:ascii="Arial" w:eastAsia="Arial" w:hAnsi="Arial" w:cs="Arial"/>
+                <w:sz w:val="20"/>
+                <w:szCs w:val="20"/>
+              </w:rPr>
+            </w:pPr>
+            <w:r>
+              <w:rPr>
+                <w:rFonts w:ascii="Arial" w:hAnsi="Arial" w:cs="Arial"/>
+                <w:sz w:val="20"/>
+                <w:szCs w:val="20"/>
+              </w:rPr>
+              <w:t>4 [ ${quantity_of_work_4} ]</w:t>
             </w:r>
           </w:p>
         </w:tc>
@@ -4454,7 +4097,7 @@
               </w:pBdr>
               <w:spacing w:after="0" w:line="276" w:lineRule="auto"/>
               <w:rPr>
-                <w:rFonts w:asciiTheme="minorHAnsi" w:eastAsia="Arial" w:hAnsiTheme="minorHAnsi" w:cstheme="minorHAnsi"/>
+                <w:rFonts w:ascii="Arial" w:eastAsia="Arial" w:hAnsi="Arial" w:cs="Arial"/>
                 <w:sz w:val="16"/>
                 <w:szCs w:val="16"/>
               </w:rPr>
@@ -4509,15 +4152,15 @@
               <w:spacing w:after="0" w:line="240" w:lineRule="auto"/>
               <w:rPr>
                 <w:rFonts w:ascii="Arial" w:eastAsia="Arial" w:hAnsi="Arial" w:cs="Arial"/>
-                <w:sz w:val="16"/>
-                <w:szCs w:val="16"/>
-              </w:rPr>
-            </w:pPr>
-            <w:r>
-              <w:rPr>
-                <w:rFonts w:ascii="Arial" w:eastAsia="Arial" w:hAnsi="Arial" w:cs="Arial"/>
-                <w:sz w:val="16"/>
-                <w:szCs w:val="16"/>
+                <w:sz w:val="20"/>
+                <w:szCs w:val="20"/>
+              </w:rPr>
+            </w:pPr>
+            <w:r>
+              <w:rPr>
+                <w:rFonts w:ascii="Arial" w:eastAsia="Arial" w:hAnsi="Arial" w:cs="Arial"/>
+                <w:sz w:val="20"/>
+                <w:szCs w:val="20"/>
               </w:rPr>
               <w:t>Does fair share; looks busy but after finishing a task usually doesn’t look for other tasks that need to be done.</w:t>
             </w:r>
@@ -4534,36 +4177,18 @@
               <w:spacing w:after="0" w:line="240" w:lineRule="auto"/>
               <w:jc w:val="center"/>
               <w:rPr>
-                <w:rFonts w:asciiTheme="minorHAnsi" w:eastAsia="Arial" w:hAnsiTheme="minorHAnsi" w:cstheme="minorHAnsi"/>
-                <w:sz w:val="16"/>
-                <w:szCs w:val="16"/>
-              </w:rPr>
-            </w:pPr>
-            <w:r>
-              <w:rPr>
-                <w:rFonts w:asciiTheme="minorHAnsi" w:hAnsiTheme="minorHAnsi" w:cstheme="minorHAnsi"/>
-              </w:rPr>
-              <w:t xml:space="preserve">3 </w:t>
-            </w:r>
-            <w:r>
-              <w:rPr>
-                <w:rFonts w:asciiTheme="minorHAnsi" w:hAnsiTheme="minorHAnsi" w:cstheme="minorHAnsi"/>
-              </w:rPr>
-              <w:t>${</w:t>
-            </w:r>
-            <w:r>
-              <w:rPr>
-                <w:rFonts w:asciiTheme="minorHAnsi" w:eastAsia="Arial" w:hAnsiTheme="minorHAnsi" w:cstheme="minorHAnsi"/>
-                <w:sz w:val="16"/>
-                <w:szCs w:val="16"/>
-              </w:rPr>
-              <w:t>quantity_of_work</w:t>
-            </w:r>
-            <w:r>
-              <w:rPr>
-                <w:rFonts w:asciiTheme="minorHAnsi" w:hAnsiTheme="minorHAnsi" w:cstheme="minorHAnsi"/>
-              </w:rPr>
-              <w:t>_3}</w:t>
+                <w:rFonts w:ascii="Arial" w:eastAsia="Arial" w:hAnsi="Arial" w:cs="Arial"/>
+                <w:sz w:val="20"/>
+                <w:szCs w:val="20"/>
+              </w:rPr>
+            </w:pPr>
+            <w:r>
+              <w:rPr>
+                <w:rFonts w:ascii="Arial" w:hAnsi="Arial" w:cs="Arial"/>
+                <w:sz w:val="20"/>
+                <w:szCs w:val="20"/>
+              </w:rPr>
+              <w:t>3 [ ${quantity_of_work_3} ]</w:t>
             </w:r>
           </w:p>
         </w:tc>
@@ -4589,7 +4214,7 @@
               </w:pBdr>
               <w:spacing w:after="0" w:line="276" w:lineRule="auto"/>
               <w:rPr>
-                <w:rFonts w:asciiTheme="minorHAnsi" w:eastAsia="Arial" w:hAnsiTheme="minorHAnsi" w:cstheme="minorHAnsi"/>
+                <w:rFonts w:ascii="Arial" w:eastAsia="Arial" w:hAnsi="Arial" w:cs="Arial"/>
                 <w:sz w:val="16"/>
                 <w:szCs w:val="16"/>
               </w:rPr>
@@ -4644,15 +4269,15 @@
               <w:spacing w:after="0" w:line="240" w:lineRule="auto"/>
               <w:rPr>
                 <w:rFonts w:ascii="Arial" w:eastAsia="Arial" w:hAnsi="Arial" w:cs="Arial"/>
-                <w:sz w:val="16"/>
-                <w:szCs w:val="16"/>
-              </w:rPr>
-            </w:pPr>
-            <w:r>
-              <w:rPr>
-                <w:rFonts w:ascii="Arial" w:eastAsia="Arial" w:hAnsi="Arial" w:cs="Arial"/>
-                <w:sz w:val="16"/>
-                <w:szCs w:val="16"/>
+                <w:sz w:val="20"/>
+                <w:szCs w:val="20"/>
+              </w:rPr>
+            </w:pPr>
+            <w:r>
+              <w:rPr>
+                <w:rFonts w:ascii="Arial" w:eastAsia="Arial" w:hAnsi="Arial" w:cs="Arial"/>
+                <w:sz w:val="20"/>
+                <w:szCs w:val="20"/>
               </w:rPr>
               <w:t>Does less than expected; does just enough to get by; requires additional oversight.</w:t>
             </w:r>
@@ -4669,36 +4294,27 @@
               <w:spacing w:after="0" w:line="240" w:lineRule="auto"/>
               <w:jc w:val="center"/>
               <w:rPr>
-                <w:rFonts w:asciiTheme="minorHAnsi" w:eastAsia="Arial" w:hAnsiTheme="minorHAnsi" w:cstheme="minorHAnsi"/>
-                <w:sz w:val="16"/>
-                <w:szCs w:val="16"/>
-              </w:rPr>
-            </w:pPr>
-            <w:r>
-              <w:rPr>
-                <w:rFonts w:asciiTheme="minorHAnsi" w:hAnsiTheme="minorHAnsi" w:cstheme="minorHAnsi"/>
-              </w:rPr>
-              <w:t xml:space="preserve">2 </w:t>
-            </w:r>
-            <w:r>
-              <w:rPr>
-                <w:rFonts w:asciiTheme="minorHAnsi" w:hAnsiTheme="minorHAnsi" w:cstheme="minorHAnsi"/>
-              </w:rPr>
-              <w:t>${</w:t>
-            </w:r>
-            <w:r>
-              <w:rPr>
-                <w:rFonts w:asciiTheme="minorHAnsi" w:eastAsia="Arial" w:hAnsiTheme="minorHAnsi" w:cstheme="minorHAnsi"/>
-                <w:sz w:val="16"/>
-                <w:szCs w:val="16"/>
-              </w:rPr>
-              <w:t>quantity_of_work</w:t>
-            </w:r>
-            <w:r>
-              <w:rPr>
-                <w:rFonts w:asciiTheme="minorHAnsi" w:hAnsiTheme="minorHAnsi" w:cstheme="minorHAnsi"/>
-              </w:rPr>
-              <w:t>_2}</w:t>
+                <w:rFonts w:ascii="Arial" w:eastAsia="Arial" w:hAnsi="Arial" w:cs="Arial"/>
+                <w:sz w:val="20"/>
+                <w:szCs w:val="20"/>
+              </w:rPr>
+            </w:pPr>
+            <w:r>
+              <w:rPr>
+                <w:rFonts w:ascii="Arial" w:hAnsi="Arial" w:cs="Arial"/>
+                <w:sz w:val="20"/>
+                <w:szCs w:val="20"/>
+              </w:rPr>
+              <w:t>2 [ ${qua</w:t>
+            </w:r>
+            <w:r>
+              <w:rPr>
+                <w:rFonts w:ascii="Arial" w:hAnsi="Arial" w:cs="Arial"/>
+                <w:sz w:val="20"/>
+                <w:szCs w:val="20"/>
+              </w:rPr>
+              <w:lastRenderedPageBreak/>
+              <w:t>ntity_of_work_2} ]</w:t>
             </w:r>
           </w:p>
         </w:tc>
@@ -4724,7 +4340,7 @@
               </w:pBdr>
               <w:spacing w:after="0" w:line="276" w:lineRule="auto"/>
               <w:rPr>
-                <w:rFonts w:asciiTheme="minorHAnsi" w:eastAsia="Arial" w:hAnsiTheme="minorHAnsi" w:cstheme="minorHAnsi"/>
+                <w:rFonts w:ascii="Arial" w:eastAsia="Arial" w:hAnsi="Arial" w:cs="Arial"/>
                 <w:sz w:val="16"/>
                 <w:szCs w:val="16"/>
               </w:rPr>
@@ -4779,15 +4395,15 @@
               <w:spacing w:after="0" w:line="240" w:lineRule="auto"/>
               <w:rPr>
                 <w:rFonts w:ascii="Arial" w:eastAsia="Arial" w:hAnsi="Arial" w:cs="Arial"/>
-                <w:sz w:val="16"/>
-                <w:szCs w:val="16"/>
-              </w:rPr>
-            </w:pPr>
-            <w:r>
-              <w:rPr>
-                <w:rFonts w:ascii="Arial" w:eastAsia="Arial" w:hAnsi="Arial" w:cs="Arial"/>
-                <w:sz w:val="16"/>
-                <w:szCs w:val="16"/>
+                <w:sz w:val="20"/>
+                <w:szCs w:val="20"/>
+              </w:rPr>
+            </w:pPr>
+            <w:r>
+              <w:rPr>
+                <w:rFonts w:ascii="Arial" w:eastAsia="Arial" w:hAnsi="Arial" w:cs="Arial"/>
+                <w:sz w:val="20"/>
+                <w:szCs w:val="20"/>
               </w:rPr>
               <w:t>Doesn’t plans work; slow; procedures very little; wastes time; continually visiting with others which slows down the work.</w:t>
             </w:r>
@@ -4804,36 +4420,18 @@
               <w:spacing w:after="0" w:line="240" w:lineRule="auto"/>
               <w:jc w:val="center"/>
               <w:rPr>
-                <w:rFonts w:asciiTheme="minorHAnsi" w:eastAsia="Arial" w:hAnsiTheme="minorHAnsi" w:cstheme="minorHAnsi"/>
-                <w:sz w:val="16"/>
-                <w:szCs w:val="16"/>
-              </w:rPr>
-            </w:pPr>
-            <w:r>
-              <w:rPr>
-                <w:rFonts w:asciiTheme="minorHAnsi" w:hAnsiTheme="minorHAnsi" w:cstheme="minorHAnsi"/>
-              </w:rPr>
-              <w:t xml:space="preserve">1 </w:t>
-            </w:r>
-            <w:r>
-              <w:rPr>
-                <w:rFonts w:asciiTheme="minorHAnsi" w:hAnsiTheme="minorHAnsi" w:cstheme="minorHAnsi"/>
-              </w:rPr>
-              <w:t>${</w:t>
-            </w:r>
-            <w:r>
-              <w:rPr>
-                <w:rFonts w:asciiTheme="minorHAnsi" w:eastAsia="Arial" w:hAnsiTheme="minorHAnsi" w:cstheme="minorHAnsi"/>
-                <w:sz w:val="16"/>
-                <w:szCs w:val="16"/>
-              </w:rPr>
-              <w:t>quantity_of_work</w:t>
-            </w:r>
-            <w:r>
-              <w:rPr>
-                <w:rFonts w:asciiTheme="minorHAnsi" w:hAnsiTheme="minorHAnsi" w:cstheme="minorHAnsi"/>
-              </w:rPr>
-              <w:t>_1}</w:t>
+                <w:rFonts w:ascii="Arial" w:eastAsia="Arial" w:hAnsi="Arial" w:cs="Arial"/>
+                <w:sz w:val="20"/>
+                <w:szCs w:val="20"/>
+              </w:rPr>
+            </w:pPr>
+            <w:r>
+              <w:rPr>
+                <w:rFonts w:ascii="Arial" w:hAnsi="Arial" w:cs="Arial"/>
+                <w:sz w:val="20"/>
+                <w:szCs w:val="20"/>
+              </w:rPr>
+              <w:t>1 [ ${quantity_of_work_1} ]</w:t>
             </w:r>
           </w:p>
         </w:tc>
@@ -4859,7 +4457,7 @@
               </w:pBdr>
               <w:spacing w:after="0" w:line="276" w:lineRule="auto"/>
               <w:rPr>
-                <w:rFonts w:asciiTheme="minorHAnsi" w:eastAsia="Arial" w:hAnsiTheme="minorHAnsi" w:cstheme="minorHAnsi"/>
+                <w:rFonts w:ascii="Arial" w:eastAsia="Arial" w:hAnsi="Arial" w:cs="Arial"/>
                 <w:sz w:val="16"/>
                 <w:szCs w:val="16"/>
               </w:rPr>
@@ -4917,15 +4515,15 @@
               <w:spacing w:after="0" w:line="240" w:lineRule="auto"/>
               <w:rPr>
                 <w:rFonts w:ascii="Arial" w:eastAsia="Arial" w:hAnsi="Arial" w:cs="Arial"/>
-                <w:sz w:val="16"/>
-                <w:szCs w:val="16"/>
-              </w:rPr>
-            </w:pPr>
-            <w:r>
-              <w:rPr>
-                <w:rFonts w:ascii="Arial" w:eastAsia="Arial" w:hAnsi="Arial" w:cs="Arial"/>
-                <w:sz w:val="16"/>
-                <w:szCs w:val="16"/>
+                <w:sz w:val="20"/>
+                <w:szCs w:val="20"/>
+              </w:rPr>
+            </w:pPr>
+            <w:r>
+              <w:rPr>
+                <w:rFonts w:ascii="Arial" w:eastAsia="Arial" w:hAnsi="Arial" w:cs="Arial"/>
+                <w:sz w:val="20"/>
+                <w:szCs w:val="20"/>
               </w:rPr>
               <w:t>Always places safety first; helps others to be safe; does not take chances which might endangered self and others.</w:t>
             </w:r>
@@ -4942,36 +4540,18 @@
               <w:spacing w:after="0" w:line="240" w:lineRule="auto"/>
               <w:jc w:val="center"/>
               <w:rPr>
-                <w:rFonts w:asciiTheme="minorHAnsi" w:eastAsia="Arial" w:hAnsiTheme="minorHAnsi" w:cstheme="minorHAnsi"/>
-                <w:sz w:val="16"/>
-                <w:szCs w:val="16"/>
-              </w:rPr>
-            </w:pPr>
-            <w:r>
-              <w:rPr>
-                <w:rFonts w:asciiTheme="minorHAnsi" w:hAnsiTheme="minorHAnsi" w:cstheme="minorHAnsi"/>
-              </w:rPr>
-              <w:t xml:space="preserve">5 </w:t>
-            </w:r>
-            <w:r>
-              <w:rPr>
-                <w:rFonts w:asciiTheme="minorHAnsi" w:hAnsiTheme="minorHAnsi" w:cstheme="minorHAnsi"/>
-              </w:rPr>
-              <w:t>${</w:t>
-            </w:r>
-            <w:r>
-              <w:rPr>
-                <w:rFonts w:asciiTheme="minorHAnsi" w:eastAsia="Arial" w:hAnsiTheme="minorHAnsi" w:cstheme="minorHAnsi"/>
-                <w:sz w:val="16"/>
-                <w:szCs w:val="16"/>
-              </w:rPr>
-              <w:t>safety_practice</w:t>
-            </w:r>
-            <w:r>
-              <w:rPr>
-                <w:rFonts w:asciiTheme="minorHAnsi" w:hAnsiTheme="minorHAnsi" w:cstheme="minorHAnsi"/>
-              </w:rPr>
-              <w:t>_5}</w:t>
+                <w:rFonts w:ascii="Arial" w:eastAsia="Arial" w:hAnsi="Arial" w:cs="Arial"/>
+                <w:sz w:val="20"/>
+                <w:szCs w:val="20"/>
+              </w:rPr>
+            </w:pPr>
+            <w:r>
+              <w:rPr>
+                <w:rFonts w:ascii="Arial" w:hAnsi="Arial" w:cs="Arial"/>
+                <w:sz w:val="20"/>
+                <w:szCs w:val="20"/>
+              </w:rPr>
+              <w:t>5 [ ${safety_practice_5} ]</w:t>
             </w:r>
           </w:p>
         </w:tc>
@@ -4990,14 +4570,14 @@
               <w:spacing w:after="0" w:line="240" w:lineRule="auto"/>
               <w:jc w:val="center"/>
               <w:rPr>
-                <w:rFonts w:asciiTheme="minorHAnsi" w:eastAsia="Arial" w:hAnsiTheme="minorHAnsi" w:cstheme="minorHAnsi"/>
-                <w:sz w:val="16"/>
-                <w:szCs w:val="16"/>
-              </w:rPr>
-            </w:pPr>
-            <w:r>
-              <w:rPr>
-                <w:rFonts w:asciiTheme="minorHAnsi" w:eastAsia="Arial" w:hAnsiTheme="minorHAnsi" w:cstheme="minorHAnsi"/>
+                <w:rFonts w:ascii="Arial" w:eastAsia="Arial" w:hAnsi="Arial" w:cs="Arial"/>
+                <w:sz w:val="16"/>
+                <w:szCs w:val="16"/>
+              </w:rPr>
+            </w:pPr>
+            <w:r>
+              <w:rPr>
+                <w:rFonts w:ascii="Arial" w:eastAsia="Arial" w:hAnsi="Arial" w:cs="Arial"/>
                 <w:sz w:val="16"/>
                 <w:szCs w:val="16"/>
               </w:rPr>
@@ -5053,15 +4633,15 @@
               <w:spacing w:after="0" w:line="240" w:lineRule="auto"/>
               <w:rPr>
                 <w:rFonts w:ascii="Arial" w:eastAsia="Arial" w:hAnsi="Arial" w:cs="Arial"/>
-                <w:sz w:val="16"/>
-                <w:szCs w:val="16"/>
-              </w:rPr>
-            </w:pPr>
-            <w:r>
-              <w:rPr>
-                <w:rFonts w:ascii="Arial" w:eastAsia="Arial" w:hAnsi="Arial" w:cs="Arial"/>
-                <w:sz w:val="16"/>
-                <w:szCs w:val="16"/>
+                <w:sz w:val="20"/>
+                <w:szCs w:val="20"/>
+              </w:rPr>
+            </w:pPr>
+            <w:r>
+              <w:rPr>
+                <w:rFonts w:ascii="Arial" w:eastAsia="Arial" w:hAnsi="Arial" w:cs="Arial"/>
+                <w:sz w:val="20"/>
+                <w:szCs w:val="20"/>
               </w:rPr>
               <w:t>Observes safety precautions; uses correct tools and wears appropriate safety apparel.</w:t>
             </w:r>
@@ -5078,36 +4658,18 @@
               <w:spacing w:after="0" w:line="240" w:lineRule="auto"/>
               <w:jc w:val="center"/>
               <w:rPr>
-                <w:rFonts w:asciiTheme="minorHAnsi" w:eastAsia="Arial" w:hAnsiTheme="minorHAnsi" w:cstheme="minorHAnsi"/>
-                <w:sz w:val="16"/>
-                <w:szCs w:val="16"/>
-              </w:rPr>
-            </w:pPr>
-            <w:r>
-              <w:rPr>
-                <w:rFonts w:asciiTheme="minorHAnsi" w:hAnsiTheme="minorHAnsi" w:cstheme="minorHAnsi"/>
-              </w:rPr>
-              <w:t xml:space="preserve">4 </w:t>
-            </w:r>
-            <w:r>
-              <w:rPr>
-                <w:rFonts w:asciiTheme="minorHAnsi" w:hAnsiTheme="minorHAnsi" w:cstheme="minorHAnsi"/>
-              </w:rPr>
-              <w:t>${</w:t>
-            </w:r>
-            <w:r>
-              <w:rPr>
-                <w:rFonts w:asciiTheme="minorHAnsi" w:eastAsia="Arial" w:hAnsiTheme="minorHAnsi" w:cstheme="minorHAnsi"/>
-                <w:sz w:val="16"/>
-                <w:szCs w:val="16"/>
-              </w:rPr>
-              <w:t>safety_practice</w:t>
-            </w:r>
-            <w:r>
-              <w:rPr>
-                <w:rFonts w:asciiTheme="minorHAnsi" w:hAnsiTheme="minorHAnsi" w:cstheme="minorHAnsi"/>
-              </w:rPr>
-              <w:t>_4}</w:t>
+                <w:rFonts w:ascii="Arial" w:eastAsia="Arial" w:hAnsi="Arial" w:cs="Arial"/>
+                <w:sz w:val="20"/>
+                <w:szCs w:val="20"/>
+              </w:rPr>
+            </w:pPr>
+            <w:r>
+              <w:rPr>
+                <w:rFonts w:ascii="Arial" w:hAnsi="Arial" w:cs="Arial"/>
+                <w:sz w:val="20"/>
+                <w:szCs w:val="20"/>
+              </w:rPr>
+              <w:t>4 [ ${safety_practice_4} ]</w:t>
             </w:r>
           </w:p>
         </w:tc>
@@ -5133,7 +4695,7 @@
               </w:pBdr>
               <w:spacing w:after="0" w:line="276" w:lineRule="auto"/>
               <w:rPr>
-                <w:rFonts w:asciiTheme="minorHAnsi" w:eastAsia="Arial" w:hAnsiTheme="minorHAnsi" w:cstheme="minorHAnsi"/>
+                <w:rFonts w:ascii="Arial" w:eastAsia="Arial" w:hAnsi="Arial" w:cs="Arial"/>
                 <w:sz w:val="16"/>
                 <w:szCs w:val="16"/>
               </w:rPr>
@@ -5188,15 +4750,15 @@
               <w:spacing w:after="0" w:line="240" w:lineRule="auto"/>
               <w:rPr>
                 <w:rFonts w:ascii="Arial" w:eastAsia="Arial" w:hAnsi="Arial" w:cs="Arial"/>
-                <w:sz w:val="16"/>
-                <w:szCs w:val="16"/>
-              </w:rPr>
-            </w:pPr>
-            <w:r>
-              <w:rPr>
-                <w:rFonts w:ascii="Arial" w:eastAsia="Arial" w:hAnsi="Arial" w:cs="Arial"/>
-                <w:sz w:val="16"/>
-                <w:szCs w:val="16"/>
+                <w:sz w:val="20"/>
+                <w:szCs w:val="20"/>
+              </w:rPr>
+            </w:pPr>
+            <w:r>
+              <w:rPr>
+                <w:rFonts w:ascii="Arial" w:eastAsia="Arial" w:hAnsi="Arial" w:cs="Arial"/>
+                <w:sz w:val="20"/>
+                <w:szCs w:val="20"/>
               </w:rPr>
               <w:t>Usually follows most safety procedures; usually does the job in safe manner.</w:t>
             </w:r>
@@ -5213,36 +4775,18 @@
               <w:spacing w:after="0" w:line="240" w:lineRule="auto"/>
               <w:jc w:val="center"/>
               <w:rPr>
-                <w:rFonts w:asciiTheme="minorHAnsi" w:eastAsia="Arial" w:hAnsiTheme="minorHAnsi" w:cstheme="minorHAnsi"/>
-                <w:sz w:val="16"/>
-                <w:szCs w:val="16"/>
-              </w:rPr>
-            </w:pPr>
-            <w:r>
-              <w:rPr>
-                <w:rFonts w:asciiTheme="minorHAnsi" w:hAnsiTheme="minorHAnsi" w:cstheme="minorHAnsi"/>
-              </w:rPr>
-              <w:t xml:space="preserve">3 </w:t>
-            </w:r>
-            <w:r>
-              <w:rPr>
-                <w:rFonts w:asciiTheme="minorHAnsi" w:hAnsiTheme="minorHAnsi" w:cstheme="minorHAnsi"/>
-              </w:rPr>
-              <w:t>${</w:t>
-            </w:r>
-            <w:r>
-              <w:rPr>
-                <w:rFonts w:asciiTheme="minorHAnsi" w:eastAsia="Arial" w:hAnsiTheme="minorHAnsi" w:cstheme="minorHAnsi"/>
-                <w:sz w:val="16"/>
-                <w:szCs w:val="16"/>
-              </w:rPr>
-              <w:t>safety_practice</w:t>
-            </w:r>
-            <w:r>
-              <w:rPr>
-                <w:rFonts w:asciiTheme="minorHAnsi" w:hAnsiTheme="minorHAnsi" w:cstheme="minorHAnsi"/>
-              </w:rPr>
-              <w:t>_3}</w:t>
+                <w:rFonts w:ascii="Arial" w:eastAsia="Arial" w:hAnsi="Arial" w:cs="Arial"/>
+                <w:sz w:val="20"/>
+                <w:szCs w:val="20"/>
+              </w:rPr>
+            </w:pPr>
+            <w:r>
+              <w:rPr>
+                <w:rFonts w:ascii="Arial" w:hAnsi="Arial" w:cs="Arial"/>
+                <w:sz w:val="20"/>
+                <w:szCs w:val="20"/>
+              </w:rPr>
+              <w:t>3 [ ${safety_practice_3} ]</w:t>
             </w:r>
           </w:p>
         </w:tc>
@@ -5268,7 +4812,7 @@
               </w:pBdr>
               <w:spacing w:after="0" w:line="276" w:lineRule="auto"/>
               <w:rPr>
-                <w:rFonts w:asciiTheme="minorHAnsi" w:eastAsia="Arial" w:hAnsiTheme="minorHAnsi" w:cstheme="minorHAnsi"/>
+                <w:rFonts w:ascii="Arial" w:eastAsia="Arial" w:hAnsi="Arial" w:cs="Arial"/>
                 <w:sz w:val="16"/>
                 <w:szCs w:val="16"/>
               </w:rPr>
@@ -5323,15 +4867,15 @@
               <w:spacing w:after="0" w:line="240" w:lineRule="auto"/>
               <w:rPr>
                 <w:rFonts w:ascii="Arial" w:eastAsia="Arial" w:hAnsi="Arial" w:cs="Arial"/>
-                <w:sz w:val="16"/>
-                <w:szCs w:val="16"/>
-              </w:rPr>
-            </w:pPr>
-            <w:r>
-              <w:rPr>
-                <w:rFonts w:ascii="Arial" w:eastAsia="Arial" w:hAnsi="Arial" w:cs="Arial"/>
-                <w:sz w:val="16"/>
-                <w:szCs w:val="16"/>
+                <w:sz w:val="20"/>
+                <w:szCs w:val="20"/>
+              </w:rPr>
+            </w:pPr>
+            <w:r>
+              <w:rPr>
+                <w:rFonts w:ascii="Arial" w:eastAsia="Arial" w:hAnsi="Arial" w:cs="Arial"/>
+                <w:sz w:val="20"/>
+                <w:szCs w:val="20"/>
               </w:rPr>
               <w:t>Careless, takes shortcuts which can create safety hazards.</w:t>
             </w:r>
@@ -5348,45 +4892,18 @@
               <w:spacing w:after="0" w:line="240" w:lineRule="auto"/>
               <w:jc w:val="center"/>
               <w:rPr>
-                <w:rFonts w:asciiTheme="minorHAnsi" w:eastAsia="Arial" w:hAnsiTheme="minorHAnsi" w:cstheme="minorHAnsi"/>
-                <w:sz w:val="16"/>
-                <w:szCs w:val="16"/>
-              </w:rPr>
-            </w:pPr>
-            <w:r>
-              <w:rPr>
-                <w:rFonts w:asciiTheme="minorHAnsi" w:hAnsiTheme="minorHAnsi" w:cstheme="minorHAnsi"/>
-              </w:rPr>
-              <w:t xml:space="preserve">2 </w:t>
-            </w:r>
-            <w:r>
-              <w:rPr>
-                <w:rFonts w:asciiTheme="minorHAnsi" w:hAnsiTheme="minorHAnsi" w:cstheme="minorHAnsi"/>
-              </w:rPr>
-              <w:t>${</w:t>
-            </w:r>
-            <w:r>
-              <w:rPr>
-                <w:rFonts w:asciiTheme="minorHAnsi" w:eastAsia="Arial" w:hAnsiTheme="minorHAnsi" w:cstheme="minorHAnsi"/>
-                <w:sz w:val="16"/>
-                <w:szCs w:val="16"/>
-              </w:rPr>
-              <w:t>safety</w:t>
-            </w:r>
-            <w:r>
-              <w:rPr>
-                <w:rFonts w:asciiTheme="minorHAnsi" w:eastAsia="Arial" w:hAnsiTheme="minorHAnsi" w:cstheme="minorHAnsi"/>
-                <w:sz w:val="16"/>
-                <w:szCs w:val="16"/>
-              </w:rPr>
-              <w:lastRenderedPageBreak/>
-              <w:t>_practice</w:t>
-            </w:r>
-            <w:r>
-              <w:rPr>
-                <w:rFonts w:asciiTheme="minorHAnsi" w:hAnsiTheme="minorHAnsi" w:cstheme="minorHAnsi"/>
-              </w:rPr>
-              <w:t>_2}</w:t>
+                <w:rFonts w:ascii="Arial" w:eastAsia="Arial" w:hAnsi="Arial" w:cs="Arial"/>
+                <w:sz w:val="20"/>
+                <w:szCs w:val="20"/>
+              </w:rPr>
+            </w:pPr>
+            <w:r>
+              <w:rPr>
+                <w:rFonts w:ascii="Arial" w:hAnsi="Arial" w:cs="Arial"/>
+                <w:sz w:val="20"/>
+                <w:szCs w:val="20"/>
+              </w:rPr>
+              <w:t>2 [ ${safety_practice_2} ]</w:t>
             </w:r>
           </w:p>
         </w:tc>
@@ -5412,7 +4929,7 @@
               </w:pBdr>
               <w:spacing w:after="0" w:line="276" w:lineRule="auto"/>
               <w:rPr>
-                <w:rFonts w:asciiTheme="minorHAnsi" w:eastAsia="Arial" w:hAnsiTheme="minorHAnsi" w:cstheme="minorHAnsi"/>
+                <w:rFonts w:ascii="Arial" w:eastAsia="Arial" w:hAnsi="Arial" w:cs="Arial"/>
                 <w:sz w:val="16"/>
                 <w:szCs w:val="16"/>
               </w:rPr>
@@ -5467,15 +4984,15 @@
               <w:spacing w:after="0" w:line="240" w:lineRule="auto"/>
               <w:rPr>
                 <w:rFonts w:ascii="Arial" w:eastAsia="Arial" w:hAnsi="Arial" w:cs="Arial"/>
-                <w:sz w:val="16"/>
-                <w:szCs w:val="16"/>
-              </w:rPr>
-            </w:pPr>
-            <w:r>
-              <w:rPr>
-                <w:rFonts w:ascii="Arial" w:eastAsia="Arial" w:hAnsi="Arial" w:cs="Arial"/>
-                <w:sz w:val="16"/>
-                <w:szCs w:val="16"/>
+                <w:sz w:val="20"/>
+                <w:szCs w:val="20"/>
+              </w:rPr>
+            </w:pPr>
+            <w:r>
+              <w:rPr>
+                <w:rFonts w:ascii="Arial" w:eastAsia="Arial" w:hAnsi="Arial" w:cs="Arial"/>
+                <w:sz w:val="20"/>
+                <w:szCs w:val="20"/>
               </w:rPr>
               <w:t>A hazard to self and others; potential for putting self and others at risk because of risky and unsafe attitude.</w:t>
             </w:r>
@@ -5492,36 +5009,18 @@
               <w:spacing w:after="0" w:line="240" w:lineRule="auto"/>
               <w:jc w:val="center"/>
               <w:rPr>
-                <w:rFonts w:asciiTheme="minorHAnsi" w:eastAsia="Arial" w:hAnsiTheme="minorHAnsi" w:cstheme="minorHAnsi"/>
-                <w:sz w:val="16"/>
-                <w:szCs w:val="16"/>
-              </w:rPr>
-            </w:pPr>
-            <w:r>
-              <w:rPr>
-                <w:rFonts w:asciiTheme="minorHAnsi" w:hAnsiTheme="minorHAnsi" w:cstheme="minorHAnsi"/>
-              </w:rPr>
-              <w:t xml:space="preserve">1 </w:t>
-            </w:r>
-            <w:r>
-              <w:rPr>
-                <w:rFonts w:asciiTheme="minorHAnsi" w:hAnsiTheme="minorHAnsi" w:cstheme="minorHAnsi"/>
-              </w:rPr>
-              <w:t>${</w:t>
-            </w:r>
-            <w:r>
-              <w:rPr>
-                <w:rFonts w:asciiTheme="minorHAnsi" w:eastAsia="Arial" w:hAnsiTheme="minorHAnsi" w:cstheme="minorHAnsi"/>
-                <w:sz w:val="16"/>
-                <w:szCs w:val="16"/>
-              </w:rPr>
-              <w:t>safety_practice</w:t>
-            </w:r>
-            <w:r>
-              <w:rPr>
-                <w:rFonts w:asciiTheme="minorHAnsi" w:hAnsiTheme="minorHAnsi" w:cstheme="minorHAnsi"/>
-              </w:rPr>
-              <w:t>_1}</w:t>
+                <w:rFonts w:ascii="Arial" w:eastAsia="Arial" w:hAnsi="Arial" w:cs="Arial"/>
+                <w:sz w:val="20"/>
+                <w:szCs w:val="20"/>
+              </w:rPr>
+            </w:pPr>
+            <w:r>
+              <w:rPr>
+                <w:rFonts w:ascii="Arial" w:hAnsi="Arial" w:cs="Arial"/>
+                <w:sz w:val="20"/>
+                <w:szCs w:val="20"/>
+              </w:rPr>
+              <w:t>1 [ ${safety_practice_1} ]</w:t>
             </w:r>
           </w:p>
         </w:tc>
@@ -5547,7 +5046,7 @@
               </w:pBdr>
               <w:spacing w:after="0" w:line="276" w:lineRule="auto"/>
               <w:rPr>
-                <w:rFonts w:asciiTheme="minorHAnsi" w:eastAsia="Arial" w:hAnsiTheme="minorHAnsi" w:cstheme="minorHAnsi"/>
+                <w:rFonts w:ascii="Arial" w:eastAsia="Arial" w:hAnsi="Arial" w:cs="Arial"/>
                 <w:sz w:val="16"/>
                 <w:szCs w:val="16"/>
               </w:rPr>
@@ -5605,15 +5104,15 @@
               <w:spacing w:after="0" w:line="240" w:lineRule="auto"/>
               <w:rPr>
                 <w:rFonts w:ascii="Arial" w:eastAsia="Arial" w:hAnsi="Arial" w:cs="Arial"/>
-                <w:sz w:val="16"/>
-                <w:szCs w:val="16"/>
-              </w:rPr>
-            </w:pPr>
-            <w:r>
-              <w:rPr>
-                <w:rFonts w:ascii="Arial" w:eastAsia="Arial" w:hAnsi="Arial" w:cs="Arial"/>
-                <w:sz w:val="16"/>
-                <w:szCs w:val="16"/>
+                <w:sz w:val="20"/>
+                <w:szCs w:val="20"/>
+              </w:rPr>
+            </w:pPr>
+            <w:r>
+              <w:rPr>
+                <w:rFonts w:ascii="Arial" w:eastAsia="Arial" w:hAnsi="Arial" w:cs="Arial"/>
+                <w:sz w:val="20"/>
+                <w:szCs w:val="20"/>
               </w:rPr>
               <w:t>Clothes ideal for work; Appearance and hygiene would be acceptable to costumers and co-trainees/personnel.</w:t>
             </w:r>
@@ -5630,36 +5129,18 @@
               <w:spacing w:after="0" w:line="240" w:lineRule="auto"/>
               <w:jc w:val="center"/>
               <w:rPr>
-                <w:rFonts w:asciiTheme="minorHAnsi" w:eastAsia="Arial" w:hAnsiTheme="minorHAnsi" w:cstheme="minorHAnsi"/>
-                <w:sz w:val="16"/>
-                <w:szCs w:val="16"/>
-              </w:rPr>
-            </w:pPr>
-            <w:r>
-              <w:rPr>
-                <w:rFonts w:asciiTheme="minorHAnsi" w:hAnsiTheme="minorHAnsi" w:cstheme="minorHAnsi"/>
-              </w:rPr>
-              <w:t xml:space="preserve">5 </w:t>
-            </w:r>
-            <w:r>
-              <w:rPr>
-                <w:rFonts w:asciiTheme="minorHAnsi" w:hAnsiTheme="minorHAnsi" w:cstheme="minorHAnsi"/>
-              </w:rPr>
-              <w:t>${</w:t>
-            </w:r>
-            <w:r>
-              <w:rPr>
-                <w:rFonts w:asciiTheme="minorHAnsi" w:eastAsia="Arial" w:hAnsiTheme="minorHAnsi" w:cstheme="minorHAnsi"/>
-                <w:sz w:val="16"/>
-                <w:szCs w:val="16"/>
-              </w:rPr>
-              <w:t>apperance</w:t>
-            </w:r>
-            <w:r>
-              <w:rPr>
-                <w:rFonts w:asciiTheme="minorHAnsi" w:hAnsiTheme="minorHAnsi" w:cstheme="minorHAnsi"/>
-              </w:rPr>
-              <w:t>_5}</w:t>
+                <w:rFonts w:ascii="Arial" w:eastAsia="Arial" w:hAnsi="Arial" w:cs="Arial"/>
+                <w:sz w:val="20"/>
+                <w:szCs w:val="20"/>
+              </w:rPr>
+            </w:pPr>
+            <w:r>
+              <w:rPr>
+                <w:rFonts w:ascii="Arial" w:hAnsi="Arial" w:cs="Arial"/>
+                <w:sz w:val="20"/>
+                <w:szCs w:val="20"/>
+              </w:rPr>
+              <w:t>5 [ ${apperance_5} ]</w:t>
             </w:r>
           </w:p>
         </w:tc>
@@ -5678,14 +5159,14 @@
               <w:spacing w:after="0" w:line="240" w:lineRule="auto"/>
               <w:jc w:val="center"/>
               <w:rPr>
-                <w:rFonts w:asciiTheme="minorHAnsi" w:eastAsia="Arial" w:hAnsiTheme="minorHAnsi" w:cstheme="minorHAnsi"/>
-                <w:sz w:val="16"/>
-                <w:szCs w:val="16"/>
-              </w:rPr>
-            </w:pPr>
-            <w:r>
-              <w:rPr>
-                <w:rFonts w:asciiTheme="minorHAnsi" w:eastAsia="Arial" w:hAnsiTheme="minorHAnsi" w:cstheme="minorHAnsi"/>
+                <w:rFonts w:ascii="Arial" w:eastAsia="Arial" w:hAnsi="Arial" w:cs="Arial"/>
+                <w:sz w:val="16"/>
+                <w:szCs w:val="16"/>
+              </w:rPr>
+            </w:pPr>
+            <w:r>
+              <w:rPr>
+                <w:rFonts w:ascii="Arial" w:eastAsia="Arial" w:hAnsi="Arial" w:cs="Arial"/>
                 <w:sz w:val="16"/>
                 <w:szCs w:val="16"/>
               </w:rPr>
@@ -5741,15 +5222,15 @@
               <w:spacing w:after="0" w:line="240" w:lineRule="auto"/>
               <w:rPr>
                 <w:rFonts w:ascii="Arial" w:eastAsia="Arial" w:hAnsi="Arial" w:cs="Arial"/>
-                <w:sz w:val="16"/>
-                <w:szCs w:val="16"/>
-              </w:rPr>
-            </w:pPr>
-            <w:r>
-              <w:rPr>
-                <w:rFonts w:ascii="Arial" w:eastAsia="Arial" w:hAnsi="Arial" w:cs="Arial"/>
-                <w:sz w:val="16"/>
-                <w:szCs w:val="16"/>
+                <w:sz w:val="20"/>
+                <w:szCs w:val="20"/>
+              </w:rPr>
+            </w:pPr>
+            <w:r>
+              <w:rPr>
+                <w:rFonts w:ascii="Arial" w:eastAsia="Arial" w:hAnsi="Arial" w:cs="Arial"/>
+                <w:sz w:val="20"/>
+                <w:szCs w:val="20"/>
               </w:rPr>
               <w:t>Arrives at work with clothes clean; showered and clean; clothes are proper, protective and safe.</w:t>
             </w:r>
@@ -5766,36 +5247,18 @@
               <w:spacing w:after="0" w:line="240" w:lineRule="auto"/>
               <w:jc w:val="center"/>
               <w:rPr>
-                <w:rFonts w:asciiTheme="minorHAnsi" w:eastAsia="Arial" w:hAnsiTheme="minorHAnsi" w:cstheme="minorHAnsi"/>
-                <w:sz w:val="16"/>
-                <w:szCs w:val="16"/>
-              </w:rPr>
-            </w:pPr>
-            <w:r>
-              <w:rPr>
-                <w:rFonts w:asciiTheme="minorHAnsi" w:hAnsiTheme="minorHAnsi" w:cstheme="minorHAnsi"/>
-              </w:rPr>
-              <w:t xml:space="preserve">4 </w:t>
-            </w:r>
-            <w:r>
-              <w:rPr>
-                <w:rFonts w:asciiTheme="minorHAnsi" w:hAnsiTheme="minorHAnsi" w:cstheme="minorHAnsi"/>
-              </w:rPr>
-              <w:t>${</w:t>
-            </w:r>
-            <w:r>
-              <w:rPr>
-                <w:rFonts w:asciiTheme="minorHAnsi" w:eastAsia="Arial" w:hAnsiTheme="minorHAnsi" w:cstheme="minorHAnsi"/>
-                <w:sz w:val="16"/>
-                <w:szCs w:val="16"/>
-              </w:rPr>
-              <w:t>apperance</w:t>
-            </w:r>
-            <w:r>
-              <w:rPr>
-                <w:rFonts w:asciiTheme="minorHAnsi" w:hAnsiTheme="minorHAnsi" w:cstheme="minorHAnsi"/>
-              </w:rPr>
-              <w:t>_4}</w:t>
+                <w:rFonts w:ascii="Arial" w:eastAsia="Arial" w:hAnsi="Arial" w:cs="Arial"/>
+                <w:sz w:val="20"/>
+                <w:szCs w:val="20"/>
+              </w:rPr>
+            </w:pPr>
+            <w:r>
+              <w:rPr>
+                <w:rFonts w:ascii="Arial" w:hAnsi="Arial" w:cs="Arial"/>
+                <w:sz w:val="20"/>
+                <w:szCs w:val="20"/>
+              </w:rPr>
+              <w:t>4 [ ${apperance_4} ]</w:t>
             </w:r>
           </w:p>
         </w:tc>
@@ -5876,15 +5339,15 @@
               <w:spacing w:after="0" w:line="240" w:lineRule="auto"/>
               <w:rPr>
                 <w:rFonts w:ascii="Arial" w:eastAsia="Arial" w:hAnsi="Arial" w:cs="Arial"/>
-                <w:sz w:val="16"/>
-                <w:szCs w:val="16"/>
-              </w:rPr>
-            </w:pPr>
-            <w:r>
-              <w:rPr>
-                <w:rFonts w:ascii="Arial" w:eastAsia="Arial" w:hAnsi="Arial" w:cs="Arial"/>
-                <w:sz w:val="16"/>
-                <w:szCs w:val="16"/>
+                <w:sz w:val="20"/>
+                <w:szCs w:val="20"/>
+              </w:rPr>
+            </w:pPr>
+            <w:r>
+              <w:rPr>
+                <w:rFonts w:ascii="Arial" w:eastAsia="Arial" w:hAnsi="Arial" w:cs="Arial"/>
+                <w:sz w:val="20"/>
+                <w:szCs w:val="20"/>
               </w:rPr>
               <w:t>Clothes usually clean and appropriate for job; grooming acceptable</w:t>
             </w:r>
@@ -5901,36 +5364,18 @@
               <w:spacing w:after="0" w:line="240" w:lineRule="auto"/>
               <w:jc w:val="center"/>
               <w:rPr>
-                <w:rFonts w:asciiTheme="minorHAnsi" w:eastAsia="Arial" w:hAnsiTheme="minorHAnsi" w:cstheme="minorHAnsi"/>
-                <w:sz w:val="16"/>
-                <w:szCs w:val="16"/>
-              </w:rPr>
-            </w:pPr>
-            <w:r>
-              <w:rPr>
-                <w:rFonts w:asciiTheme="minorHAnsi" w:hAnsiTheme="minorHAnsi" w:cstheme="minorHAnsi"/>
-              </w:rPr>
-              <w:t xml:space="preserve">3 </w:t>
-            </w:r>
-            <w:r>
-              <w:rPr>
-                <w:rFonts w:asciiTheme="minorHAnsi" w:hAnsiTheme="minorHAnsi" w:cstheme="minorHAnsi"/>
-              </w:rPr>
-              <w:t>${</w:t>
-            </w:r>
-            <w:r>
-              <w:rPr>
-                <w:rFonts w:asciiTheme="minorHAnsi" w:eastAsia="Arial" w:hAnsiTheme="minorHAnsi" w:cstheme="minorHAnsi"/>
-                <w:sz w:val="16"/>
-                <w:szCs w:val="16"/>
-              </w:rPr>
-              <w:t>apperance</w:t>
-            </w:r>
-            <w:r>
-              <w:rPr>
-                <w:rFonts w:asciiTheme="minorHAnsi" w:hAnsiTheme="minorHAnsi" w:cstheme="minorHAnsi"/>
-              </w:rPr>
-              <w:t>_3}</w:t>
+                <w:rFonts w:ascii="Arial" w:eastAsia="Arial" w:hAnsi="Arial" w:cs="Arial"/>
+                <w:sz w:val="20"/>
+                <w:szCs w:val="20"/>
+              </w:rPr>
+            </w:pPr>
+            <w:r>
+              <w:rPr>
+                <w:rFonts w:ascii="Arial" w:hAnsi="Arial" w:cs="Arial"/>
+                <w:sz w:val="20"/>
+                <w:szCs w:val="20"/>
+              </w:rPr>
+              <w:t>3 [ ${apperance_3} ]</w:t>
             </w:r>
           </w:p>
         </w:tc>
@@ -6011,15 +5456,15 @@
               <w:spacing w:after="0" w:line="240" w:lineRule="auto"/>
               <w:rPr>
                 <w:rFonts w:ascii="Arial" w:eastAsia="Arial" w:hAnsi="Arial" w:cs="Arial"/>
-                <w:sz w:val="16"/>
-                <w:szCs w:val="16"/>
-              </w:rPr>
-            </w:pPr>
-            <w:r>
-              <w:rPr>
-                <w:rFonts w:ascii="Arial" w:eastAsia="Arial" w:hAnsi="Arial" w:cs="Arial"/>
-                <w:sz w:val="16"/>
-                <w:szCs w:val="16"/>
+                <w:sz w:val="20"/>
+                <w:szCs w:val="20"/>
+              </w:rPr>
+            </w:pPr>
+            <w:r>
+              <w:rPr>
+                <w:rFonts w:ascii="Arial" w:eastAsia="Arial" w:hAnsi="Arial" w:cs="Arial"/>
+                <w:sz w:val="20"/>
+                <w:szCs w:val="20"/>
               </w:rPr>
               <w:t>Poorly groomed; hair disheveled; clothing barely job appropriate and unkempt.</w:t>
             </w:r>
@@ -6036,36 +5481,18 @@
               <w:spacing w:after="0" w:line="240" w:lineRule="auto"/>
               <w:jc w:val="center"/>
               <w:rPr>
-                <w:rFonts w:asciiTheme="minorHAnsi" w:eastAsia="Arial" w:hAnsiTheme="minorHAnsi" w:cstheme="minorHAnsi"/>
-                <w:sz w:val="16"/>
-                <w:szCs w:val="16"/>
-              </w:rPr>
-            </w:pPr>
-            <w:r>
-              <w:rPr>
-                <w:rFonts w:asciiTheme="minorHAnsi" w:hAnsiTheme="minorHAnsi" w:cstheme="minorHAnsi"/>
-              </w:rPr>
-              <w:t xml:space="preserve">2 </w:t>
-            </w:r>
-            <w:r>
-              <w:rPr>
-                <w:rFonts w:asciiTheme="minorHAnsi" w:hAnsiTheme="minorHAnsi" w:cstheme="minorHAnsi"/>
-              </w:rPr>
-              <w:t>${</w:t>
-            </w:r>
-            <w:r>
-              <w:rPr>
-                <w:rFonts w:asciiTheme="minorHAnsi" w:eastAsia="Arial" w:hAnsiTheme="minorHAnsi" w:cstheme="minorHAnsi"/>
-                <w:sz w:val="16"/>
-                <w:szCs w:val="16"/>
-              </w:rPr>
-              <w:t>apperance</w:t>
-            </w:r>
-            <w:r>
-              <w:rPr>
-                <w:rFonts w:asciiTheme="minorHAnsi" w:hAnsiTheme="minorHAnsi" w:cstheme="minorHAnsi"/>
-              </w:rPr>
-              <w:t>_2}</w:t>
+                <w:rFonts w:ascii="Arial" w:eastAsia="Arial" w:hAnsi="Arial" w:cs="Arial"/>
+                <w:sz w:val="20"/>
+                <w:szCs w:val="20"/>
+              </w:rPr>
+            </w:pPr>
+            <w:r>
+              <w:rPr>
+                <w:rFonts w:ascii="Arial" w:hAnsi="Arial" w:cs="Arial"/>
+                <w:sz w:val="20"/>
+                <w:szCs w:val="20"/>
+              </w:rPr>
+              <w:t>2 [ ${apperance_2} ]</w:t>
             </w:r>
           </w:p>
         </w:tc>
@@ -6149,15 +5576,15 @@
               <w:spacing w:after="0" w:line="240" w:lineRule="auto"/>
               <w:rPr>
                 <w:rFonts w:ascii="Arial" w:eastAsia="Arial" w:hAnsi="Arial" w:cs="Arial"/>
-                <w:sz w:val="16"/>
-                <w:szCs w:val="16"/>
-              </w:rPr>
-            </w:pPr>
-            <w:r>
-              <w:rPr>
-                <w:rFonts w:ascii="Arial" w:eastAsia="Arial" w:hAnsi="Arial" w:cs="Arial"/>
-                <w:sz w:val="16"/>
-                <w:szCs w:val="16"/>
+                <w:sz w:val="20"/>
+                <w:szCs w:val="20"/>
+              </w:rPr>
+            </w:pPr>
+            <w:r>
+              <w:rPr>
+                <w:rFonts w:ascii="Arial" w:eastAsia="Arial" w:hAnsi="Arial" w:cs="Arial"/>
+                <w:sz w:val="20"/>
+                <w:szCs w:val="20"/>
               </w:rPr>
               <w:t>Generally not presentable: clothes dirty and not appropriate for the job; looks shabby; unclean; smells bad at times.</w:t>
             </w:r>
@@ -6177,36 +5604,27 @@
               <w:spacing w:after="0" w:line="240" w:lineRule="auto"/>
               <w:jc w:val="center"/>
               <w:rPr>
-                <w:rFonts w:asciiTheme="minorHAnsi" w:eastAsia="Arial" w:hAnsiTheme="minorHAnsi" w:cstheme="minorHAnsi"/>
-                <w:sz w:val="16"/>
-                <w:szCs w:val="16"/>
-              </w:rPr>
-            </w:pPr>
-            <w:r>
-              <w:rPr>
-                <w:rFonts w:asciiTheme="minorHAnsi" w:hAnsiTheme="minorHAnsi" w:cstheme="minorHAnsi"/>
-              </w:rPr>
-              <w:t xml:space="preserve">1 </w:t>
-            </w:r>
-            <w:r>
-              <w:rPr>
-                <w:rFonts w:asciiTheme="minorHAnsi" w:hAnsiTheme="minorHAnsi" w:cstheme="minorHAnsi"/>
-              </w:rPr>
-              <w:t>${</w:t>
-            </w:r>
-            <w:r>
-              <w:rPr>
-                <w:rFonts w:asciiTheme="minorHAnsi" w:eastAsia="Arial" w:hAnsiTheme="minorHAnsi" w:cstheme="minorHAnsi"/>
-                <w:sz w:val="16"/>
-                <w:szCs w:val="16"/>
-              </w:rPr>
-              <w:t>apperance</w:t>
-            </w:r>
-            <w:r>
-              <w:rPr>
-                <w:rFonts w:asciiTheme="minorHAnsi" w:hAnsiTheme="minorHAnsi" w:cstheme="minorHAnsi"/>
-              </w:rPr>
-              <w:t>_1}</w:t>
+                <w:rFonts w:ascii="Arial" w:eastAsia="Arial" w:hAnsi="Arial" w:cs="Arial"/>
+                <w:sz w:val="20"/>
+                <w:szCs w:val="20"/>
+              </w:rPr>
+            </w:pPr>
+            <w:r>
+              <w:rPr>
+                <w:rFonts w:ascii="Arial" w:hAnsi="Arial" w:cs="Arial"/>
+                <w:sz w:val="20"/>
+                <w:szCs w:val="20"/>
+              </w:rPr>
+              <w:t>1 [ ${app</w:t>
+            </w:r>
+            <w:r>
+              <w:rPr>
+                <w:rFonts w:ascii="Arial" w:hAnsi="Arial" w:cs="Arial"/>
+                <w:sz w:val="20"/>
+                <w:szCs w:val="20"/>
+              </w:rPr>
+              <w:lastRenderedPageBreak/>
+              <w:t>erance_1} ]</w:t>
             </w:r>
           </w:p>
         </w:tc>
@@ -6449,17 +5867,52 @@
               <w:spacing w:after="0" w:line="240" w:lineRule="auto"/>
               <w:rPr>
                 <w:rFonts w:ascii="Arial" w:eastAsia="Arial" w:hAnsi="Arial" w:cs="Arial"/>
-                <w:sz w:val="16"/>
-                <w:szCs w:val="16"/>
-              </w:rPr>
-            </w:pPr>
-            <w:r>
-              <w:rPr>
-                <w:rFonts w:ascii="Arial" w:eastAsia="Arial" w:hAnsi="Arial" w:cs="Arial"/>
-                <w:sz w:val="16"/>
-                <w:szCs w:val="16"/>
-              </w:rPr>
-              <w:t>_____ due “only” for lack of work”</w:t>
+                <w:sz w:val="18"/>
+                <w:szCs w:val="18"/>
+              </w:rPr>
+            </w:pPr>
+            <w:r>
+              <w:rPr>
+                <w:rFonts w:ascii="Arial" w:eastAsia="Arial" w:hAnsi="Arial" w:cs="Arial"/>
+                <w:sz w:val="18"/>
+                <w:szCs w:val="18"/>
+                <w:u w:val="single"/>
+              </w:rPr>
+              <w:t xml:space="preserve">__ </w:t>
+            </w:r>
+            <w:r>
+              <w:rPr>
+                <w:rFonts w:ascii="Arial" w:hAnsi="Arial" w:cs="Arial"/>
+                <w:sz w:val="18"/>
+                <w:szCs w:val="18"/>
+                <w:u w:val="single"/>
+              </w:rPr>
+              <w:t>${termination_lack_of_work}</w:t>
+            </w:r>
+            <w:r>
+              <w:rPr>
+                <w:rFonts w:ascii="Arial" w:hAnsi="Arial" w:cs="Arial"/>
+                <w:sz w:val="18"/>
+                <w:szCs w:val="18"/>
+                <w:u w:val="single"/>
+              </w:rPr>
+              <w:t>__</w:t>
+            </w:r>
+            <w:r>
+              <w:rPr>
+                <w:rFonts w:ascii="Arial" w:hAnsi="Arial" w:cs="Arial"/>
+                <w:sz w:val="18"/>
+                <w:szCs w:val="18"/>
+              </w:rPr>
+              <w:t xml:space="preserve"> </w:t>
+            </w:r>
+            <w:r>
+              <w:rPr>
+                <w:rFonts w:ascii="Arial" w:eastAsia="Arial" w:hAnsi="Arial" w:cs="Arial"/>
+                <w:sz w:val="18"/>
+                <w:szCs w:val="18"/>
+              </w:rPr>
+              <w:t>due “only” for lack of work”</w:t>
             </w:r>
           </w:p>
         </w:tc>
@@ -6481,17 +5934,52 @@
               <w:spacing w:after="0" w:line="240" w:lineRule="auto"/>
               <w:rPr>
                 <w:rFonts w:ascii="Arial" w:eastAsia="Arial" w:hAnsi="Arial" w:cs="Arial"/>
-                <w:sz w:val="16"/>
-                <w:szCs w:val="16"/>
-              </w:rPr>
-            </w:pPr>
-            <w:r>
-              <w:rPr>
-                <w:rFonts w:ascii="Arial" w:eastAsia="Arial" w:hAnsi="Arial" w:cs="Arial"/>
-                <w:sz w:val="16"/>
-                <w:szCs w:val="16"/>
-              </w:rPr>
-              <w:t>_____ too much absences and tardiness</w:t>
+                <w:sz w:val="18"/>
+                <w:szCs w:val="18"/>
+              </w:rPr>
+            </w:pPr>
+            <w:r>
+              <w:rPr>
+                <w:rFonts w:ascii="Arial" w:eastAsia="Arial" w:hAnsi="Arial" w:cs="Arial"/>
+                <w:sz w:val="18"/>
+                <w:szCs w:val="18"/>
+                <w:u w:val="single"/>
+              </w:rPr>
+              <w:t xml:space="preserve">__ </w:t>
+            </w:r>
+            <w:r>
+              <w:rPr>
+                <w:rFonts w:ascii="Arial" w:hAnsi="Arial" w:cs="Arial"/>
+                <w:sz w:val="18"/>
+                <w:szCs w:val="18"/>
+                <w:u w:val="single"/>
+              </w:rPr>
+              <w:t>${termination_absences_tardiness}</w:t>
+            </w:r>
+            <w:r>
+              <w:rPr>
+                <w:rFonts w:ascii="Arial" w:hAnsi="Arial" w:cs="Arial"/>
+                <w:sz w:val="18"/>
+                <w:szCs w:val="18"/>
+                <w:u w:val="single"/>
+              </w:rPr>
+              <w:t>__</w:t>
+            </w:r>
+            <w:r>
+              <w:rPr>
+                <w:rFonts w:ascii="Arial" w:hAnsi="Arial" w:cs="Arial"/>
+                <w:sz w:val="18"/>
+                <w:szCs w:val="18"/>
+              </w:rPr>
+              <w:t xml:space="preserve"> </w:t>
+            </w:r>
+            <w:r>
+              <w:rPr>
+                <w:rFonts w:ascii="Arial" w:eastAsia="Arial" w:hAnsi="Arial" w:cs="Arial"/>
+                <w:sz w:val="18"/>
+                <w:szCs w:val="18"/>
+              </w:rPr>
+              <w:t>too much absences and tardiness</w:t>
             </w:r>
           </w:p>
         </w:tc>
@@ -6519,17 +6007,52 @@
               <w:spacing w:after="0" w:line="240" w:lineRule="auto"/>
               <w:rPr>
                 <w:rFonts w:ascii="Arial" w:eastAsia="Arial" w:hAnsi="Arial" w:cs="Arial"/>
-                <w:sz w:val="16"/>
-                <w:szCs w:val="16"/>
-              </w:rPr>
-            </w:pPr>
-            <w:r>
-              <w:rPr>
-                <w:rFonts w:ascii="Arial" w:eastAsia="Arial" w:hAnsi="Arial" w:cs="Arial"/>
-                <w:sz w:val="16"/>
-                <w:szCs w:val="16"/>
-              </w:rPr>
-              <w:t>_____ violation of Company Rules</w:t>
+                <w:sz w:val="18"/>
+                <w:szCs w:val="18"/>
+              </w:rPr>
+            </w:pPr>
+            <w:r>
+              <w:rPr>
+                <w:rFonts w:ascii="Arial" w:eastAsia="Arial" w:hAnsi="Arial" w:cs="Arial"/>
+                <w:sz w:val="18"/>
+                <w:szCs w:val="18"/>
+                <w:u w:val="single"/>
+              </w:rPr>
+              <w:t xml:space="preserve">__ </w:t>
+            </w:r>
+            <w:r>
+              <w:rPr>
+                <w:rFonts w:ascii="Arial" w:hAnsi="Arial" w:cs="Arial"/>
+                <w:sz w:val="18"/>
+                <w:szCs w:val="18"/>
+                <w:u w:val="single"/>
+              </w:rPr>
+              <w:t>${termination_violation_rules}</w:t>
+            </w:r>
+            <w:r>
+              <w:rPr>
+                <w:rFonts w:ascii="Arial" w:hAnsi="Arial" w:cs="Arial"/>
+                <w:sz w:val="18"/>
+                <w:szCs w:val="18"/>
+                <w:u w:val="single"/>
+              </w:rPr>
+              <w:t>__</w:t>
+            </w:r>
+            <w:r>
+              <w:rPr>
+                <w:rFonts w:ascii="Arial" w:hAnsi="Arial" w:cs="Arial"/>
+                <w:sz w:val="18"/>
+                <w:szCs w:val="18"/>
+              </w:rPr>
+              <w:t xml:space="preserve"> </w:t>
+            </w:r>
+            <w:r>
+              <w:rPr>
+                <w:rFonts w:ascii="Arial" w:eastAsia="Arial" w:hAnsi="Arial" w:cs="Arial"/>
+                <w:sz w:val="18"/>
+                <w:szCs w:val="18"/>
+              </w:rPr>
+              <w:t>violation of Company Rules</w:t>
             </w:r>
           </w:p>
         </w:tc>
@@ -6551,17 +6074,52 @@
               <w:spacing w:after="0" w:line="240" w:lineRule="auto"/>
               <w:rPr>
                 <w:rFonts w:ascii="Arial" w:eastAsia="Arial" w:hAnsi="Arial" w:cs="Arial"/>
-                <w:sz w:val="16"/>
-                <w:szCs w:val="16"/>
-              </w:rPr>
-            </w:pPr>
-            <w:r>
-              <w:rPr>
-                <w:rFonts w:ascii="Arial" w:eastAsia="Arial" w:hAnsi="Arial" w:cs="Arial"/>
-                <w:sz w:val="16"/>
-                <w:szCs w:val="16"/>
-              </w:rPr>
-              <w:t>_____ disrespectful to co-trainee or personnel</w:t>
+                <w:sz w:val="18"/>
+                <w:szCs w:val="18"/>
+              </w:rPr>
+            </w:pPr>
+            <w:r>
+              <w:rPr>
+                <w:rFonts w:ascii="Arial" w:eastAsia="Arial" w:hAnsi="Arial" w:cs="Arial"/>
+                <w:sz w:val="18"/>
+                <w:szCs w:val="18"/>
+                <w:u w:val="single"/>
+              </w:rPr>
+              <w:t xml:space="preserve">__ </w:t>
+            </w:r>
+            <w:r>
+              <w:rPr>
+                <w:rFonts w:ascii="Arial" w:hAnsi="Arial" w:cs="Arial"/>
+                <w:sz w:val="18"/>
+                <w:szCs w:val="18"/>
+                <w:u w:val="single"/>
+              </w:rPr>
+              <w:t>${termination_disrespectful}</w:t>
+            </w:r>
+            <w:r>
+              <w:rPr>
+                <w:rFonts w:ascii="Arial" w:hAnsi="Arial" w:cs="Arial"/>
+                <w:sz w:val="18"/>
+                <w:szCs w:val="18"/>
+                <w:u w:val="single"/>
+              </w:rPr>
+              <w:t>__</w:t>
+            </w:r>
+            <w:r>
+              <w:rPr>
+                <w:rFonts w:ascii="Arial" w:hAnsi="Arial" w:cs="Arial"/>
+                <w:sz w:val="18"/>
+                <w:szCs w:val="18"/>
+              </w:rPr>
+              <w:t xml:space="preserve"> </w:t>
+            </w:r>
+            <w:r>
+              <w:rPr>
+                <w:rFonts w:ascii="Arial" w:eastAsia="Arial" w:hAnsi="Arial" w:cs="Arial"/>
+                <w:sz w:val="18"/>
+                <w:szCs w:val="18"/>
+              </w:rPr>
+              <w:t>disrespectful to co-trainee or personnel</w:t>
             </w:r>
           </w:p>
         </w:tc>
@@ -6589,17 +6147,52 @@
               <w:spacing w:after="0" w:line="240" w:lineRule="auto"/>
               <w:rPr>
                 <w:rFonts w:ascii="Arial" w:eastAsia="Arial" w:hAnsi="Arial" w:cs="Arial"/>
-                <w:sz w:val="16"/>
-                <w:szCs w:val="16"/>
-              </w:rPr>
-            </w:pPr>
-            <w:r>
-              <w:rPr>
-                <w:rFonts w:ascii="Arial" w:eastAsia="Arial" w:hAnsi="Arial" w:cs="Arial"/>
-                <w:sz w:val="16"/>
-                <w:szCs w:val="16"/>
-              </w:rPr>
-              <w:t>_____ unfavorable work habits and practices</w:t>
+                <w:sz w:val="18"/>
+                <w:szCs w:val="18"/>
+              </w:rPr>
+            </w:pPr>
+            <w:r>
+              <w:rPr>
+                <w:rFonts w:ascii="Arial" w:eastAsia="Arial" w:hAnsi="Arial" w:cs="Arial"/>
+                <w:sz w:val="18"/>
+                <w:szCs w:val="18"/>
+                <w:u w:val="single"/>
+              </w:rPr>
+              <w:t xml:space="preserve">__ </w:t>
+            </w:r>
+            <w:r>
+              <w:rPr>
+                <w:rFonts w:ascii="Arial" w:hAnsi="Arial" w:cs="Arial"/>
+                <w:sz w:val="18"/>
+                <w:szCs w:val="18"/>
+                <w:u w:val="single"/>
+              </w:rPr>
+              <w:t>${termination_unfavorable_habits}</w:t>
+            </w:r>
+            <w:r>
+              <w:rPr>
+                <w:rFonts w:ascii="Arial" w:hAnsi="Arial" w:cs="Arial"/>
+                <w:sz w:val="18"/>
+                <w:szCs w:val="18"/>
+                <w:u w:val="single"/>
+              </w:rPr>
+              <w:t>__</w:t>
+            </w:r>
+            <w:r>
+              <w:rPr>
+                <w:rFonts w:ascii="Arial" w:hAnsi="Arial" w:cs="Arial"/>
+                <w:sz w:val="18"/>
+                <w:szCs w:val="18"/>
+              </w:rPr>
+              <w:t xml:space="preserve"> </w:t>
+            </w:r>
+            <w:r>
+              <w:rPr>
+                <w:rFonts w:ascii="Arial" w:eastAsia="Arial" w:hAnsi="Arial" w:cs="Arial"/>
+                <w:sz w:val="18"/>
+                <w:szCs w:val="18"/>
+              </w:rPr>
+              <w:t>unfavorable work habits and practices</w:t>
             </w:r>
           </w:p>
         </w:tc>
@@ -6621,17 +6214,52 @@
               <w:spacing w:after="0" w:line="240" w:lineRule="auto"/>
               <w:rPr>
                 <w:rFonts w:ascii="Arial" w:eastAsia="Arial" w:hAnsi="Arial" w:cs="Arial"/>
-                <w:sz w:val="16"/>
-                <w:szCs w:val="16"/>
-              </w:rPr>
-            </w:pPr>
-            <w:r>
-              <w:rPr>
-                <w:rFonts w:ascii="Arial" w:eastAsia="Arial" w:hAnsi="Arial" w:cs="Arial"/>
-                <w:sz w:val="16"/>
-                <w:szCs w:val="16"/>
-              </w:rPr>
-              <w:t>_____ does not demonstrate interest and desire to learn</w:t>
+                <w:sz w:val="18"/>
+                <w:szCs w:val="18"/>
+              </w:rPr>
+            </w:pPr>
+            <w:r>
+              <w:rPr>
+                <w:rFonts w:ascii="Arial" w:eastAsia="Arial" w:hAnsi="Arial" w:cs="Arial"/>
+                <w:sz w:val="18"/>
+                <w:szCs w:val="18"/>
+                <w:u w:val="single"/>
+              </w:rPr>
+              <w:t xml:space="preserve">__ </w:t>
+            </w:r>
+            <w:r>
+              <w:rPr>
+                <w:rFonts w:ascii="Arial" w:hAnsi="Arial" w:cs="Arial"/>
+                <w:sz w:val="18"/>
+                <w:szCs w:val="18"/>
+                <w:u w:val="single"/>
+              </w:rPr>
+              <w:t>${termination_no_interest}</w:t>
+            </w:r>
+            <w:r>
+              <w:rPr>
+                <w:rFonts w:ascii="Arial" w:hAnsi="Arial" w:cs="Arial"/>
+                <w:sz w:val="18"/>
+                <w:szCs w:val="18"/>
+                <w:u w:val="single"/>
+              </w:rPr>
+              <w:t>__</w:t>
+            </w:r>
+            <w:r>
+              <w:rPr>
+                <w:rFonts w:ascii="Arial" w:hAnsi="Arial" w:cs="Arial"/>
+                <w:sz w:val="18"/>
+                <w:szCs w:val="18"/>
+              </w:rPr>
+              <w:t xml:space="preserve"> </w:t>
+            </w:r>
+            <w:r>
+              <w:rPr>
+                <w:rFonts w:ascii="Arial" w:eastAsia="Arial" w:hAnsi="Arial" w:cs="Arial"/>
+                <w:sz w:val="18"/>
+                <w:szCs w:val="18"/>
+              </w:rPr>
+              <w:t>does not demonstrate interest and desire to learn</w:t>
             </w:r>
           </w:p>
         </w:tc>
@@ -6659,17 +6287,52 @@
               <w:spacing w:after="0" w:line="240" w:lineRule="auto"/>
               <w:rPr>
                 <w:rFonts w:ascii="Arial" w:eastAsia="Arial" w:hAnsi="Arial" w:cs="Arial"/>
-                <w:sz w:val="16"/>
-                <w:szCs w:val="16"/>
-              </w:rPr>
-            </w:pPr>
-            <w:r>
-              <w:rPr>
-                <w:rFonts w:ascii="Arial" w:eastAsia="Arial" w:hAnsi="Arial" w:cs="Arial"/>
-                <w:sz w:val="16"/>
-                <w:szCs w:val="16"/>
-              </w:rPr>
-              <w:t>_____ altercation on the job</w:t>
+                <w:sz w:val="18"/>
+                <w:szCs w:val="18"/>
+              </w:rPr>
+            </w:pPr>
+            <w:r>
+              <w:rPr>
+                <w:rFonts w:ascii="Arial" w:eastAsia="Arial" w:hAnsi="Arial" w:cs="Arial"/>
+                <w:sz w:val="18"/>
+                <w:szCs w:val="18"/>
+                <w:u w:val="single"/>
+              </w:rPr>
+              <w:t xml:space="preserve">__ </w:t>
+            </w:r>
+            <w:r>
+              <w:rPr>
+                <w:rFonts w:ascii="Arial" w:hAnsi="Arial" w:cs="Arial"/>
+                <w:sz w:val="18"/>
+                <w:szCs w:val="18"/>
+                <w:u w:val="single"/>
+              </w:rPr>
+              <w:t>${termination_altercation}</w:t>
+            </w:r>
+            <w:r>
+              <w:rPr>
+                <w:rFonts w:ascii="Arial" w:hAnsi="Arial" w:cs="Arial"/>
+                <w:sz w:val="18"/>
+                <w:szCs w:val="18"/>
+                <w:u w:val="single"/>
+              </w:rPr>
+              <w:t>__</w:t>
+            </w:r>
+            <w:r>
+              <w:rPr>
+                <w:rFonts w:ascii="Arial" w:hAnsi="Arial" w:cs="Arial"/>
+                <w:sz w:val="18"/>
+                <w:szCs w:val="18"/>
+              </w:rPr>
+              <w:t xml:space="preserve"> </w:t>
+            </w:r>
+            <w:r>
+              <w:rPr>
+                <w:rFonts w:ascii="Arial" w:eastAsia="Arial" w:hAnsi="Arial" w:cs="Arial"/>
+                <w:sz w:val="18"/>
+                <w:szCs w:val="18"/>
+              </w:rPr>
+              <w:t>altercation on the job</w:t>
             </w:r>
           </w:p>
         </w:tc>
@@ -6691,17 +6354,78 @@
               <w:spacing w:after="0" w:line="240" w:lineRule="auto"/>
               <w:rPr>
                 <w:rFonts w:ascii="Arial" w:eastAsia="Arial" w:hAnsi="Arial" w:cs="Arial"/>
-                <w:sz w:val="16"/>
-                <w:szCs w:val="16"/>
-              </w:rPr>
-            </w:pPr>
-            <w:r>
-              <w:rPr>
-                <w:rFonts w:ascii="Arial" w:eastAsia="Arial" w:hAnsi="Arial" w:cs="Arial"/>
-                <w:sz w:val="16"/>
-                <w:szCs w:val="16"/>
-              </w:rPr>
-              <w:t>_____ other(s), please specify ____________________</w:t>
+                <w:sz w:val="18"/>
+                <w:szCs w:val="18"/>
+              </w:rPr>
+            </w:pPr>
+            <w:r>
+              <w:rPr>
+                <w:rFonts w:ascii="Arial" w:eastAsia="Arial" w:hAnsi="Arial" w:cs="Arial"/>
+                <w:sz w:val="18"/>
+                <w:szCs w:val="18"/>
+                <w:u w:val="single"/>
+              </w:rPr>
+              <w:t xml:space="preserve">__ </w:t>
+            </w:r>
+            <w:r>
+              <w:rPr>
+                <w:rFonts w:ascii="Arial" w:hAnsi="Arial" w:cs="Arial"/>
+                <w:sz w:val="18"/>
+                <w:szCs w:val="18"/>
+                <w:u w:val="single"/>
+              </w:rPr>
+              <w:t>${termination_other}</w:t>
+            </w:r>
+            <w:r>
+              <w:rPr>
+                <w:rFonts w:ascii="Arial" w:hAnsi="Arial" w:cs="Arial"/>
+                <w:sz w:val="18"/>
+                <w:szCs w:val="18"/>
+                <w:u w:val="single"/>
+              </w:rPr>
+              <w:t>__</w:t>
+            </w:r>
+            <w:r>
+              <w:rPr>
+                <w:rFonts w:ascii="Arial" w:hAnsi="Arial" w:cs="Arial"/>
+                <w:sz w:val="18"/>
+                <w:szCs w:val="18"/>
+              </w:rPr>
+              <w:t xml:space="preserve"> </w:t>
+            </w:r>
+            <w:r>
+              <w:rPr>
+                <w:rFonts w:ascii="Arial" w:eastAsia="Arial" w:hAnsi="Arial" w:cs="Arial"/>
+                <w:sz w:val="18"/>
+                <w:szCs w:val="18"/>
+              </w:rPr>
+              <w:t>other(s), please specify</w:t>
+            </w:r>
+            <w:r>
+              <w:rPr>
+                <w:rFonts w:ascii="Arial" w:eastAsia="Arial" w:hAnsi="Arial" w:cs="Arial"/>
+                <w:sz w:val="18"/>
+                <w:szCs w:val="18"/>
+              </w:rPr>
+              <w:t xml:space="preserve"> </w:t>
+            </w:r>
+            <w:r>
+              <w:rPr>
+                <w:rFonts w:ascii="Arial" w:hAnsi="Arial" w:cs="Arial"/>
+                <w:sz w:val="18"/>
+                <w:szCs w:val="18"/>
+                <w:u w:val="single"/>
+              </w:rPr>
+              <w:t xml:space="preserve">${termination_other_specify} </w:t>
+            </w:r>
+            <w:r>
+              <w:rPr>
+                <w:rFonts w:ascii="Arial" w:eastAsia="Arial" w:hAnsi="Arial" w:cs="Arial"/>
+                <w:sz w:val="18"/>
+                <w:szCs w:val="18"/>
+                <w:u w:val="single"/>
+              </w:rPr>
+              <w:t>____________________</w:t>
             </w:r>
           </w:p>
         </w:tc>
@@ -6737,8 +6461,35 @@
                 <w:rFonts w:ascii="Arial" w:eastAsia="Arial" w:hAnsi="Arial" w:cs="Arial"/>
                 <w:sz w:val="16"/>
                 <w:szCs w:val="16"/>
-              </w:rPr>
-              <w:t xml:space="preserve">_____ </w:t>
+                <w:u w:val="single"/>
+              </w:rPr>
+              <w:t xml:space="preserve">__ </w:t>
+            </w:r>
+            <w:r>
+              <w:rPr>
+                <w:rFonts w:ascii="Arial" w:hAnsi="Arial" w:cs="Arial"/>
+                <w:sz w:val="18"/>
+                <w:szCs w:val="18"/>
+                <w:u w:val="single"/>
+              </w:rPr>
+              <w:t>${future_employment}</w:t>
+            </w:r>
+            <w:r>
+              <w:rPr>
+                <w:rFonts w:ascii="Arial" w:hAnsi="Arial" w:cs="Arial"/>
+                <w:sz w:val="18"/>
+                <w:szCs w:val="18"/>
+                <w:u w:val="single"/>
+              </w:rPr>
+              <w:t>__</w:t>
+            </w:r>
+            <w:r>
+              <w:rPr>
+                <w:rFonts w:ascii="Arial" w:hAnsi="Arial" w:cs="Arial"/>
+                <w:sz w:val="18"/>
+                <w:szCs w:val="18"/>
+              </w:rPr>
+              <w:t xml:space="preserve"> </w:t>
             </w:r>
             <w:r>
               <w:rPr>
@@ -6784,8 +6535,35 @@
                 <w:rFonts w:ascii="Arial" w:eastAsia="Arial" w:hAnsi="Arial" w:cs="Arial"/>
                 <w:sz w:val="16"/>
                 <w:szCs w:val="16"/>
-              </w:rPr>
-              <w:t xml:space="preserve">_____ </w:t>
+                <w:u w:val="single"/>
+              </w:rPr>
+              <w:t xml:space="preserve">__ </w:t>
+            </w:r>
+            <w:r>
+              <w:rPr>
+                <w:rFonts w:ascii="Arial" w:hAnsi="Arial" w:cs="Arial"/>
+                <w:sz w:val="18"/>
+                <w:szCs w:val="18"/>
+                <w:u w:val="single"/>
+              </w:rPr>
+              <w:t>${needs_improvement}</w:t>
+            </w:r>
+            <w:r>
+              <w:rPr>
+                <w:rFonts w:ascii="Arial" w:hAnsi="Arial" w:cs="Arial"/>
+                <w:sz w:val="18"/>
+                <w:szCs w:val="18"/>
+                <w:u w:val="single"/>
+              </w:rPr>
+              <w:t>__</w:t>
+            </w:r>
+            <w:r>
+              <w:rPr>
+                <w:rFonts w:ascii="Arial" w:hAnsi="Arial" w:cs="Arial"/>
+                <w:sz w:val="18"/>
+                <w:szCs w:val="18"/>
+              </w:rPr>
+              <w:t xml:space="preserve"> </w:t>
             </w:r>
             <w:r>
               <w:rPr>
@@ -7075,15 +6853,15 @@
               <mc:AlternateContent>
                 <mc:Choice Requires="wps">
                   <w:drawing>
-                    <wp:anchor distT="0" distB="0" distL="114300" distR="114300" simplePos="0" relativeHeight="251659264" behindDoc="0" locked="0" layoutInCell="1" hidden="0" allowOverlap="1" wp14:anchorId="60918F36" wp14:editId="5AEABFA8">
+                    <wp:anchor distT="0" distB="0" distL="114300" distR="114300" simplePos="0" relativeHeight="251659264" behindDoc="0" locked="0" layoutInCell="1" hidden="0" allowOverlap="1" wp14:anchorId="60918F36" wp14:editId="7D3BF980">
                       <wp:simplePos x="0" y="0"/>
                       <wp:positionH relativeFrom="column">
-                        <wp:posOffset>615950</wp:posOffset>
+                        <wp:posOffset>635000</wp:posOffset>
                       </wp:positionH>
                       <wp:positionV relativeFrom="paragraph">
-                        <wp:posOffset>-405130</wp:posOffset>
+                        <wp:posOffset>-401320</wp:posOffset>
                       </wp:positionV>
-                      <wp:extent cx="2184400" cy="404495"/>
+                      <wp:extent cx="2184400" cy="497840"/>
                       <wp:effectExtent l="0" t="0" r="0" b="0"/>
                       <wp:wrapTopAndBottom distT="0" distB="0"/>
                       <wp:docPr id="22" name="Rectangle 22"/>
@@ -7095,7 +6873,7 @@
                             <wps:spPr>
                               <a:xfrm>
                                 <a:off x="0" y="0"/>
-                                <a:ext cx="2184400" cy="404495"/>
+                                <a:ext cx="2184400" cy="497840"/>
                               </a:xfrm>
                               <a:prstGeom prst="rect">
                                 <a:avLst/>
@@ -7113,22 +6891,28 @@
                                     <w:ind w:right="-126"/>
                                     <w:jc w:val="center"/>
                                     <w:textDirection w:val="btLr"/>
+                                    <w:rPr>
+                                      <w:sz w:val="24"/>
+                                      <w:szCs w:val="24"/>
+                                    </w:rPr>
                                   </w:pPr>
                                   <w:r>
                                     <w:rPr>
                                       <w:rFonts w:ascii="Arial" w:eastAsia="Arial" w:hAnsi="Arial" w:cs="Arial"/>
                                       <w:i/>
                                       <w:color w:val="000000"/>
-                                      <w:sz w:val="16"/>
+                                      <w:sz w:val="18"/>
+                                      <w:szCs w:val="24"/>
                                     </w:rPr>
-                                    <w:t>_____________</w:t>
+                                    <w:t>__________</w:t>
                                   </w:r>
                                   <w:r>
                                     <w:rPr>
                                       <w:rFonts w:ascii="Arial" w:eastAsia="Arial" w:hAnsi="Arial" w:cs="Arial"/>
                                       <w:i/>
                                       <w:color w:val="000000"/>
-                                      <w:sz w:val="16"/>
+                                      <w:sz w:val="18"/>
+                                      <w:szCs w:val="24"/>
                                       <w:u w:val="single"/>
                                     </w:rPr>
                                     <w:t>${student_name}</w:t>
@@ -7138,7 +6922,8 @@
                                       <w:rFonts w:ascii="Arial" w:eastAsia="Arial" w:hAnsi="Arial" w:cs="Arial"/>
                                       <w:i/>
                                       <w:color w:val="000000"/>
-                                      <w:sz w:val="16"/>
+                                      <w:sz w:val="18"/>
+                                      <w:szCs w:val="24"/>
                                     </w:rPr>
                                     <w:t>_________</w:t>
                                   </w:r>
@@ -7179,7 +6964,7 @@
                 </mc:Choice>
                 <mc:Fallback>
                   <w:pict>
-                    <v:rect w14:anchorId="60918F36" id="Rectangle 22" o:spid="_x0000_s1027" style="position:absolute;left:0;text-align:left;margin-left:48.5pt;margin-top:-31.9pt;width:172pt;height:31.85pt;z-index:251659264;visibility:visible;mso-wrap-style:square;mso-width-percent:0;mso-height-percent:0;mso-wrap-distance-left:9pt;mso-wrap-distance-top:0;mso-wrap-distance-right:9pt;mso-wrap-distance-bottom:0;mso-position-horizontal:absolute;mso-position-horizontal-relative:text;mso-position-vertical:absolute;mso-position-vertical-relative:text;mso-width-percent:0;mso-height-percent:0;mso-width-relative:margin;mso-height-relative:margin;v-text-anchor:top" o:gfxdata="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" filled="f" stroked="f">
+                    <v:rect w14:anchorId="60918F36" id="Rectangle 22" o:spid="_x0000_s1027" style="position:absolute;left:0;text-align:left;margin-left:50pt;margin-top:-31.6pt;width:172pt;height:39.2pt;z-index:251659264;visibility:visible;mso-wrap-style:square;mso-width-percent:0;mso-height-percent:0;mso-wrap-distance-left:9pt;mso-wrap-distance-top:0;mso-wrap-distance-right:9pt;mso-wrap-distance-bottom:0;mso-position-horizontal:absolute;mso-position-horizontal-relative:text;mso-position-vertical:absolute;mso-position-vertical-relative:text;mso-width-percent:0;mso-height-percent:0;mso-width-relative:margin;mso-height-relative:margin;v-text-anchor:top" o:gfxdata="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" filled="f" stroked="f">
                       <v:textbox inset="2.53958mm,1.2694mm,2.53958mm,1.2694mm">
                         <w:txbxContent>
                           <w:p>
@@ -7188,22 +6973,28 @@
                               <w:ind w:right="-126"/>
                               <w:jc w:val="center"/>
                               <w:textDirection w:val="btLr"/>
+                              <w:rPr>
+                                <w:sz w:val="24"/>
+                                <w:szCs w:val="24"/>
+                              </w:rPr>
                             </w:pPr>
                             <w:r>
                               <w:rPr>
                                 <w:rFonts w:ascii="Arial" w:eastAsia="Arial" w:hAnsi="Arial" w:cs="Arial"/>
                                 <w:i/>
                                 <w:color w:val="000000"/>
-                                <w:sz w:val="16"/>
+                                <w:sz w:val="18"/>
+                                <w:szCs w:val="24"/>
                               </w:rPr>
-                              <w:t>_____________</w:t>
+                              <w:t>__________</w:t>
                             </w:r>
                             <w:r>
                               <w:rPr>
                                 <w:rFonts w:ascii="Arial" w:eastAsia="Arial" w:hAnsi="Arial" w:cs="Arial"/>
                                 <w:i/>
                                 <w:color w:val="000000"/>
-                                <w:sz w:val="16"/>
+                                <w:sz w:val="18"/>
+                                <w:szCs w:val="24"/>
                                 <w:u w:val="single"/>
                               </w:rPr>
                               <w:t>${student_name}</w:t>
@@ -7213,7 +7004,8 @@
                                 <w:rFonts w:ascii="Arial" w:eastAsia="Arial" w:hAnsi="Arial" w:cs="Arial"/>
                                 <w:i/>
                                 <w:color w:val="000000"/>
-                                <w:sz w:val="16"/>
+                                <w:sz w:val="18"/>
+                                <w:szCs w:val="24"/>
                               </w:rPr>
                               <w:t>_________</w:t>
                             </w:r>
@@ -7376,6 +7168,8 @@
                                     <w:jc w:val="center"/>
                                     <w:textDirection w:val="btLr"/>
                                     <w:rPr>
+                                      <w:sz w:val="24"/>
+                                      <w:szCs w:val="24"/>
                                       <w:u w:val="single"/>
                                     </w:rPr>
                                   </w:pPr>
@@ -7384,7 +7178,8 @@
                                       <w:rFonts w:ascii="Arial" w:eastAsia="Arial" w:hAnsi="Arial" w:cs="Arial"/>
                                       <w:i/>
                                       <w:color w:val="000000"/>
-                                      <w:sz w:val="16"/>
+                                      <w:sz w:val="18"/>
+                                      <w:szCs w:val="24"/>
                                     </w:rPr>
                                     <w:t>________</w:t>
                                   </w:r>
@@ -7393,30 +7188,11 @@
                                       <w:rFonts w:ascii="Arial" w:eastAsia="Arial" w:hAnsi="Arial" w:cs="Arial"/>
                                       <w:i/>
                                       <w:color w:val="000000"/>
-                                      <w:sz w:val="16"/>
+                                      <w:sz w:val="18"/>
+                                      <w:szCs w:val="24"/>
                                       <w:u w:val="single"/>
                                     </w:rPr>
-                                    <w:t>${supervisor</w:t>
-                                  </w:r>
-                                  <w:r>
-                                    <w:rPr>
-                                      <w:rFonts w:ascii="Arial" w:eastAsia="Arial" w:hAnsi="Arial" w:cs="Arial"/>
-                                      <w:i/>
-                                      <w:color w:val="000000"/>
-                                      <w:sz w:val="16"/>
-                                      <w:u w:val="single"/>
-                                    </w:rPr>
-                                    <w:t>_</w:t>
-                                  </w:r>
-                                  <w:r>
-                                    <w:rPr>
-                                      <w:rFonts w:ascii="Arial" w:eastAsia="Arial" w:hAnsi="Arial" w:cs="Arial"/>
-                                      <w:i/>
-                                      <w:color w:val="000000"/>
-                                      <w:sz w:val="16"/>
-                                      <w:u w:val="single"/>
-                                    </w:rPr>
-                                    <w:t>name}_______</w:t>
+                                    <w:t>${supervisor_name}_______</w:t>
                                   </w:r>
                                 </w:p>
                                 <w:p>
@@ -7489,6 +7265,8 @@
                               <w:jc w:val="center"/>
                               <w:textDirection w:val="btLr"/>
                               <w:rPr>
+                                <w:sz w:val="24"/>
+                                <w:szCs w:val="24"/>
                                 <w:u w:val="single"/>
                               </w:rPr>
                             </w:pPr>
@@ -7497,7 +7275,8 @@
                                 <w:rFonts w:ascii="Arial" w:eastAsia="Arial" w:hAnsi="Arial" w:cs="Arial"/>
                                 <w:i/>
                                 <w:color w:val="000000"/>
-                                <w:sz w:val="16"/>
+                                <w:sz w:val="18"/>
+                                <w:szCs w:val="24"/>
                               </w:rPr>
                               <w:t>________</w:t>
                             </w:r>
@@ -7506,30 +7285,11 @@
                                 <w:rFonts w:ascii="Arial" w:eastAsia="Arial" w:hAnsi="Arial" w:cs="Arial"/>
                                 <w:i/>
                                 <w:color w:val="000000"/>
-                                <w:sz w:val="16"/>
+                                <w:sz w:val="18"/>
+                                <w:szCs w:val="24"/>
                                 <w:u w:val="single"/>
                               </w:rPr>
-                              <w:t>${supervisor</w:t>
-                            </w:r>
-                            <w:r>
-                              <w:rPr>
-                                <w:rFonts w:ascii="Arial" w:eastAsia="Arial" w:hAnsi="Arial" w:cs="Arial"/>
-                                <w:i/>
-                                <w:color w:val="000000"/>
-                                <w:sz w:val="16"/>
-                                <w:u w:val="single"/>
-                              </w:rPr>
-                              <w:t>_</w:t>
-                            </w:r>
-                            <w:r>
-                              <w:rPr>
-                                <w:rFonts w:ascii="Arial" w:eastAsia="Arial" w:hAnsi="Arial" w:cs="Arial"/>
-                                <w:i/>
-                                <w:color w:val="000000"/>
-                                <w:sz w:val="16"/>
-                                <w:u w:val="single"/>
-                              </w:rPr>
-                              <w:t>name}_______</w:t>
+                              <w:t>${supervisor_name}_______</w:t>
                             </w:r>
                           </w:p>
                           <w:p>

</xml_diff>